<commit_message>
Updated templates to reflect current experiences
</commit_message>
<xml_diff>
--- a/Bioinformatics_CoverLetterTemplate.docx
+++ b/Bioinformatics_CoverLetterTemplate.docx
@@ -6,63 +6,17 @@
       <w:pPr>
         <w:rPr>
           <w:rFonts w:ascii="Calibri Light" w:hAnsi="Calibri Light" w:cs="Calibri Light"/>
-          <w:sz w:val="21"/>
-          <w:szCs w:val="21"/>
+          <w:sz w:val="19"/>
+          <w:szCs w:val="19"/>
         </w:rPr>
       </w:pPr>
-      <w:proofErr w:type="gramStart"/>
-      <w:r>
-        <w:rPr>
-          <w:rFonts w:ascii="Calibri Light" w:hAnsi="Calibri Light" w:cs="Calibri Light"/>
-          <w:sz w:val="21"/>
-          <w:szCs w:val="21"/>
-        </w:rPr>
-        <w:t xml:space="preserve">{{ </w:t>
-      </w:r>
-      <w:proofErr w:type="spellStart"/>
-      <w:r>
-        <w:rPr>
-          <w:rFonts w:ascii="Calibri Light" w:hAnsi="Calibri Light" w:cs="Calibri Light"/>
-          <w:sz w:val="21"/>
-          <w:szCs w:val="21"/>
-        </w:rPr>
-        <w:t>todays</w:t>
-      </w:r>
-      <w:proofErr w:type="gramEnd"/>
-      <w:r>
-        <w:rPr>
-          <w:rFonts w:ascii="Calibri Light" w:hAnsi="Calibri Light" w:cs="Calibri Light"/>
-          <w:sz w:val="21"/>
-          <w:szCs w:val="21"/>
-        </w:rPr>
-        <w:t>_</w:t>
-      </w:r>
-      <w:proofErr w:type="gramStart"/>
-      <w:r>
-        <w:rPr>
-          <w:rFonts w:ascii="Calibri Light" w:hAnsi="Calibri Light" w:cs="Calibri Light"/>
-          <w:sz w:val="21"/>
-          <w:szCs w:val="21"/>
-        </w:rPr>
-        <w:t>date</w:t>
-      </w:r>
-      <w:proofErr w:type="spellEnd"/>
-      <w:r>
-        <w:rPr>
-          <w:rFonts w:ascii="Calibri Light" w:hAnsi="Calibri Light" w:cs="Calibri Light"/>
-          <w:sz w:val="21"/>
-          <w:szCs w:val="21"/>
-        </w:rPr>
-        <w:t xml:space="preserve"> }</w:t>
-      </w:r>
-      <w:proofErr w:type="gramEnd"/>
-      <w:r>
-        <w:rPr>
-          <w:rFonts w:ascii="Calibri Light" w:hAnsi="Calibri Light" w:cs="Calibri Light"/>
-          <w:sz w:val="21"/>
-          <w:szCs w:val="21"/>
-        </w:rPr>
-        <w:t>}</w:t>
+      <w:r>
+        <w:rPr>
+          <w:rFonts w:ascii="Calibri Light" w:hAnsi="Calibri Light" w:cs="Calibri Light"/>
+          <w:sz w:val="19"/>
+          <w:szCs w:val="19"/>
+        </w:rPr>
+        <w:t>{{ todays_date }}</w:t>
       </w:r>
     </w:p>
     <w:p>
@@ -70,373 +24,79 @@
         <w:rPr>
           <w:rFonts w:ascii="Calibri Light" w:eastAsia="Cambria" w:hAnsi="Calibri Light" w:cs="Calibri Light"/>
           <w:bCs/>
-          <w:sz w:val="21"/>
-          <w:szCs w:val="21"/>
+          <w:sz w:val="19"/>
+          <w:szCs w:val="19"/>
         </w:rPr>
       </w:pPr>
-      <w:proofErr w:type="gramStart"/>
       <w:r>
         <w:rPr>
           <w:rFonts w:ascii="Calibri Light" w:eastAsia="Cambria" w:hAnsi="Calibri Light" w:cs="Calibri Light"/>
           <w:bCs/>
-          <w:sz w:val="21"/>
-          <w:szCs w:val="21"/>
-        </w:rPr>
-        <w:t xml:space="preserve">{{ </w:t>
-      </w:r>
-      <w:proofErr w:type="spellStart"/>
+          <w:sz w:val="19"/>
+          <w:szCs w:val="19"/>
+        </w:rPr>
+        <w:t>{{ company_name }}</w:t>
+      </w:r>
       <w:r>
         <w:rPr>
           <w:rFonts w:ascii="Calibri Light" w:eastAsia="Cambria" w:hAnsi="Calibri Light" w:cs="Calibri Light"/>
           <w:bCs/>
-          <w:sz w:val="21"/>
-          <w:szCs w:val="21"/>
-        </w:rPr>
-        <w:t>company</w:t>
-      </w:r>
-      <w:proofErr w:type="gramEnd"/>
+          <w:sz w:val="19"/>
+          <w:szCs w:val="19"/>
+        </w:rPr>
+        <w:br/>
+        <w:t xml:space="preserve">{{ company_address }} </w:t>
+      </w:r>
       <w:r>
         <w:rPr>
           <w:rFonts w:ascii="Calibri Light" w:eastAsia="Cambria" w:hAnsi="Calibri Light" w:cs="Calibri Light"/>
           <w:bCs/>
-          <w:sz w:val="21"/>
-          <w:szCs w:val="21"/>
-        </w:rPr>
-        <w:t>_name</w:t>
-      </w:r>
-      <w:proofErr w:type="spellEnd"/>
+          <w:sz w:val="19"/>
+          <w:szCs w:val="19"/>
+        </w:rPr>
+        <w:br/>
+        <w:t>{{ company_city }}, {{ company_province }}</w:t>
+      </w:r>
       <w:r>
         <w:rPr>
           <w:rFonts w:ascii="Calibri Light" w:eastAsia="Cambria" w:hAnsi="Calibri Light" w:cs="Calibri Light"/>
           <w:bCs/>
-          <w:sz w:val="21"/>
-          <w:szCs w:val="21"/>
-        </w:rPr>
-        <w:t xml:space="preserve"> }}</w:t>
-      </w:r>
-      <w:r>
-        <w:rPr>
-          <w:rFonts w:ascii="Calibri Light" w:eastAsia="Cambria" w:hAnsi="Calibri Light" w:cs="Calibri Light"/>
-          <w:bCs/>
-          <w:sz w:val="21"/>
-          <w:szCs w:val="21"/>
+          <w:sz w:val="19"/>
+          <w:szCs w:val="19"/>
         </w:rPr>
         <w:br/>
-      </w:r>
-      <w:proofErr w:type="gramStart"/>
-      <w:r>
-        <w:rPr>
-          <w:rFonts w:ascii="Calibri Light" w:eastAsia="Cambria" w:hAnsi="Calibri Light" w:cs="Calibri Light"/>
-          <w:bCs/>
-          <w:sz w:val="21"/>
-          <w:szCs w:val="21"/>
-        </w:rPr>
-        <w:t xml:space="preserve">{{ </w:t>
-      </w:r>
-      <w:proofErr w:type="spellStart"/>
-      <w:r>
-        <w:rPr>
-          <w:rFonts w:ascii="Calibri Light" w:eastAsia="Cambria" w:hAnsi="Calibri Light" w:cs="Calibri Light"/>
-          <w:bCs/>
-          <w:sz w:val="21"/>
-          <w:szCs w:val="21"/>
-        </w:rPr>
-        <w:t>company</w:t>
-      </w:r>
-      <w:proofErr w:type="gramEnd"/>
-      <w:r>
-        <w:rPr>
-          <w:rFonts w:ascii="Calibri Light" w:eastAsia="Cambria" w:hAnsi="Calibri Light" w:cs="Calibri Light"/>
-          <w:bCs/>
-          <w:sz w:val="21"/>
-          <w:szCs w:val="21"/>
-        </w:rPr>
-        <w:t>_</w:t>
-      </w:r>
-      <w:proofErr w:type="gramStart"/>
-      <w:r>
-        <w:rPr>
-          <w:rFonts w:ascii="Calibri Light" w:eastAsia="Cambria" w:hAnsi="Calibri Light" w:cs="Calibri Light"/>
-          <w:bCs/>
-          <w:sz w:val="21"/>
-          <w:szCs w:val="21"/>
-        </w:rPr>
-        <w:t>address</w:t>
-      </w:r>
-      <w:proofErr w:type="spellEnd"/>
-      <w:r>
-        <w:rPr>
-          <w:rFonts w:ascii="Calibri Light" w:eastAsia="Cambria" w:hAnsi="Calibri Light" w:cs="Calibri Light"/>
-          <w:bCs/>
-          <w:sz w:val="21"/>
-          <w:szCs w:val="21"/>
-        </w:rPr>
-        <w:t xml:space="preserve"> }</w:t>
-      </w:r>
-      <w:proofErr w:type="gramEnd"/>
-      <w:r>
-        <w:rPr>
-          <w:rFonts w:ascii="Calibri Light" w:eastAsia="Cambria" w:hAnsi="Calibri Light" w:cs="Calibri Light"/>
-          <w:bCs/>
-          <w:sz w:val="21"/>
-          <w:szCs w:val="21"/>
-        </w:rPr>
-        <w:t xml:space="preserve">} </w:t>
-      </w:r>
-      <w:r>
-        <w:rPr>
-          <w:rFonts w:ascii="Calibri Light" w:eastAsia="Cambria" w:hAnsi="Calibri Light" w:cs="Calibri Light"/>
-          <w:bCs/>
-          <w:sz w:val="21"/>
-          <w:szCs w:val="21"/>
-        </w:rPr>
-        <w:br/>
-      </w:r>
-      <w:proofErr w:type="gramStart"/>
-      <w:r>
-        <w:rPr>
-          <w:rFonts w:ascii="Calibri Light" w:eastAsia="Cambria" w:hAnsi="Calibri Light" w:cs="Calibri Light"/>
-          <w:bCs/>
-          <w:sz w:val="21"/>
-          <w:szCs w:val="21"/>
-        </w:rPr>
-        <w:t xml:space="preserve">{{ </w:t>
-      </w:r>
-      <w:proofErr w:type="spellStart"/>
-      <w:r>
-        <w:rPr>
-          <w:rFonts w:ascii="Calibri Light" w:eastAsia="Cambria" w:hAnsi="Calibri Light" w:cs="Calibri Light"/>
-          <w:bCs/>
-          <w:sz w:val="21"/>
-          <w:szCs w:val="21"/>
-        </w:rPr>
-        <w:t>company</w:t>
-      </w:r>
-      <w:proofErr w:type="gramEnd"/>
-      <w:r>
-        <w:rPr>
-          <w:rFonts w:ascii="Calibri Light" w:eastAsia="Cambria" w:hAnsi="Calibri Light" w:cs="Calibri Light"/>
-          <w:bCs/>
-          <w:sz w:val="21"/>
-          <w:szCs w:val="21"/>
-        </w:rPr>
-        <w:t>_</w:t>
-      </w:r>
-      <w:proofErr w:type="gramStart"/>
-      <w:r>
-        <w:rPr>
-          <w:rFonts w:ascii="Calibri Light" w:eastAsia="Cambria" w:hAnsi="Calibri Light" w:cs="Calibri Light"/>
-          <w:bCs/>
-          <w:sz w:val="21"/>
-          <w:szCs w:val="21"/>
-        </w:rPr>
-        <w:t>city</w:t>
-      </w:r>
-      <w:proofErr w:type="spellEnd"/>
-      <w:r>
-        <w:rPr>
-          <w:rFonts w:ascii="Calibri Light" w:eastAsia="Cambria" w:hAnsi="Calibri Light" w:cs="Calibri Light"/>
-          <w:bCs/>
-          <w:sz w:val="21"/>
-          <w:szCs w:val="21"/>
-        </w:rPr>
-        <w:t xml:space="preserve"> }</w:t>
-      </w:r>
-      <w:proofErr w:type="gramEnd"/>
-      <w:r>
-        <w:rPr>
-          <w:rFonts w:ascii="Calibri Light" w:eastAsia="Cambria" w:hAnsi="Calibri Light" w:cs="Calibri Light"/>
-          <w:bCs/>
-          <w:sz w:val="21"/>
-          <w:szCs w:val="21"/>
-        </w:rPr>
-        <w:t xml:space="preserve">}, </w:t>
-      </w:r>
-      <w:proofErr w:type="gramStart"/>
-      <w:r>
-        <w:rPr>
-          <w:rFonts w:ascii="Calibri Light" w:eastAsia="Cambria" w:hAnsi="Calibri Light" w:cs="Calibri Light"/>
-          <w:bCs/>
-          <w:sz w:val="21"/>
-          <w:szCs w:val="21"/>
-        </w:rPr>
-        <w:t xml:space="preserve">{{ </w:t>
-      </w:r>
-      <w:proofErr w:type="spellStart"/>
-      <w:r>
-        <w:rPr>
-          <w:rFonts w:ascii="Calibri Light" w:eastAsia="Cambria" w:hAnsi="Calibri Light" w:cs="Calibri Light"/>
-          <w:bCs/>
-          <w:sz w:val="21"/>
-          <w:szCs w:val="21"/>
-        </w:rPr>
-        <w:t>company</w:t>
-      </w:r>
-      <w:proofErr w:type="gramEnd"/>
-      <w:r>
-        <w:rPr>
-          <w:rFonts w:ascii="Calibri Light" w:eastAsia="Cambria" w:hAnsi="Calibri Light" w:cs="Calibri Light"/>
-          <w:bCs/>
-          <w:sz w:val="21"/>
-          <w:szCs w:val="21"/>
-        </w:rPr>
-        <w:t>_province</w:t>
-      </w:r>
-      <w:proofErr w:type="spellEnd"/>
-      <w:r>
-        <w:rPr>
-          <w:rFonts w:ascii="Calibri Light" w:eastAsia="Cambria" w:hAnsi="Calibri Light" w:cs="Calibri Light"/>
-          <w:bCs/>
-          <w:sz w:val="21"/>
-          <w:szCs w:val="21"/>
-        </w:rPr>
-        <w:t xml:space="preserve"> }}</w:t>
-      </w:r>
-      <w:r>
-        <w:rPr>
-          <w:rFonts w:ascii="Calibri Light" w:eastAsia="Cambria" w:hAnsi="Calibri Light" w:cs="Calibri Light"/>
-          <w:bCs/>
-          <w:sz w:val="21"/>
-          <w:szCs w:val="21"/>
-        </w:rPr>
-        <w:br/>
-      </w:r>
-      <w:proofErr w:type="gramStart"/>
-      <w:r>
-        <w:rPr>
-          <w:rFonts w:ascii="Calibri Light" w:eastAsia="Cambria" w:hAnsi="Calibri Light" w:cs="Calibri Light"/>
-          <w:bCs/>
-          <w:sz w:val="21"/>
-          <w:szCs w:val="21"/>
-        </w:rPr>
-        <w:t xml:space="preserve">{{ </w:t>
-      </w:r>
-      <w:proofErr w:type="spellStart"/>
-      <w:r>
-        <w:rPr>
-          <w:rFonts w:ascii="Calibri Light" w:eastAsia="Cambria" w:hAnsi="Calibri Light" w:cs="Calibri Light"/>
-          <w:bCs/>
-          <w:sz w:val="21"/>
-          <w:szCs w:val="21"/>
-        </w:rPr>
-        <w:t>company</w:t>
-      </w:r>
-      <w:proofErr w:type="gramEnd"/>
-      <w:r>
-        <w:rPr>
-          <w:rFonts w:ascii="Calibri Light" w:eastAsia="Cambria" w:hAnsi="Calibri Light" w:cs="Calibri Light"/>
-          <w:bCs/>
-          <w:sz w:val="21"/>
-          <w:szCs w:val="21"/>
-        </w:rPr>
-        <w:t>_</w:t>
-      </w:r>
-      <w:proofErr w:type="gramStart"/>
-      <w:r>
-        <w:rPr>
-          <w:rFonts w:ascii="Calibri Light" w:eastAsia="Cambria" w:hAnsi="Calibri Light" w:cs="Calibri Light"/>
-          <w:bCs/>
-          <w:sz w:val="21"/>
-          <w:szCs w:val="21"/>
-        </w:rPr>
-        <w:t>postal</w:t>
-      </w:r>
-      <w:proofErr w:type="spellEnd"/>
-      <w:r>
-        <w:rPr>
-          <w:rFonts w:ascii="Calibri Light" w:eastAsia="Cambria" w:hAnsi="Calibri Light" w:cs="Calibri Light"/>
-          <w:bCs/>
-          <w:sz w:val="21"/>
-          <w:szCs w:val="21"/>
-        </w:rPr>
-        <w:t xml:space="preserve"> }</w:t>
-      </w:r>
-      <w:proofErr w:type="gramEnd"/>
-      <w:r>
-        <w:rPr>
-          <w:rFonts w:ascii="Calibri Light" w:eastAsia="Cambria" w:hAnsi="Calibri Light" w:cs="Calibri Light"/>
-          <w:bCs/>
-          <w:sz w:val="21"/>
-          <w:szCs w:val="21"/>
-        </w:rPr>
-        <w:t>}</w:t>
+        <w:t>{{ company_postal }}</w:t>
       </w:r>
     </w:p>
     <w:p>
       <w:pPr>
         <w:rPr>
           <w:rFonts w:ascii="Calibri Light" w:hAnsi="Calibri Light" w:cs="Calibri Light"/>
-          <w:sz w:val="21"/>
-          <w:szCs w:val="21"/>
+          <w:sz w:val="19"/>
+          <w:szCs w:val="19"/>
         </w:rPr>
       </w:pPr>
       <w:r>
         <w:rPr>
           <w:rFonts w:ascii="Calibri Light" w:hAnsi="Calibri Light" w:cs="Calibri Light"/>
-          <w:sz w:val="21"/>
-          <w:szCs w:val="21"/>
+          <w:sz w:val="19"/>
+          <w:szCs w:val="19"/>
         </w:rPr>
         <w:t xml:space="preserve">Dear </w:t>
       </w:r>
-      <w:proofErr w:type="gramStart"/>
-      <w:r>
-        <w:rPr>
-          <w:rFonts w:ascii="Calibri Light" w:hAnsi="Calibri Light" w:cs="Calibri Light"/>
-          <w:sz w:val="21"/>
-          <w:szCs w:val="21"/>
-        </w:rPr>
-        <w:t xml:space="preserve">{{ </w:t>
-      </w:r>
-      <w:proofErr w:type="spellStart"/>
-      <w:r>
-        <w:rPr>
-          <w:rFonts w:ascii="Calibri Light" w:hAnsi="Calibri Light" w:cs="Calibri Light"/>
-          <w:sz w:val="21"/>
-          <w:szCs w:val="21"/>
-        </w:rPr>
-        <w:t>letter</w:t>
-      </w:r>
-      <w:proofErr w:type="gramEnd"/>
-      <w:r>
-        <w:rPr>
-          <w:rFonts w:ascii="Calibri Light" w:hAnsi="Calibri Light" w:cs="Calibri Light"/>
-          <w:sz w:val="21"/>
-          <w:szCs w:val="21"/>
-        </w:rPr>
-        <w:t>_</w:t>
-      </w:r>
-      <w:proofErr w:type="gramStart"/>
-      <w:r>
-        <w:rPr>
-          <w:rFonts w:ascii="Calibri Light" w:hAnsi="Calibri Light" w:cs="Calibri Light"/>
-          <w:sz w:val="21"/>
-          <w:szCs w:val="21"/>
-        </w:rPr>
-        <w:t>addressee</w:t>
-      </w:r>
-      <w:proofErr w:type="spellEnd"/>
-      <w:r>
-        <w:rPr>
-          <w:rFonts w:ascii="Calibri Light" w:hAnsi="Calibri Light" w:cs="Calibri Light"/>
-          <w:sz w:val="21"/>
-          <w:szCs w:val="21"/>
-        </w:rPr>
-        <w:t xml:space="preserve"> }</w:t>
-      </w:r>
-      <w:proofErr w:type="gramEnd"/>
-      <w:r>
-        <w:rPr>
-          <w:rFonts w:ascii="Calibri Light" w:hAnsi="Calibri Light" w:cs="Calibri Light"/>
-          <w:sz w:val="21"/>
-          <w:szCs w:val="21"/>
-        </w:rPr>
-        <w:t>}</w:t>
-      </w:r>
-      <w:r>
-        <w:rPr>
-          <w:rFonts w:ascii="Calibri Light" w:hAnsi="Calibri Light" w:cs="Calibri Light"/>
-          <w:sz w:val="21"/>
-          <w:szCs w:val="21"/>
+      <w:r>
+        <w:rPr>
+          <w:rFonts w:ascii="Calibri Light" w:hAnsi="Calibri Light" w:cs="Calibri Light"/>
+          <w:sz w:val="19"/>
+          <w:szCs w:val="19"/>
+        </w:rPr>
+        <w:t>{{ letter_addressee }}</w:t>
+      </w:r>
+      <w:r>
+        <w:rPr>
+          <w:rFonts w:ascii="Calibri Light" w:hAnsi="Calibri Light" w:cs="Calibri Light"/>
+          <w:sz w:val="19"/>
+          <w:szCs w:val="19"/>
         </w:rPr>
         <w:t>,</w:t>
       </w:r>
@@ -446,291 +106,199 @@
         <w:jc w:val="both"/>
         <w:rPr>
           <w:rFonts w:ascii="Calibri Light" w:hAnsi="Calibri Light" w:cs="Calibri Light"/>
-          <w:sz w:val="21"/>
-          <w:szCs w:val="21"/>
+          <w:sz w:val="19"/>
+          <w:szCs w:val="19"/>
         </w:rPr>
       </w:pPr>
       <w:r>
         <w:rPr>
           <w:rFonts w:ascii="Calibri Light" w:hAnsi="Calibri Light" w:cs="Calibri Light"/>
-          <w:sz w:val="21"/>
-          <w:szCs w:val="21"/>
+          <w:sz w:val="19"/>
+          <w:szCs w:val="19"/>
         </w:rPr>
         <w:t xml:space="preserve">As a previous healthcare professional who hopes to leverage my current programming knowledge with bioinformatics to improve healthcare quality, I am writing to express my keen interest </w:t>
       </w:r>
       <w:r>
         <w:rPr>
           <w:rFonts w:ascii="Calibri Light" w:hAnsi="Calibri Light" w:cs="Calibri Light"/>
-          <w:sz w:val="21"/>
-          <w:szCs w:val="21"/>
+          <w:sz w:val="19"/>
+          <w:szCs w:val="19"/>
         </w:rPr>
         <w:t xml:space="preserve">for the </w:t>
       </w:r>
-      <w:proofErr w:type="gramStart"/>
-      <w:r>
-        <w:rPr>
-          <w:rFonts w:ascii="Calibri Light" w:hAnsi="Calibri Light" w:cs="Calibri Light"/>
-          <w:sz w:val="21"/>
-          <w:szCs w:val="21"/>
-        </w:rPr>
-        <w:t xml:space="preserve">{{ </w:t>
-      </w:r>
-      <w:proofErr w:type="spellStart"/>
-      <w:r>
-        <w:rPr>
-          <w:rFonts w:ascii="Calibri Light" w:hAnsi="Calibri Light" w:cs="Calibri Light"/>
-          <w:sz w:val="21"/>
-          <w:szCs w:val="21"/>
-        </w:rPr>
-        <w:t>position</w:t>
-      </w:r>
-      <w:proofErr w:type="gramEnd"/>
-      <w:r>
-        <w:rPr>
-          <w:rFonts w:ascii="Calibri Light" w:hAnsi="Calibri Light" w:cs="Calibri Light"/>
-          <w:sz w:val="21"/>
-          <w:szCs w:val="21"/>
-        </w:rPr>
-        <w:t>_</w:t>
-      </w:r>
-      <w:proofErr w:type="gramStart"/>
-      <w:r>
-        <w:rPr>
-          <w:rFonts w:ascii="Calibri Light" w:hAnsi="Calibri Light" w:cs="Calibri Light"/>
-          <w:sz w:val="21"/>
-          <w:szCs w:val="21"/>
-        </w:rPr>
-        <w:t>name</w:t>
-      </w:r>
-      <w:proofErr w:type="spellEnd"/>
-      <w:r>
-        <w:rPr>
-          <w:rFonts w:ascii="Calibri Light" w:hAnsi="Calibri Light" w:cs="Calibri Light"/>
-          <w:sz w:val="21"/>
-          <w:szCs w:val="21"/>
-        </w:rPr>
-        <w:t xml:space="preserve"> }</w:t>
-      </w:r>
-      <w:proofErr w:type="gramEnd"/>
-      <w:r>
-        <w:rPr>
-          <w:rFonts w:ascii="Calibri Light" w:hAnsi="Calibri Light" w:cs="Calibri Light"/>
-          <w:sz w:val="21"/>
-          <w:szCs w:val="21"/>
-        </w:rPr>
-        <w:t>}</w:t>
-      </w:r>
-      <w:r>
-        <w:rPr>
-          <w:rFonts w:ascii="Calibri Light" w:hAnsi="Calibri Light" w:cs="Calibri Light"/>
-          <w:sz w:val="21"/>
-          <w:szCs w:val="21"/>
+      <w:r>
+        <w:rPr>
+          <w:rFonts w:ascii="Calibri Light" w:hAnsi="Calibri Light" w:cs="Calibri Light"/>
+          <w:sz w:val="19"/>
+          <w:szCs w:val="19"/>
+        </w:rPr>
+        <w:t>{{ position_name }}</w:t>
+      </w:r>
+      <w:r>
+        <w:rPr>
+          <w:rFonts w:ascii="Calibri Light" w:hAnsi="Calibri Light" w:cs="Calibri Light"/>
+          <w:sz w:val="19"/>
+          <w:szCs w:val="19"/>
         </w:rPr>
         <w:t xml:space="preserve"> </w:t>
       </w:r>
       <w:r>
         <w:rPr>
           <w:rFonts w:ascii="Calibri Light" w:hAnsi="Calibri Light" w:cs="Calibri Light"/>
-          <w:sz w:val="21"/>
-          <w:szCs w:val="21"/>
+          <w:sz w:val="19"/>
+          <w:szCs w:val="19"/>
         </w:rPr>
         <w:t xml:space="preserve">role </w:t>
       </w:r>
       <w:r>
         <w:rPr>
           <w:rFonts w:ascii="Calibri Light" w:hAnsi="Calibri Light" w:cs="Calibri Light"/>
-          <w:sz w:val="21"/>
-          <w:szCs w:val="21"/>
+          <w:sz w:val="19"/>
+          <w:szCs w:val="19"/>
         </w:rPr>
         <w:t xml:space="preserve">with </w:t>
       </w:r>
-      <w:proofErr w:type="gramStart"/>
-      <w:r>
-        <w:rPr>
-          <w:rFonts w:ascii="Calibri Light" w:hAnsi="Calibri Light" w:cs="Calibri Light"/>
-          <w:sz w:val="21"/>
-          <w:szCs w:val="21"/>
-        </w:rPr>
-        <w:t xml:space="preserve">{{ </w:t>
-      </w:r>
-      <w:proofErr w:type="spellStart"/>
-      <w:r>
-        <w:rPr>
-          <w:rFonts w:ascii="Calibri Light" w:hAnsi="Calibri Light" w:cs="Calibri Light"/>
-          <w:sz w:val="21"/>
-          <w:szCs w:val="21"/>
-        </w:rPr>
-        <w:t>company</w:t>
-      </w:r>
-      <w:proofErr w:type="gramEnd"/>
-      <w:r>
-        <w:rPr>
-          <w:rFonts w:ascii="Calibri Light" w:hAnsi="Calibri Light" w:cs="Calibri Light"/>
-          <w:sz w:val="21"/>
-          <w:szCs w:val="21"/>
-        </w:rPr>
-        <w:t>_</w:t>
-      </w:r>
-      <w:proofErr w:type="gramStart"/>
-      <w:r>
-        <w:rPr>
-          <w:rFonts w:ascii="Calibri Light" w:hAnsi="Calibri Light" w:cs="Calibri Light"/>
-          <w:sz w:val="21"/>
-          <w:szCs w:val="21"/>
-        </w:rPr>
-        <w:t>name</w:t>
-      </w:r>
-      <w:proofErr w:type="spellEnd"/>
-      <w:r>
-        <w:rPr>
-          <w:rFonts w:ascii="Calibri Light" w:hAnsi="Calibri Light" w:cs="Calibri Light"/>
-          <w:sz w:val="21"/>
-          <w:szCs w:val="21"/>
-        </w:rPr>
-        <w:t xml:space="preserve"> }</w:t>
-      </w:r>
-      <w:proofErr w:type="gramEnd"/>
-      <w:r>
-        <w:rPr>
-          <w:rFonts w:ascii="Calibri Light" w:hAnsi="Calibri Light" w:cs="Calibri Light"/>
-          <w:sz w:val="21"/>
-          <w:szCs w:val="21"/>
-        </w:rPr>
-        <w:t>}</w:t>
-      </w:r>
-      <w:r>
-        <w:rPr>
-          <w:rFonts w:ascii="Calibri Light" w:hAnsi="Calibri Light" w:cs="Calibri Light"/>
-          <w:sz w:val="21"/>
-          <w:szCs w:val="21"/>
+      <w:r>
+        <w:rPr>
+          <w:rFonts w:ascii="Calibri Light" w:hAnsi="Calibri Light" w:cs="Calibri Light"/>
+          <w:sz w:val="19"/>
+          <w:szCs w:val="19"/>
+        </w:rPr>
+        <w:t>{{ company_name }}</w:t>
+      </w:r>
+      <w:r>
+        <w:rPr>
+          <w:rFonts w:ascii="Calibri Light" w:hAnsi="Calibri Light" w:cs="Calibri Light"/>
+          <w:sz w:val="19"/>
+          <w:szCs w:val="19"/>
         </w:rPr>
         <w:t xml:space="preserve">. </w:t>
       </w:r>
       <w:r>
         <w:rPr>
           <w:rFonts w:ascii="Calibri Light" w:hAnsi="Calibri Light" w:cs="Calibri Light"/>
-          <w:sz w:val="21"/>
-          <w:szCs w:val="21"/>
+          <w:sz w:val="19"/>
+          <w:szCs w:val="19"/>
         </w:rPr>
         <w:t>With a foundational background in genetics</w:t>
       </w:r>
       <w:r>
         <w:rPr>
           <w:rFonts w:ascii="Calibri Light" w:hAnsi="Calibri Light" w:cs="Calibri Light"/>
-          <w:sz w:val="21"/>
-          <w:szCs w:val="21"/>
+          <w:sz w:val="19"/>
+          <w:szCs w:val="19"/>
         </w:rPr>
         <w:t>, I was left highly impressed by your laboratory’s work and have been yearning for an opportunity to improve patient care</w:t>
       </w:r>
       <w:r>
         <w:rPr>
           <w:rFonts w:ascii="Calibri Light" w:hAnsi="Calibri Light" w:cs="Calibri Light"/>
-          <w:sz w:val="21"/>
-          <w:szCs w:val="21"/>
+          <w:sz w:val="19"/>
+          <w:szCs w:val="19"/>
         </w:rPr>
         <w:t xml:space="preserve"> from a technological perspective</w:t>
       </w:r>
       <w:r>
         <w:rPr>
           <w:rFonts w:ascii="Calibri Light" w:hAnsi="Calibri Light" w:cs="Calibri Light"/>
-          <w:sz w:val="21"/>
-          <w:szCs w:val="21"/>
+          <w:sz w:val="19"/>
+          <w:szCs w:val="19"/>
         </w:rPr>
         <w:t xml:space="preserve">. </w:t>
       </w:r>
       <w:r>
         <w:rPr>
           <w:rFonts w:ascii="Calibri Light" w:hAnsi="Calibri Light" w:cs="Calibri Light"/>
-          <w:sz w:val="21"/>
-          <w:szCs w:val="21"/>
+          <w:sz w:val="19"/>
+          <w:szCs w:val="19"/>
         </w:rPr>
         <w:t>Combined w</w:t>
       </w:r>
       <w:r>
         <w:rPr>
           <w:rFonts w:ascii="Calibri Light" w:hAnsi="Calibri Light" w:cs="Calibri Light"/>
-          <w:sz w:val="21"/>
-          <w:szCs w:val="21"/>
+          <w:sz w:val="19"/>
+          <w:szCs w:val="19"/>
         </w:rPr>
         <w:t xml:space="preserve">ith my current skillset </w:t>
       </w:r>
       <w:r>
         <w:rPr>
           <w:rFonts w:ascii="Calibri Light" w:hAnsi="Calibri Light" w:cs="Calibri Light"/>
-          <w:sz w:val="21"/>
-          <w:szCs w:val="21"/>
+          <w:sz w:val="19"/>
+          <w:szCs w:val="19"/>
         </w:rPr>
         <w:t>in</w:t>
       </w:r>
       <w:r>
         <w:rPr>
           <w:rFonts w:ascii="Calibri Light" w:hAnsi="Calibri Light" w:cs="Calibri Light"/>
-          <w:sz w:val="21"/>
-          <w:szCs w:val="21"/>
+          <w:sz w:val="19"/>
+          <w:szCs w:val="19"/>
         </w:rPr>
         <w:t xml:space="preserve"> object-oriented programming</w:t>
       </w:r>
       <w:r>
         <w:rPr>
           <w:rFonts w:ascii="Calibri Light" w:hAnsi="Calibri Light" w:cs="Calibri Light"/>
-          <w:sz w:val="21"/>
-          <w:szCs w:val="21"/>
+          <w:sz w:val="19"/>
+          <w:szCs w:val="19"/>
         </w:rPr>
         <w:t xml:space="preserve"> and</w:t>
       </w:r>
       <w:r>
         <w:rPr>
           <w:rFonts w:ascii="Calibri Light" w:hAnsi="Calibri Light" w:cs="Calibri Light"/>
-          <w:sz w:val="21"/>
-          <w:szCs w:val="21"/>
+          <w:sz w:val="19"/>
+          <w:szCs w:val="19"/>
         </w:rPr>
         <w:t xml:space="preserve"> nearly </w:t>
       </w:r>
       <w:r>
         <w:rPr>
           <w:rFonts w:ascii="Calibri Light" w:hAnsi="Calibri Light" w:cs="Calibri Light"/>
-          <w:sz w:val="21"/>
-          <w:szCs w:val="21"/>
+          <w:sz w:val="19"/>
+          <w:szCs w:val="19"/>
         </w:rPr>
         <w:t>3</w:t>
       </w:r>
       <w:r>
         <w:rPr>
           <w:rFonts w:ascii="Calibri Light" w:hAnsi="Calibri Light" w:cs="Calibri Light"/>
-          <w:sz w:val="21"/>
-          <w:szCs w:val="21"/>
+          <w:sz w:val="19"/>
+          <w:szCs w:val="19"/>
         </w:rPr>
         <w:t xml:space="preserve"> years of laboratory-based operations</w:t>
       </w:r>
       <w:r>
         <w:rPr>
           <w:rFonts w:ascii="Calibri Light" w:hAnsi="Calibri Light" w:cs="Calibri Light"/>
-          <w:sz w:val="21"/>
-          <w:szCs w:val="21"/>
+          <w:sz w:val="19"/>
+          <w:szCs w:val="19"/>
         </w:rPr>
         <w:t xml:space="preserve">, </w:t>
       </w:r>
       <w:r>
         <w:rPr>
           <w:rFonts w:ascii="Calibri Light" w:hAnsi="Calibri Light" w:cs="Calibri Light"/>
-          <w:sz w:val="21"/>
-          <w:szCs w:val="21"/>
+          <w:sz w:val="19"/>
+          <w:szCs w:val="19"/>
         </w:rPr>
         <w:t xml:space="preserve">I believe I have the skills, expertise </w:t>
       </w:r>
       <w:r>
         <w:rPr>
           <w:rFonts w:ascii="Calibri Light" w:hAnsi="Calibri Light" w:cs="Calibri Light"/>
-          <w:sz w:val="21"/>
-          <w:szCs w:val="21"/>
+          <w:sz w:val="19"/>
+          <w:szCs w:val="19"/>
         </w:rPr>
         <w:t>an</w:t>
       </w:r>
       <w:r>
         <w:rPr>
           <w:rFonts w:ascii="Calibri Light" w:hAnsi="Calibri Light" w:cs="Calibri Light"/>
-          <w:sz w:val="21"/>
-          <w:szCs w:val="21"/>
+          <w:sz w:val="19"/>
+          <w:szCs w:val="19"/>
         </w:rPr>
         <w:t>d enthusiasm to contribute to your laboratory’s success.</w:t>
       </w:r>
@@ -740,201 +308,127 @@
         <w:jc w:val="both"/>
         <w:rPr>
           <w:rFonts w:ascii="Calibri Light" w:hAnsi="Calibri Light" w:cs="Calibri Light"/>
-          <w:sz w:val="21"/>
-          <w:szCs w:val="21"/>
+          <w:sz w:val="19"/>
+          <w:szCs w:val="19"/>
         </w:rPr>
       </w:pPr>
       <w:r>
         <w:rPr>
           <w:rFonts w:ascii="Calibri Light" w:hAnsi="Calibri Light" w:cs="Calibri Light"/>
-          <w:sz w:val="21"/>
-          <w:szCs w:val="21"/>
-        </w:rPr>
-        <w:t xml:space="preserve">In my previous role as a clinical </w:t>
-      </w:r>
-      <w:proofErr w:type="gramStart"/>
-      <w:r>
-        <w:rPr>
-          <w:rFonts w:ascii="Calibri Light" w:hAnsi="Calibri Light" w:cs="Calibri Light"/>
-          <w:sz w:val="21"/>
-          <w:szCs w:val="21"/>
-        </w:rPr>
-        <w:t>genetics</w:t>
-      </w:r>
-      <w:proofErr w:type="gramEnd"/>
-      <w:r>
-        <w:rPr>
-          <w:rFonts w:ascii="Calibri Light" w:hAnsi="Calibri Light" w:cs="Calibri Light"/>
-          <w:sz w:val="21"/>
-          <w:szCs w:val="21"/>
-        </w:rPr>
-        <w:t xml:space="preserve"> technologist, I gained incredibly valuable experience with the Genome Diagnostics team with the Provincial Health Services Authority.</w:t>
-      </w:r>
-      <w:r>
-        <w:rPr>
-          <w:rFonts w:ascii="Calibri Light" w:hAnsi="Calibri Light" w:cs="Calibri Light"/>
-          <w:sz w:val="21"/>
-          <w:szCs w:val="21"/>
+          <w:sz w:val="19"/>
+          <w:szCs w:val="19"/>
+        </w:rPr>
+        <w:t>In my previous role as a clinical genetics technologist, I gained incredibly valuable experience with the Genome Diagnostics team with the Provincial Health Services Authority.</w:t>
+      </w:r>
+      <w:r>
+        <w:rPr>
+          <w:rFonts w:ascii="Calibri Light" w:hAnsi="Calibri Light" w:cs="Calibri Light"/>
+          <w:sz w:val="19"/>
+          <w:szCs w:val="19"/>
         </w:rPr>
         <w:t xml:space="preserve"> I supported diagnostics workflows, including specimen accessioning to result reporting.</w:t>
       </w:r>
       <w:r>
         <w:rPr>
           <w:rFonts w:ascii="Calibri Light" w:hAnsi="Calibri Light" w:cs="Calibri Light"/>
-          <w:sz w:val="21"/>
-          <w:szCs w:val="21"/>
+          <w:sz w:val="19"/>
+          <w:szCs w:val="19"/>
         </w:rPr>
         <w:t xml:space="preserve"> </w:t>
       </w:r>
       <w:r>
         <w:rPr>
           <w:rFonts w:ascii="Calibri Light" w:hAnsi="Calibri Light" w:cs="Calibri Light"/>
-          <w:sz w:val="21"/>
-          <w:szCs w:val="21"/>
+          <w:sz w:val="19"/>
+          <w:szCs w:val="19"/>
         </w:rPr>
         <w:t xml:space="preserve"> I gained hands-on experience using specialized </w:t>
       </w:r>
       <w:r>
         <w:rPr>
           <w:rFonts w:ascii="Calibri Light" w:hAnsi="Calibri Light" w:cs="Calibri Light"/>
-          <w:sz w:val="21"/>
-          <w:szCs w:val="21"/>
-        </w:rPr>
-        <w:t xml:space="preserve">software, including </w:t>
-      </w:r>
-      <w:proofErr w:type="spellStart"/>
-      <w:r>
-        <w:rPr>
-          <w:rFonts w:ascii="Calibri Light" w:hAnsi="Calibri Light" w:cs="Calibri Light"/>
-          <w:sz w:val="21"/>
-          <w:szCs w:val="21"/>
-        </w:rPr>
-        <w:t>CytoVision</w:t>
-      </w:r>
-      <w:proofErr w:type="spellEnd"/>
-      <w:r>
-        <w:rPr>
-          <w:rFonts w:ascii="Calibri Light" w:hAnsi="Calibri Light" w:cs="Calibri Light"/>
-          <w:sz w:val="21"/>
-          <w:szCs w:val="21"/>
-        </w:rPr>
-        <w:t xml:space="preserve">, </w:t>
-      </w:r>
-      <w:proofErr w:type="spellStart"/>
-      <w:r>
-        <w:rPr>
-          <w:rFonts w:ascii="Calibri Light" w:hAnsi="Calibri Light" w:cs="Calibri Light"/>
-          <w:sz w:val="21"/>
-          <w:szCs w:val="21"/>
-        </w:rPr>
-        <w:t>SeqPilot</w:t>
-      </w:r>
-      <w:proofErr w:type="spellEnd"/>
-      <w:r>
-        <w:rPr>
-          <w:rFonts w:ascii="Calibri Light" w:hAnsi="Calibri Light" w:cs="Calibri Light"/>
-          <w:sz w:val="21"/>
-          <w:szCs w:val="21"/>
-        </w:rPr>
-        <w:t xml:space="preserve"> for Sanger sequencing and </w:t>
-      </w:r>
-      <w:proofErr w:type="spellStart"/>
-      <w:r>
-        <w:rPr>
-          <w:rFonts w:ascii="Calibri Light" w:hAnsi="Calibri Light" w:cs="Calibri Light"/>
-          <w:sz w:val="21"/>
-          <w:szCs w:val="21"/>
-        </w:rPr>
-        <w:t>GeneMapper</w:t>
-      </w:r>
-      <w:proofErr w:type="spellEnd"/>
-      <w:r>
-        <w:rPr>
-          <w:rFonts w:ascii="Calibri Light" w:hAnsi="Calibri Light" w:cs="Calibri Light"/>
-          <w:sz w:val="21"/>
-          <w:szCs w:val="21"/>
-        </w:rPr>
-        <w:t xml:space="preserve"> for fragment analysis,</w:t>
-      </w:r>
-      <w:r>
-        <w:rPr>
-          <w:rFonts w:ascii="Calibri Light" w:hAnsi="Calibri Light" w:cs="Calibri Light"/>
-          <w:sz w:val="21"/>
-          <w:szCs w:val="21"/>
+          <w:sz w:val="19"/>
+          <w:szCs w:val="19"/>
+        </w:rPr>
+        <w:t>software, including CytoVision, SeqPilot for Sanger sequencing and GeneMapper for fragment analysis,</w:t>
+      </w:r>
+      <w:r>
+        <w:rPr>
+          <w:rFonts w:ascii="Calibri Light" w:hAnsi="Calibri Light" w:cs="Calibri Light"/>
+          <w:sz w:val="19"/>
+          <w:szCs w:val="19"/>
         </w:rPr>
         <w:t xml:space="preserve"> becoming familiar with the complex medical terminology associated with genetics and genomics in the process.</w:t>
       </w:r>
       <w:r>
         <w:rPr>
           <w:rFonts w:ascii="Calibri Light" w:hAnsi="Calibri Light" w:cs="Calibri Light"/>
-          <w:sz w:val="21"/>
-          <w:szCs w:val="21"/>
+          <w:sz w:val="19"/>
+          <w:szCs w:val="19"/>
         </w:rPr>
         <w:t xml:space="preserve"> I also </w:t>
       </w:r>
       <w:r>
         <w:rPr>
           <w:rFonts w:ascii="Calibri Light" w:hAnsi="Calibri Light" w:cs="Calibri Light"/>
-          <w:sz w:val="21"/>
-          <w:szCs w:val="21"/>
+          <w:sz w:val="19"/>
+          <w:szCs w:val="19"/>
         </w:rPr>
         <w:t>took on mentorship responsibilities, training</w:t>
       </w:r>
       <w:r>
         <w:rPr>
           <w:rFonts w:ascii="Calibri Light" w:hAnsi="Calibri Light" w:cs="Calibri Light"/>
-          <w:sz w:val="21"/>
-          <w:szCs w:val="21"/>
+          <w:sz w:val="19"/>
+          <w:szCs w:val="19"/>
         </w:rPr>
         <w:t xml:space="preserve"> </w:t>
       </w:r>
       <w:r>
         <w:rPr>
           <w:rFonts w:ascii="Calibri Light" w:hAnsi="Calibri Light" w:cs="Calibri Light"/>
-          <w:sz w:val="21"/>
-          <w:szCs w:val="21"/>
+          <w:sz w:val="19"/>
+          <w:szCs w:val="19"/>
         </w:rPr>
         <w:t>i</w:t>
       </w:r>
       <w:r>
         <w:rPr>
           <w:rFonts w:ascii="Calibri Light" w:hAnsi="Calibri Light" w:cs="Calibri Light"/>
-          <w:sz w:val="21"/>
-          <w:szCs w:val="21"/>
+          <w:sz w:val="19"/>
+          <w:szCs w:val="19"/>
         </w:rPr>
         <w:t xml:space="preserve">ncoming junior technologists and practicum students, helping to foster a </w:t>
       </w:r>
       <w:r>
         <w:rPr>
           <w:rFonts w:ascii="Calibri Light" w:hAnsi="Calibri Light" w:cs="Calibri Light"/>
-          <w:sz w:val="21"/>
-          <w:szCs w:val="21"/>
+          <w:sz w:val="19"/>
+          <w:szCs w:val="19"/>
         </w:rPr>
         <w:t>collaborative, harmonious</w:t>
       </w:r>
       <w:r>
         <w:rPr>
           <w:rFonts w:ascii="Calibri Light" w:hAnsi="Calibri Light" w:cs="Calibri Light"/>
-          <w:sz w:val="21"/>
-          <w:szCs w:val="21"/>
+          <w:sz w:val="19"/>
+          <w:szCs w:val="19"/>
         </w:rPr>
         <w:t xml:space="preserve"> learning environment. My role at PHSA highlights many </w:t>
       </w:r>
-      <w:proofErr w:type="gramStart"/>
-      <w:r>
-        <w:rPr>
-          <w:rFonts w:ascii="Calibri Light" w:hAnsi="Calibri Light" w:cs="Calibri Light"/>
-          <w:sz w:val="21"/>
-          <w:szCs w:val="21"/>
+      <w:r>
+        <w:rPr>
+          <w:rFonts w:ascii="Calibri Light" w:hAnsi="Calibri Light" w:cs="Calibri Light"/>
+          <w:sz w:val="19"/>
+          <w:szCs w:val="19"/>
         </w:rPr>
         <w:t>strongly-developed</w:t>
       </w:r>
-      <w:proofErr w:type="gramEnd"/>
-      <w:r>
-        <w:rPr>
-          <w:rFonts w:ascii="Calibri Light" w:hAnsi="Calibri Light" w:cs="Calibri Light"/>
-          <w:sz w:val="21"/>
-          <w:szCs w:val="21"/>
+      <w:r>
+        <w:rPr>
+          <w:rFonts w:ascii="Calibri Light" w:hAnsi="Calibri Light" w:cs="Calibri Light"/>
+          <w:sz w:val="19"/>
+          <w:szCs w:val="19"/>
         </w:rPr>
         <w:t xml:space="preserve"> soft skills, including the ability to learn quickly, and adaptability to various responsibilities. The knowledge I gained here has been vital to furthering my understanding of the complexities of genetics, while further enhancing the necessary skills required to become a more efficient, collaborative and communicative team player. </w:t>
       </w:r>
@@ -944,213 +438,87 @@
         <w:jc w:val="both"/>
         <w:rPr>
           <w:rFonts w:ascii="Calibri Light" w:hAnsi="Calibri Light" w:cs="Calibri Light"/>
-          <w:sz w:val="21"/>
-          <w:szCs w:val="21"/>
+          <w:sz w:val="19"/>
+          <w:szCs w:val="19"/>
         </w:rPr>
       </w:pPr>
       <w:r>
         <w:rPr>
           <w:rFonts w:ascii="Calibri Light" w:hAnsi="Calibri Light" w:cs="Calibri Light"/>
-          <w:sz w:val="21"/>
-          <w:szCs w:val="21"/>
-        </w:rPr>
-        <w:t xml:space="preserve">Admittedly, my software development portfolio and technological skillset is still growing – however, I am actively developing my expertise through coursework, hackathon participation and self-learning, showcasing my passion towards continued learning. </w:t>
-      </w:r>
-      <w:r>
-        <w:rPr>
-          <w:rFonts w:ascii="Calibri Light" w:hAnsi="Calibri Light" w:cs="Calibri Light"/>
-          <w:sz w:val="21"/>
-          <w:szCs w:val="21"/>
-        </w:rPr>
-        <w:t>Recently, I</w:t>
-      </w:r>
-      <w:r>
-        <w:rPr>
-          <w:rFonts w:ascii="Calibri Light" w:hAnsi="Calibri Light" w:cs="Calibri Light"/>
-          <w:sz w:val="21"/>
-          <w:szCs w:val="21"/>
-        </w:rPr>
-        <w:t xml:space="preserve"> built a Java-based beverage tracker</w:t>
-      </w:r>
-      <w:r>
-        <w:rPr>
-          <w:rFonts w:ascii="Calibri Light" w:hAnsi="Calibri Light" w:cs="Calibri Light"/>
-          <w:sz w:val="21"/>
-          <w:szCs w:val="21"/>
-        </w:rPr>
-        <w:t xml:space="preserve"> utilizing </w:t>
-      </w:r>
-      <w:proofErr w:type="spellStart"/>
-      <w:r>
-        <w:rPr>
-          <w:rFonts w:ascii="Calibri Light" w:hAnsi="Calibri Light" w:cs="Calibri Light"/>
-          <w:sz w:val="21"/>
-          <w:szCs w:val="21"/>
-        </w:rPr>
-        <w:t>VSCode</w:t>
-      </w:r>
-      <w:proofErr w:type="spellEnd"/>
-      <w:r>
-        <w:rPr>
-          <w:rFonts w:ascii="Calibri Light" w:hAnsi="Calibri Light" w:cs="Calibri Light"/>
-          <w:sz w:val="21"/>
-          <w:szCs w:val="21"/>
-        </w:rPr>
-        <w:t>, applying the proper OOP principles to develop a user-friendly GUI and a command-line interface with proper data management using JSON for data persistence</w:t>
-      </w:r>
-      <w:r>
-        <w:rPr>
-          <w:rFonts w:ascii="Calibri Light" w:hAnsi="Calibri Light" w:cs="Calibri Light"/>
-          <w:sz w:val="21"/>
-          <w:szCs w:val="21"/>
-        </w:rPr>
-        <w:t>, as well as JUnit Jupiter</w:t>
-      </w:r>
-      <w:r>
-        <w:rPr>
-          <w:rFonts w:ascii="Calibri Light" w:hAnsi="Calibri Light" w:cs="Calibri Light"/>
-          <w:sz w:val="21"/>
-          <w:szCs w:val="21"/>
+          <w:sz w:val="19"/>
+          <w:szCs w:val="19"/>
+        </w:rPr>
+        <w:t>Building upon my prior experience, I have been actively developing my technical expertise in software engineering through both co-op and personal projects.</w:t>
+      </w:r>
+      <w:r>
+        <w:rPr>
+          <w:rFonts w:ascii="Calibri Light" w:hAnsi="Calibri Light" w:cs="Calibri Light"/>
+          <w:sz w:val="19"/>
+          <w:szCs w:val="19"/>
         </w:rPr>
         <w:t xml:space="preserve"> </w:t>
       </w:r>
       <w:r>
         <w:rPr>
           <w:rFonts w:ascii="Calibri Light" w:hAnsi="Calibri Light" w:cs="Calibri Light"/>
-          <w:sz w:val="21"/>
-          <w:szCs w:val="21"/>
-        </w:rPr>
-        <w:t>for rigorous testing</w:t>
-      </w:r>
-      <w:r>
-        <w:rPr>
-          <w:rFonts w:ascii="Calibri Light" w:hAnsi="Calibri Light" w:cs="Calibri Light"/>
-          <w:sz w:val="21"/>
-          <w:szCs w:val="21"/>
-        </w:rPr>
-        <w:t>. Most recently, I also participated in two separate hackathons, producing a proper Minimum Viable Product – in both, I was tasked with engineering the backend logic and to integrate an A.I. API for response rendering.</w:t>
-      </w:r>
-      <w:r>
-        <w:rPr>
-          <w:rFonts w:ascii="Calibri Light" w:hAnsi="Calibri Light" w:cs="Calibri Light"/>
-          <w:sz w:val="21"/>
-          <w:szCs w:val="21"/>
-        </w:rPr>
-        <w:t xml:space="preserve"> </w:t>
-      </w:r>
-      <w:r>
-        <w:rPr>
-          <w:rFonts w:ascii="Calibri Light" w:hAnsi="Calibri Light" w:cs="Calibri Light"/>
-          <w:sz w:val="21"/>
-          <w:szCs w:val="21"/>
-        </w:rPr>
-        <w:t xml:space="preserve">I also have data science experience, particularly in using R and </w:t>
-      </w:r>
-      <w:proofErr w:type="spellStart"/>
-      <w:r>
-        <w:rPr>
-          <w:rFonts w:ascii="Calibri Light" w:hAnsi="Calibri Light" w:cs="Calibri Light"/>
-          <w:sz w:val="21"/>
-          <w:szCs w:val="21"/>
-        </w:rPr>
-        <w:t>Jupyter</w:t>
-      </w:r>
-      <w:proofErr w:type="spellEnd"/>
-      <w:r>
-        <w:rPr>
-          <w:rFonts w:ascii="Calibri Light" w:hAnsi="Calibri Light" w:cs="Calibri Light"/>
-          <w:sz w:val="21"/>
-          <w:szCs w:val="21"/>
-        </w:rPr>
-        <w:t xml:space="preserve"> Notebooks</w:t>
-      </w:r>
-      <w:r>
-        <w:rPr>
-          <w:rFonts w:ascii="Calibri Light" w:hAnsi="Calibri Light" w:cs="Calibri Light"/>
-          <w:sz w:val="21"/>
-          <w:szCs w:val="21"/>
-        </w:rPr>
-        <w:t xml:space="preserve"> for reading, transforming and cleaning </w:t>
-      </w:r>
-      <w:r>
-        <w:rPr>
-          <w:rFonts w:ascii="Calibri Light" w:hAnsi="Calibri Light" w:cs="Calibri Light"/>
-          <w:sz w:val="21"/>
-          <w:szCs w:val="21"/>
-        </w:rPr>
-        <w:t xml:space="preserve">data of over 1,500 records </w:t>
-      </w:r>
-      <w:r>
-        <w:rPr>
-          <w:rFonts w:ascii="Calibri Light" w:hAnsi="Calibri Light" w:cs="Calibri Light"/>
-          <w:sz w:val="21"/>
-          <w:szCs w:val="21"/>
-        </w:rPr>
-        <w:t>fo</w:t>
-      </w:r>
-      <w:r>
-        <w:rPr>
-          <w:rFonts w:ascii="Calibri Light" w:hAnsi="Calibri Light" w:cs="Calibri Light"/>
-          <w:sz w:val="21"/>
-          <w:szCs w:val="21"/>
-        </w:rPr>
-        <w:t>r</w:t>
-      </w:r>
-      <w:r>
-        <w:rPr>
-          <w:rFonts w:ascii="Calibri Light" w:hAnsi="Calibri Light" w:cs="Calibri Light"/>
-          <w:sz w:val="21"/>
-          <w:szCs w:val="21"/>
-        </w:rPr>
-        <w:t xml:space="preserve"> the Pacific Laboratory for Artificial Intelligence. My contributions included </w:t>
-      </w:r>
-      <w:r>
-        <w:rPr>
-          <w:rFonts w:ascii="Calibri Light" w:hAnsi="Calibri Light" w:cs="Calibri Light"/>
-          <w:sz w:val="21"/>
-          <w:szCs w:val="21"/>
-        </w:rPr>
-        <w:t>procuring</w:t>
-      </w:r>
-      <w:r>
-        <w:rPr>
-          <w:rFonts w:ascii="Calibri Light" w:hAnsi="Calibri Light" w:cs="Calibri Light"/>
-          <w:sz w:val="21"/>
-          <w:szCs w:val="21"/>
-        </w:rPr>
-        <w:t xml:space="preserve"> </w:t>
-      </w:r>
-      <w:r>
-        <w:rPr>
-          <w:rFonts w:ascii="Calibri Light" w:hAnsi="Calibri Light" w:cs="Calibri Light"/>
-          <w:sz w:val="21"/>
-          <w:szCs w:val="21"/>
-        </w:rPr>
-        <w:t xml:space="preserve">visualizations to </w:t>
-      </w:r>
-      <w:r>
-        <w:rPr>
-          <w:rFonts w:ascii="Calibri Light" w:hAnsi="Calibri Light" w:cs="Calibri Light"/>
-          <w:sz w:val="21"/>
-          <w:szCs w:val="21"/>
-        </w:rPr>
-        <w:t xml:space="preserve">supplement our findings and </w:t>
-      </w:r>
-      <w:r>
-        <w:rPr>
-          <w:rFonts w:ascii="Calibri Light" w:hAnsi="Calibri Light" w:cs="Calibri Light"/>
-          <w:sz w:val="21"/>
-          <w:szCs w:val="21"/>
-        </w:rPr>
-        <w:t>assisted my groupmates in the development of a KNN-regression algorithm</w:t>
-      </w:r>
-      <w:r>
-        <w:rPr>
-          <w:rFonts w:ascii="Calibri Light" w:hAnsi="Calibri Light" w:cs="Calibri Light"/>
-          <w:sz w:val="21"/>
-          <w:szCs w:val="21"/>
-        </w:rPr>
-        <w:t xml:space="preserve"> for the purpose of our project.</w:t>
+          <w:sz w:val="19"/>
+          <w:szCs w:val="19"/>
+        </w:rPr>
+        <w:t xml:space="preserve">Currently, </w:t>
+      </w:r>
+      <w:r>
+        <w:rPr>
+          <w:rFonts w:ascii="Calibri Light" w:eastAsia="Cambria" w:hAnsi="Calibri Light" w:cs="Calibri Light"/>
+          <w:bCs/>
+          <w:sz w:val="19"/>
+          <w:szCs w:val="19"/>
+        </w:rPr>
+        <w:t>I am gaining practical experience as an Information Technology Analyst Co-op Student with Shared Service Canada, where I am supporting enterprise-level IT workflows in a federal government setting. This role is providing me with exposure to Linux-based operating systems, large-scale infrastructure, and</w:t>
+      </w:r>
+      <w:r>
+        <w:rPr>
+          <w:rFonts w:ascii="Calibri Light" w:eastAsia="Cambria" w:hAnsi="Calibri Light" w:cs="Calibri Light"/>
+          <w:bCs/>
+          <w:sz w:val="19"/>
+          <w:szCs w:val="19"/>
+        </w:rPr>
+        <w:t xml:space="preserve"> opportunities in automation scripting for workflow optimization</w:t>
+      </w:r>
+      <w:r>
+        <w:rPr>
+          <w:rFonts w:ascii="Calibri Light" w:eastAsia="Cambria" w:hAnsi="Calibri Light" w:cs="Calibri Light"/>
+          <w:bCs/>
+          <w:sz w:val="19"/>
+          <w:szCs w:val="19"/>
+        </w:rPr>
+        <w:t xml:space="preserve">, all while developing transferrable skills that are critical in a client-facing Agile-style team, </w:t>
+      </w:r>
+      <w:r>
+        <w:rPr>
+          <w:rFonts w:ascii="Calibri Light" w:eastAsia="Cambria" w:hAnsi="Calibri Light" w:cs="Calibri Light"/>
+          <w:bCs/>
+          <w:sz w:val="19"/>
+          <w:szCs w:val="19"/>
+        </w:rPr>
+        <w:t xml:space="preserve">such as interpersonal communication, time management and task prioritization. Alongside this, </w:t>
+      </w:r>
+      <w:r>
+        <w:rPr>
+          <w:rFonts w:ascii="Calibri Light" w:eastAsia="Cambria" w:hAnsi="Calibri Light" w:cs="Calibri Light"/>
+          <w:bCs/>
+          <w:sz w:val="19"/>
+          <w:szCs w:val="19"/>
+        </w:rPr>
+        <w:t>I have built</w:t>
+      </w:r>
+      <w:r>
+        <w:rPr>
+          <w:rFonts w:ascii="Calibri Light" w:eastAsia="Cambria" w:hAnsi="Calibri Light" w:cs="Calibri Light"/>
+          <w:bCs/>
+          <w:sz w:val="19"/>
+          <w:szCs w:val="19"/>
+        </w:rPr>
+        <w:t xml:space="preserve"> full-stack applications, which not only strongly showcases my continued passion in software construction, but also displays my dedication and initiative to grow in a fast-paced industry. For example, I scaled SipLy from an academic Java-based CLI and Swing project into a full-stack React and Spring Boot web application that helps users track their daily sugar, caffeine and caloric intake from consumed beverages. On the backend, I learnt how to design RESTful APIs, and utilized the embedded H2 Database Engine to persist user data. Through SipLy, I also learnt the fundamentals of security and implemented password hashing to protect user login data with Spring Security and BCrypt. I also have plans of integrating Spring AI with Groq to deliver personalized recommendations. Furthermore, I have also built AniMori, a desktop anime-tracking application, powered by ElectronJS and React for the frontend, and SQLite for the backend database. For AniMoris’ backend, I implemented a lightweight relational database schema to manage anime entries and watch statuses, successfully integrating the Jikan API to automatically fetch metadata without manual entry, and wrote reusable SQL queries to handle common CRUD operations. Subsequently, I was able to successfully connect both components together, ensuring smooth data flow from UI to backend. These projects have enhanced my capabilities in assessing real-world problems, coordinating technical workflows and learnt how to iteratively build upon existing prototypes for continuous improvement. </w:t>
       </w:r>
     </w:p>
     <w:p>
@@ -1158,219 +526,119 @@
         <w:jc w:val="both"/>
         <w:rPr>
           <w:rFonts w:ascii="Calibri Light" w:hAnsi="Calibri Light" w:cs="Calibri Light"/>
-          <w:sz w:val="21"/>
-          <w:szCs w:val="21"/>
+          <w:sz w:val="19"/>
+          <w:szCs w:val="19"/>
         </w:rPr>
       </w:pPr>
       <w:r>
         <w:rPr>
           <w:rFonts w:ascii="Calibri Light" w:hAnsi="Calibri Light" w:cs="Calibri Light"/>
-          <w:sz w:val="21"/>
-          <w:szCs w:val="21"/>
+          <w:sz w:val="19"/>
+          <w:szCs w:val="19"/>
         </w:rPr>
         <w:t>Conclusively, I am highly impressed by the</w:t>
       </w:r>
       <w:r>
         <w:rPr>
           <w:rFonts w:ascii="Calibri Light" w:hAnsi="Calibri Light" w:cs="Calibri Light"/>
-          <w:sz w:val="21"/>
-          <w:szCs w:val="21"/>
+          <w:sz w:val="19"/>
+          <w:szCs w:val="19"/>
+        </w:rPr>
+        <w:t xml:space="preserve"> {{ company_name }}</w:t>
+      </w:r>
+      <w:r>
+        <w:rPr>
+          <w:rFonts w:ascii="Calibri Light" w:hAnsi="Calibri Light" w:cs="Calibri Light"/>
+          <w:sz w:val="19"/>
+          <w:szCs w:val="19"/>
+        </w:rPr>
+        <w:t xml:space="preserve">’s contributions </w:t>
+      </w:r>
+      <w:r>
+        <w:rPr>
+          <w:rFonts w:ascii="Calibri Light" w:hAnsi="Calibri Light" w:cs="Calibri Light"/>
+          <w:sz w:val="19"/>
+          <w:szCs w:val="19"/>
+        </w:rPr>
+        <w:t>in the field of bioinformatics</w:t>
+      </w:r>
+      <w:r>
+        <w:rPr>
+          <w:rFonts w:ascii="Calibri Light" w:hAnsi="Calibri Light" w:cs="Calibri Light"/>
+          <w:sz w:val="19"/>
+          <w:szCs w:val="19"/>
+        </w:rPr>
+        <w:t xml:space="preserve">, </w:t>
+      </w:r>
+      <w:r>
+        <w:rPr>
+          <w:rFonts w:ascii="Calibri Light" w:hAnsi="Calibri Light" w:cs="Calibri Light"/>
+          <w:sz w:val="19"/>
+          <w:szCs w:val="19"/>
+        </w:rPr>
+        <w:t xml:space="preserve">especially in your innovative approaches taken </w:t>
+      </w:r>
+      <w:r>
+        <w:rPr>
+          <w:rFonts w:ascii="Calibri Light" w:hAnsi="Calibri Light" w:cs="Calibri Light"/>
+          <w:sz w:val="19"/>
+          <w:szCs w:val="19"/>
+        </w:rPr>
+        <w:t>to</w:t>
+      </w:r>
+      <w:r>
+        <w:rPr>
+          <w:rFonts w:ascii="Calibri Light" w:hAnsi="Calibri Light" w:cs="Calibri Light"/>
+          <w:sz w:val="19"/>
+          <w:szCs w:val="19"/>
         </w:rPr>
         <w:t xml:space="preserve"> </w:t>
       </w:r>
-      <w:proofErr w:type="gramStart"/>
-      <w:r>
-        <w:rPr>
-          <w:rFonts w:ascii="Calibri Light" w:hAnsi="Calibri Light" w:cs="Calibri Light"/>
-          <w:sz w:val="21"/>
-          <w:szCs w:val="21"/>
-        </w:rPr>
-        <w:t xml:space="preserve">{{ </w:t>
-      </w:r>
-      <w:proofErr w:type="spellStart"/>
-      <w:r>
-        <w:rPr>
-          <w:rFonts w:ascii="Calibri Light" w:hAnsi="Calibri Light" w:cs="Calibri Light"/>
-          <w:sz w:val="21"/>
-          <w:szCs w:val="21"/>
-        </w:rPr>
-        <w:t>company</w:t>
-      </w:r>
-      <w:proofErr w:type="gramEnd"/>
-      <w:r>
-        <w:rPr>
-          <w:rFonts w:ascii="Calibri Light" w:hAnsi="Calibri Light" w:cs="Calibri Light"/>
-          <w:sz w:val="21"/>
-          <w:szCs w:val="21"/>
-        </w:rPr>
-        <w:t>_</w:t>
-      </w:r>
-      <w:proofErr w:type="gramStart"/>
-      <w:r>
-        <w:rPr>
-          <w:rFonts w:ascii="Calibri Light" w:hAnsi="Calibri Light" w:cs="Calibri Light"/>
-          <w:sz w:val="21"/>
-          <w:szCs w:val="21"/>
-        </w:rPr>
-        <w:t>name</w:t>
-      </w:r>
-      <w:proofErr w:type="spellEnd"/>
-      <w:r>
-        <w:rPr>
-          <w:rFonts w:ascii="Calibri Light" w:hAnsi="Calibri Light" w:cs="Calibri Light"/>
-          <w:sz w:val="21"/>
-          <w:szCs w:val="21"/>
-        </w:rPr>
-        <w:t xml:space="preserve"> }}</w:t>
-      </w:r>
-      <w:r>
-        <w:rPr>
-          <w:rFonts w:ascii="Calibri Light" w:hAnsi="Calibri Light" w:cs="Calibri Light"/>
-          <w:sz w:val="21"/>
-          <w:szCs w:val="21"/>
-        </w:rPr>
-        <w:t>’</w:t>
-      </w:r>
-      <w:proofErr w:type="gramEnd"/>
-      <w:r>
-        <w:rPr>
-          <w:rFonts w:ascii="Calibri Light" w:hAnsi="Calibri Light" w:cs="Calibri Light"/>
-          <w:sz w:val="21"/>
-          <w:szCs w:val="21"/>
-        </w:rPr>
-        <w:t xml:space="preserve">s contributions </w:t>
-      </w:r>
-      <w:r>
-        <w:rPr>
-          <w:rFonts w:ascii="Calibri Light" w:hAnsi="Calibri Light" w:cs="Calibri Light"/>
-          <w:sz w:val="21"/>
-          <w:szCs w:val="21"/>
-        </w:rPr>
-        <w:t>in the field of bioinformatics</w:t>
-      </w:r>
-      <w:r>
-        <w:rPr>
-          <w:rFonts w:ascii="Calibri Light" w:hAnsi="Calibri Light" w:cs="Calibri Light"/>
-          <w:sz w:val="21"/>
-          <w:szCs w:val="21"/>
-        </w:rPr>
-        <w:t xml:space="preserve">, </w:t>
-      </w:r>
-      <w:r>
-        <w:rPr>
-          <w:rFonts w:ascii="Calibri Light" w:hAnsi="Calibri Light" w:cs="Calibri Light"/>
-          <w:sz w:val="21"/>
-          <w:szCs w:val="21"/>
-        </w:rPr>
-        <w:t xml:space="preserve">especially in your innovative approaches taken </w:t>
-      </w:r>
-      <w:r>
-        <w:rPr>
-          <w:rFonts w:ascii="Calibri Light" w:hAnsi="Calibri Light" w:cs="Calibri Light"/>
-          <w:sz w:val="21"/>
-          <w:szCs w:val="21"/>
-        </w:rPr>
-        <w:t>to</w:t>
-      </w:r>
-      <w:r>
-        <w:rPr>
-          <w:rFonts w:ascii="Calibri Light" w:hAnsi="Calibri Light" w:cs="Calibri Light"/>
-          <w:sz w:val="21"/>
-          <w:szCs w:val="21"/>
+      <w:r>
+        <w:rPr>
+          <w:rFonts w:ascii="Calibri Light" w:hAnsi="Calibri Light" w:cs="Calibri Light"/>
+          <w:sz w:val="19"/>
+          <w:szCs w:val="19"/>
+        </w:rPr>
+        <w:t>{{ mission_statement }}</w:t>
+      </w:r>
+      <w:r>
+        <w:rPr>
+          <w:rFonts w:ascii="Calibri Light" w:hAnsi="Calibri Light" w:cs="Calibri Light"/>
+          <w:sz w:val="19"/>
+          <w:szCs w:val="19"/>
+        </w:rPr>
+        <w:t xml:space="preserve"> I see this as a</w:t>
+      </w:r>
+      <w:r>
+        <w:rPr>
+          <w:rFonts w:ascii="Calibri Light" w:hAnsi="Calibri Light" w:cs="Calibri Light"/>
+          <w:sz w:val="19"/>
+          <w:szCs w:val="19"/>
+        </w:rPr>
+        <w:t xml:space="preserve"> wonderful</w:t>
+      </w:r>
+      <w:r>
+        <w:rPr>
+          <w:rFonts w:ascii="Calibri Light" w:hAnsi="Calibri Light" w:cs="Calibri Light"/>
+          <w:sz w:val="19"/>
+          <w:szCs w:val="19"/>
+        </w:rPr>
+        <w:t xml:space="preserve"> learning opportunity where I can bridge the gaps in my laboratory science</w:t>
+      </w:r>
+      <w:r>
+        <w:rPr>
+          <w:rFonts w:ascii="Calibri Light" w:hAnsi="Calibri Light" w:cs="Calibri Light"/>
+          <w:sz w:val="19"/>
+          <w:szCs w:val="19"/>
         </w:rPr>
         <w:t xml:space="preserve"> </w:t>
       </w:r>
-      <w:proofErr w:type="gramStart"/>
-      <w:r>
-        <w:rPr>
-          <w:rFonts w:ascii="Calibri Light" w:hAnsi="Calibri Light" w:cs="Calibri Light"/>
-          <w:sz w:val="21"/>
-          <w:szCs w:val="21"/>
-        </w:rPr>
-        <w:t xml:space="preserve">{{ </w:t>
-      </w:r>
-      <w:proofErr w:type="spellStart"/>
-      <w:r>
-        <w:rPr>
-          <w:rFonts w:ascii="Calibri Light" w:hAnsi="Calibri Light" w:cs="Calibri Light"/>
-          <w:sz w:val="21"/>
-          <w:szCs w:val="21"/>
-        </w:rPr>
-        <w:t>mission</w:t>
-      </w:r>
-      <w:proofErr w:type="gramEnd"/>
-      <w:r>
-        <w:rPr>
-          <w:rFonts w:ascii="Calibri Light" w:hAnsi="Calibri Light" w:cs="Calibri Light"/>
-          <w:sz w:val="21"/>
-          <w:szCs w:val="21"/>
-        </w:rPr>
-        <w:t>_</w:t>
-      </w:r>
-      <w:proofErr w:type="gramStart"/>
-      <w:r>
-        <w:rPr>
-          <w:rFonts w:ascii="Calibri Light" w:hAnsi="Calibri Light" w:cs="Calibri Light"/>
-          <w:sz w:val="21"/>
-          <w:szCs w:val="21"/>
-        </w:rPr>
-        <w:t>statement</w:t>
-      </w:r>
-      <w:proofErr w:type="spellEnd"/>
-      <w:r>
-        <w:rPr>
-          <w:rFonts w:ascii="Calibri Light" w:hAnsi="Calibri Light" w:cs="Calibri Light"/>
-          <w:sz w:val="21"/>
-          <w:szCs w:val="21"/>
-        </w:rPr>
-        <w:t xml:space="preserve"> }</w:t>
-      </w:r>
-      <w:proofErr w:type="gramEnd"/>
-      <w:r>
-        <w:rPr>
-          <w:rFonts w:ascii="Calibri Light" w:hAnsi="Calibri Light" w:cs="Calibri Light"/>
-          <w:sz w:val="21"/>
-          <w:szCs w:val="21"/>
-        </w:rPr>
-        <w:t>}</w:t>
-      </w:r>
-      <w:r>
-        <w:rPr>
-          <w:rFonts w:ascii="Calibri Light" w:hAnsi="Calibri Light" w:cs="Calibri Light"/>
-          <w:sz w:val="21"/>
-          <w:szCs w:val="21"/>
-        </w:rPr>
-        <w:t xml:space="preserve"> I see this as a</w:t>
-      </w:r>
-      <w:r>
-        <w:rPr>
-          <w:rFonts w:ascii="Calibri Light" w:hAnsi="Calibri Light" w:cs="Calibri Light"/>
-          <w:sz w:val="21"/>
-          <w:szCs w:val="21"/>
-        </w:rPr>
-        <w:t xml:space="preserve"> wonderful</w:t>
-      </w:r>
-      <w:r>
-        <w:rPr>
-          <w:rFonts w:ascii="Calibri Light" w:hAnsi="Calibri Light" w:cs="Calibri Light"/>
-          <w:sz w:val="21"/>
-          <w:szCs w:val="21"/>
-        </w:rPr>
-        <w:t xml:space="preserve"> learning opportunity where I can bridge the gaps in my laboratory science</w:t>
-      </w:r>
-      <w:r>
-        <w:rPr>
-          <w:rFonts w:ascii="Calibri Light" w:hAnsi="Calibri Light" w:cs="Calibri Light"/>
-          <w:sz w:val="21"/>
-          <w:szCs w:val="21"/>
-        </w:rPr>
-        <w:t xml:space="preserve"> </w:t>
-      </w:r>
-      <w:r>
-        <w:rPr>
-          <w:rFonts w:ascii="Calibri Light" w:hAnsi="Calibri Light" w:cs="Calibri Light"/>
-          <w:sz w:val="21"/>
-          <w:szCs w:val="21"/>
+      <w:r>
+        <w:rPr>
+          <w:rFonts w:ascii="Calibri Light" w:hAnsi="Calibri Light" w:cs="Calibri Light"/>
+          <w:sz w:val="19"/>
+          <w:szCs w:val="19"/>
         </w:rPr>
         <w:t>background with my software development skills. As a dedicated, hard-working individual who thrives on challenges, I am confident that my problems-solving mindset and commitment to learning will be an asset to your team.</w:t>
       </w:r>
@@ -1381,15 +649,15 @@
         <w:rPr>
           <w:rFonts w:ascii="Calibri Light" w:hAnsi="Calibri Light" w:cs="Calibri Light"/>
           <w:color w:val="111111"/>
-          <w:sz w:val="21"/>
-          <w:szCs w:val="21"/>
+          <w:sz w:val="19"/>
+          <w:szCs w:val="19"/>
         </w:rPr>
       </w:pPr>
       <w:r>
         <w:rPr>
           <w:rFonts w:ascii="Calibri Light" w:hAnsi="Calibri Light" w:cs="Calibri Light"/>
-          <w:sz w:val="21"/>
-          <w:szCs w:val="21"/>
+          <w:sz w:val="19"/>
+          <w:szCs w:val="19"/>
         </w:rPr>
         <w:t xml:space="preserve">Thank you for your consideration of my application. If you have any further questions, please feel free to contact me via the UBC Science Co-op Office. </w:t>
       </w:r>
@@ -1397,8 +665,8 @@
         <w:rPr>
           <w:rFonts w:ascii="Calibri Light" w:hAnsi="Calibri Light" w:cs="Calibri Light"/>
           <w:color w:val="111111"/>
-          <w:sz w:val="21"/>
-          <w:szCs w:val="21"/>
+          <w:sz w:val="19"/>
+          <w:szCs w:val="19"/>
         </w:rPr>
         <w:t>I look forward to the possibility of discussing on how my experiences and skillset can support</w:t>
       </w:r>
@@ -1406,8 +674,8 @@
         <w:rPr>
           <w:rFonts w:ascii="Calibri Light" w:hAnsi="Calibri Light" w:cs="Calibri Light"/>
           <w:color w:val="111111"/>
-          <w:sz w:val="21"/>
-          <w:szCs w:val="21"/>
+          <w:sz w:val="19"/>
+          <w:szCs w:val="19"/>
         </w:rPr>
         <w:t xml:space="preserve"> your objectives</w:t>
       </w:r>
@@ -1415,8 +683,8 @@
         <w:rPr>
           <w:rFonts w:ascii="Calibri Light" w:hAnsi="Calibri Light" w:cs="Calibri Light"/>
           <w:color w:val="111111"/>
-          <w:sz w:val="21"/>
-          <w:szCs w:val="21"/>
+          <w:sz w:val="19"/>
+          <w:szCs w:val="19"/>
         </w:rPr>
         <w:t>. I look forward to hearing back from you.</w:t>
       </w:r>
@@ -1435,27 +703,18 @@
         <w:rPr>
           <w:rFonts w:ascii="Calibri Light" w:hAnsi="Calibri Light" w:cs="Calibri Light"/>
           <w:color w:val="111111"/>
-          <w:sz w:val="21"/>
-          <w:szCs w:val="21"/>
+          <w:sz w:val="19"/>
+          <w:szCs w:val="19"/>
         </w:rPr>
       </w:pPr>
       <w:r>
         <w:rPr>
           <w:rFonts w:ascii="Calibri Light" w:hAnsi="Calibri Light" w:cs="Calibri Light"/>
           <w:color w:val="111111"/>
-          <w:sz w:val="21"/>
-          <w:szCs w:val="21"/>
+          <w:sz w:val="19"/>
+          <w:szCs w:val="19"/>
         </w:rPr>
         <w:t>Best regards,</w:t>
-      </w:r>
-      <w:r>
-        <w:rPr>
-          <w:rFonts w:ascii="Calibri Light" w:hAnsi="Calibri Light" w:cs="Calibri Light"/>
-          <w:color w:val="111111"/>
-          <w:sz w:val="21"/>
-          <w:szCs w:val="21"/>
-        </w:rPr>
-        <w:br/>
       </w:r>
     </w:p>
     <w:p>
@@ -1472,16 +731,16 @@
         <w:rPr>
           <w:rFonts w:asciiTheme="majorHAnsi" w:hAnsiTheme="majorHAnsi" w:cstheme="majorHAnsi"/>
           <w:color w:val="111111"/>
-          <w:sz w:val="21"/>
-          <w:szCs w:val="21"/>
+          <w:sz w:val="19"/>
+          <w:szCs w:val="19"/>
         </w:rPr>
       </w:pPr>
       <w:r>
         <w:rPr>
           <w:rFonts w:ascii="Calibri Light" w:hAnsi="Calibri Light" w:cs="Calibri Light"/>
           <w:color w:val="111111"/>
-          <w:sz w:val="21"/>
-          <w:szCs w:val="21"/>
+          <w:sz w:val="19"/>
+          <w:szCs w:val="19"/>
         </w:rPr>
         <w:t>Sam Lui</w:t>
       </w:r>
@@ -1489,8 +748,8 @@
         <w:rPr>
           <w:rFonts w:asciiTheme="majorHAnsi" w:hAnsiTheme="majorHAnsi" w:cstheme="majorHAnsi"/>
           <w:color w:val="111111"/>
-          <w:sz w:val="21"/>
-          <w:szCs w:val="21"/>
+          <w:sz w:val="19"/>
+          <w:szCs w:val="19"/>
         </w:rPr>
         <w:t xml:space="preserve">  </w:t>
       </w:r>

</xml_diff>

<commit_message>
Reupdated all cover letter templates to include SSC responsibilities
</commit_message>
<xml_diff>
--- a/Bioinformatics_CoverLetterTemplate.docx
+++ b/Bioinformatics_CoverLetterTemplate.docx
@@ -16,7 +16,25 @@
           <w:sz w:val="19"/>
           <w:szCs w:val="19"/>
         </w:rPr>
-        <w:t>{{ todays_date }}</w:t>
+        <w:t xml:space="preserve">{{ </w:t>
+      </w:r>
+      <w:proofErr w:type="spellStart"/>
+      <w:r>
+        <w:rPr>
+          <w:rFonts w:ascii="Calibri Light" w:hAnsi="Calibri Light" w:cs="Calibri Light"/>
+          <w:sz w:val="19"/>
+          <w:szCs w:val="19"/>
+        </w:rPr>
+        <w:t>todays_date</w:t>
+      </w:r>
+      <w:proofErr w:type="spellEnd"/>
+      <w:r>
+        <w:rPr>
+          <w:rFonts w:ascii="Calibri Light" w:hAnsi="Calibri Light" w:cs="Calibri Light"/>
+          <w:sz w:val="19"/>
+          <w:szCs w:val="19"/>
+        </w:rPr>
+        <w:t xml:space="preserve"> }}</w:t>
       </w:r>
     </w:p>
     <w:p>
@@ -35,7 +53,27 @@
           <w:sz w:val="19"/>
           <w:szCs w:val="19"/>
         </w:rPr>
-        <w:t>{{ company_name }}</w:t>
+        <w:t xml:space="preserve">{{ </w:t>
+      </w:r>
+      <w:proofErr w:type="spellStart"/>
+      <w:r>
+        <w:rPr>
+          <w:rFonts w:ascii="Calibri Light" w:eastAsia="Cambria" w:hAnsi="Calibri Light" w:cs="Calibri Light"/>
+          <w:bCs/>
+          <w:sz w:val="19"/>
+          <w:szCs w:val="19"/>
+        </w:rPr>
+        <w:t>company_name</w:t>
+      </w:r>
+      <w:proofErr w:type="spellEnd"/>
+      <w:r>
+        <w:rPr>
+          <w:rFonts w:ascii="Calibri Light" w:eastAsia="Cambria" w:hAnsi="Calibri Light" w:cs="Calibri Light"/>
+          <w:bCs/>
+          <w:sz w:val="19"/>
+          <w:szCs w:val="19"/>
+        </w:rPr>
+        <w:t xml:space="preserve"> }}</w:t>
       </w:r>
       <w:r>
         <w:rPr>
@@ -45,7 +83,27 @@
           <w:szCs w:val="19"/>
         </w:rPr>
         <w:br/>
-        <w:t xml:space="preserve">{{ company_address }} </w:t>
+        <w:t xml:space="preserve">{{ </w:t>
+      </w:r>
+      <w:proofErr w:type="spellStart"/>
+      <w:r>
+        <w:rPr>
+          <w:rFonts w:ascii="Calibri Light" w:eastAsia="Cambria" w:hAnsi="Calibri Light" w:cs="Calibri Light"/>
+          <w:bCs/>
+          <w:sz w:val="19"/>
+          <w:szCs w:val="19"/>
+        </w:rPr>
+        <w:t>company_address</w:t>
+      </w:r>
+      <w:proofErr w:type="spellEnd"/>
+      <w:r>
+        <w:rPr>
+          <w:rFonts w:ascii="Calibri Light" w:eastAsia="Cambria" w:hAnsi="Calibri Light" w:cs="Calibri Light"/>
+          <w:bCs/>
+          <w:sz w:val="19"/>
+          <w:szCs w:val="19"/>
+        </w:rPr>
+        <w:t xml:space="preserve"> }} </w:t>
       </w:r>
       <w:r>
         <w:rPr>
@@ -55,7 +113,47 @@
           <w:szCs w:val="19"/>
         </w:rPr>
         <w:br/>
-        <w:t>{{ company_city }}, {{ company_province }}</w:t>
+        <w:t xml:space="preserve">{{ </w:t>
+      </w:r>
+      <w:proofErr w:type="spellStart"/>
+      <w:r>
+        <w:rPr>
+          <w:rFonts w:ascii="Calibri Light" w:eastAsia="Cambria" w:hAnsi="Calibri Light" w:cs="Calibri Light"/>
+          <w:bCs/>
+          <w:sz w:val="19"/>
+          <w:szCs w:val="19"/>
+        </w:rPr>
+        <w:t>company_city</w:t>
+      </w:r>
+      <w:proofErr w:type="spellEnd"/>
+      <w:r>
+        <w:rPr>
+          <w:rFonts w:ascii="Calibri Light" w:eastAsia="Cambria" w:hAnsi="Calibri Light" w:cs="Calibri Light"/>
+          <w:bCs/>
+          <w:sz w:val="19"/>
+          <w:szCs w:val="19"/>
+        </w:rPr>
+        <w:t xml:space="preserve"> }}, {{ </w:t>
+      </w:r>
+      <w:proofErr w:type="spellStart"/>
+      <w:r>
+        <w:rPr>
+          <w:rFonts w:ascii="Calibri Light" w:eastAsia="Cambria" w:hAnsi="Calibri Light" w:cs="Calibri Light"/>
+          <w:bCs/>
+          <w:sz w:val="19"/>
+          <w:szCs w:val="19"/>
+        </w:rPr>
+        <w:t>company_province</w:t>
+      </w:r>
+      <w:proofErr w:type="spellEnd"/>
+      <w:r>
+        <w:rPr>
+          <w:rFonts w:ascii="Calibri Light" w:eastAsia="Cambria" w:hAnsi="Calibri Light" w:cs="Calibri Light"/>
+          <w:bCs/>
+          <w:sz w:val="19"/>
+          <w:szCs w:val="19"/>
+        </w:rPr>
+        <w:t xml:space="preserve"> }}</w:t>
       </w:r>
       <w:r>
         <w:rPr>
@@ -65,7 +163,27 @@
           <w:szCs w:val="19"/>
         </w:rPr>
         <w:br/>
-        <w:t>{{ company_postal }}</w:t>
+        <w:t xml:space="preserve">{{ </w:t>
+      </w:r>
+      <w:proofErr w:type="spellStart"/>
+      <w:r>
+        <w:rPr>
+          <w:rFonts w:ascii="Calibri Light" w:eastAsia="Cambria" w:hAnsi="Calibri Light" w:cs="Calibri Light"/>
+          <w:bCs/>
+          <w:sz w:val="19"/>
+          <w:szCs w:val="19"/>
+        </w:rPr>
+        <w:t>company_postal</w:t>
+      </w:r>
+      <w:proofErr w:type="spellEnd"/>
+      <w:r>
+        <w:rPr>
+          <w:rFonts w:ascii="Calibri Light" w:eastAsia="Cambria" w:hAnsi="Calibri Light" w:cs="Calibri Light"/>
+          <w:bCs/>
+          <w:sz w:val="19"/>
+          <w:szCs w:val="19"/>
+        </w:rPr>
+        <w:t xml:space="preserve"> }}</w:t>
       </w:r>
     </w:p>
     <w:p>
@@ -90,7 +208,25 @@
           <w:sz w:val="19"/>
           <w:szCs w:val="19"/>
         </w:rPr>
-        <w:t>{{ letter_addressee }}</w:t>
+        <w:t xml:space="preserve">{{ </w:t>
+      </w:r>
+      <w:proofErr w:type="spellStart"/>
+      <w:r>
+        <w:rPr>
+          <w:rFonts w:ascii="Calibri Light" w:hAnsi="Calibri Light" w:cs="Calibri Light"/>
+          <w:sz w:val="19"/>
+          <w:szCs w:val="19"/>
+        </w:rPr>
+        <w:t>letter_addressee</w:t>
+      </w:r>
+      <w:proofErr w:type="spellEnd"/>
+      <w:r>
+        <w:rPr>
+          <w:rFonts w:ascii="Calibri Light" w:hAnsi="Calibri Light" w:cs="Calibri Light"/>
+          <w:sz w:val="19"/>
+          <w:szCs w:val="19"/>
+        </w:rPr>
+        <w:t xml:space="preserve"> }}</w:t>
       </w:r>
       <w:r>
         <w:rPr>
@@ -132,7 +268,25 @@
           <w:sz w:val="19"/>
           <w:szCs w:val="19"/>
         </w:rPr>
-        <w:t>{{ position_name }}</w:t>
+        <w:t xml:space="preserve">{{ </w:t>
+      </w:r>
+      <w:proofErr w:type="spellStart"/>
+      <w:r>
+        <w:rPr>
+          <w:rFonts w:ascii="Calibri Light" w:hAnsi="Calibri Light" w:cs="Calibri Light"/>
+          <w:sz w:val="19"/>
+          <w:szCs w:val="19"/>
+        </w:rPr>
+        <w:t>position_name</w:t>
+      </w:r>
+      <w:proofErr w:type="spellEnd"/>
+      <w:r>
+        <w:rPr>
+          <w:rFonts w:ascii="Calibri Light" w:hAnsi="Calibri Light" w:cs="Calibri Light"/>
+          <w:sz w:val="19"/>
+          <w:szCs w:val="19"/>
+        </w:rPr>
+        <w:t xml:space="preserve"> }}</w:t>
       </w:r>
       <w:r>
         <w:rPr>
@@ -164,7 +318,25 @@
           <w:sz w:val="19"/>
           <w:szCs w:val="19"/>
         </w:rPr>
-        <w:t>{{ company_name }}</w:t>
+        <w:t xml:space="preserve">{{ </w:t>
+      </w:r>
+      <w:proofErr w:type="spellStart"/>
+      <w:r>
+        <w:rPr>
+          <w:rFonts w:ascii="Calibri Light" w:hAnsi="Calibri Light" w:cs="Calibri Light"/>
+          <w:sz w:val="19"/>
+          <w:szCs w:val="19"/>
+        </w:rPr>
+        <w:t>company_name</w:t>
+      </w:r>
+      <w:proofErr w:type="spellEnd"/>
+      <w:r>
+        <w:rPr>
+          <w:rFonts w:ascii="Calibri Light" w:hAnsi="Calibri Light" w:cs="Calibri Light"/>
+          <w:sz w:val="19"/>
+          <w:szCs w:val="19"/>
+        </w:rPr>
+        <w:t xml:space="preserve"> }}</w:t>
       </w:r>
       <w:r>
         <w:rPr>
@@ -350,7 +522,61 @@
           <w:sz w:val="19"/>
           <w:szCs w:val="19"/>
         </w:rPr>
-        <w:t>software, including CytoVision, SeqPilot for Sanger sequencing and GeneMapper for fragment analysis,</w:t>
+        <w:t xml:space="preserve">software, including </w:t>
+      </w:r>
+      <w:proofErr w:type="spellStart"/>
+      <w:r>
+        <w:rPr>
+          <w:rFonts w:ascii="Calibri Light" w:hAnsi="Calibri Light" w:cs="Calibri Light"/>
+          <w:sz w:val="19"/>
+          <w:szCs w:val="19"/>
+        </w:rPr>
+        <w:t>CytoVision</w:t>
+      </w:r>
+      <w:proofErr w:type="spellEnd"/>
+      <w:r>
+        <w:rPr>
+          <w:rFonts w:ascii="Calibri Light" w:hAnsi="Calibri Light" w:cs="Calibri Light"/>
+          <w:sz w:val="19"/>
+          <w:szCs w:val="19"/>
+        </w:rPr>
+        <w:t xml:space="preserve">, </w:t>
+      </w:r>
+      <w:proofErr w:type="spellStart"/>
+      <w:r>
+        <w:rPr>
+          <w:rFonts w:ascii="Calibri Light" w:hAnsi="Calibri Light" w:cs="Calibri Light"/>
+          <w:sz w:val="19"/>
+          <w:szCs w:val="19"/>
+        </w:rPr>
+        <w:t>SeqPilot</w:t>
+      </w:r>
+      <w:proofErr w:type="spellEnd"/>
+      <w:r>
+        <w:rPr>
+          <w:rFonts w:ascii="Calibri Light" w:hAnsi="Calibri Light" w:cs="Calibri Light"/>
+          <w:sz w:val="19"/>
+          <w:szCs w:val="19"/>
+        </w:rPr>
+        <w:t xml:space="preserve"> for Sanger sequencing and </w:t>
+      </w:r>
+      <w:proofErr w:type="spellStart"/>
+      <w:r>
+        <w:rPr>
+          <w:rFonts w:ascii="Calibri Light" w:hAnsi="Calibri Light" w:cs="Calibri Light"/>
+          <w:sz w:val="19"/>
+          <w:szCs w:val="19"/>
+        </w:rPr>
+        <w:t>GeneMapper</w:t>
+      </w:r>
+      <w:proofErr w:type="spellEnd"/>
+      <w:r>
+        <w:rPr>
+          <w:rFonts w:ascii="Calibri Light" w:hAnsi="Calibri Light" w:cs="Calibri Light"/>
+          <w:sz w:val="19"/>
+          <w:szCs w:val="19"/>
+        </w:rPr>
+        <w:t xml:space="preserve"> for fragment analysis,</w:t>
       </w:r>
       <w:r>
         <w:rPr>
@@ -491,16 +717,43 @@
           <w:sz w:val="19"/>
           <w:szCs w:val="19"/>
         </w:rPr>
-        <w:t xml:space="preserve">, all while developing transferrable skills that are critical in a client-facing Agile-style team, </w:t>
-      </w:r>
-      <w:r>
-        <w:rPr>
-          <w:rFonts w:ascii="Calibri Light" w:eastAsia="Cambria" w:hAnsi="Calibri Light" w:cs="Calibri Light"/>
-          <w:bCs/>
-          <w:sz w:val="19"/>
-          <w:szCs w:val="19"/>
-        </w:rPr>
-        <w:t xml:space="preserve">such as interpersonal communication, time management and task prioritization. Alongside this, </w:t>
+        <w:t>, all while developing transferrable skills that are critical in a client-facing Agile-style team</w:t>
+      </w:r>
+      <w:r>
+        <w:rPr>
+          <w:rFonts w:ascii="Calibri Light" w:eastAsia="Cambria" w:hAnsi="Calibri Light" w:cs="Calibri Light"/>
+          <w:bCs/>
+          <w:sz w:val="19"/>
+          <w:szCs w:val="19"/>
+        </w:rPr>
+        <w:t>.</w:t>
+      </w:r>
+      <w:r>
+        <w:rPr>
+          <w:rFonts w:ascii="Calibri Light" w:eastAsia="Cambria" w:hAnsi="Calibri Light" w:cs="Calibri Light"/>
+          <w:bCs/>
+          <w:sz w:val="19"/>
+          <w:szCs w:val="19"/>
+        </w:rPr>
+        <w:t xml:space="preserve"> </w:t>
+      </w:r>
+      <w:r>
+        <w:rPr>
+          <w:rFonts w:ascii="Calibri Light" w:eastAsia="Cambria" w:hAnsi="Calibri Light" w:cs="Calibri Light"/>
+          <w:bCs/>
+          <w:sz w:val="19"/>
+          <w:szCs w:val="19"/>
+        </w:rPr>
+        <w:t>In this role, I aim to identify potential opportunities for automation to streamline recurring processes and improve efficiency through scripting with JavaScript, Python and PowerShell, building on my interest in workflow optimization</w:t>
+      </w:r>
+      <w:r>
+        <w:rPr>
+          <w:rFonts w:ascii="Calibri Light" w:eastAsia="Cambria" w:hAnsi="Calibri Light" w:cs="Calibri Light"/>
+          <w:bCs/>
+          <w:sz w:val="19"/>
+          <w:szCs w:val="19"/>
+        </w:rPr>
+        <w:t xml:space="preserve"> Alongside this, </w:t>
       </w:r>
       <w:r>
         <w:rPr>
@@ -518,7 +771,145 @@
           <w:sz w:val="19"/>
           <w:szCs w:val="19"/>
         </w:rPr>
-        <w:t xml:space="preserve"> full-stack applications, which not only strongly showcases my continued passion in software construction, but also displays my dedication and initiative to grow in a fast-paced industry. For example, I scaled SipLy from an academic Java-based CLI and Swing project into a full-stack React and Spring Boot web application that helps users track their daily sugar, caffeine and caloric intake from consumed beverages. On the backend, I learnt how to design RESTful APIs, and utilized the embedded H2 Database Engine to persist user data. Through SipLy, I also learnt the fundamentals of security and implemented password hashing to protect user login data with Spring Security and BCrypt. I also have plans of integrating Spring AI with Groq to deliver personalized recommendations. Furthermore, I have also built AniMori, a desktop anime-tracking application, powered by ElectronJS and React for the frontend, and SQLite for the backend database. For AniMoris’ backend, I implemented a lightweight relational database schema to manage anime entries and watch statuses, successfully integrating the Jikan API to automatically fetch metadata without manual entry, and wrote reusable SQL queries to handle common CRUD operations. Subsequently, I was able to successfully connect both components together, ensuring smooth data flow from UI to backend. These projects have enhanced my capabilities in assessing real-world problems, coordinating technical workflows and learnt how to iteratively build upon existing prototypes for continuous improvement. </w:t>
+        <w:t xml:space="preserve"> full-stack applications, which not only strongly showcases my continued passion in software construction, but also displays my dedication and initiative to grow in a fast-paced industry. For example, I scaled </w:t>
+      </w:r>
+      <w:proofErr w:type="spellStart"/>
+      <w:r>
+        <w:rPr>
+          <w:rFonts w:ascii="Calibri Light" w:eastAsia="Cambria" w:hAnsi="Calibri Light" w:cs="Calibri Light"/>
+          <w:bCs/>
+          <w:sz w:val="19"/>
+          <w:szCs w:val="19"/>
+        </w:rPr>
+        <w:t>SipLy</w:t>
+      </w:r>
+      <w:proofErr w:type="spellEnd"/>
+      <w:r>
+        <w:rPr>
+          <w:rFonts w:ascii="Calibri Light" w:eastAsia="Cambria" w:hAnsi="Calibri Light" w:cs="Calibri Light"/>
+          <w:bCs/>
+          <w:sz w:val="19"/>
+          <w:szCs w:val="19"/>
+        </w:rPr>
+        <w:t xml:space="preserve"> from an academic Java-based CLI and Swing project into a full-stack React and Spring Boot web application that helps users track their daily sugar, caffeine and caloric intake from consumed beverages. On the backend, I learnt how to design RESTful APIs, and utilized the embedded H2 Database Engine to persist user data. Through </w:t>
+      </w:r>
+      <w:proofErr w:type="spellStart"/>
+      <w:r>
+        <w:rPr>
+          <w:rFonts w:ascii="Calibri Light" w:eastAsia="Cambria" w:hAnsi="Calibri Light" w:cs="Calibri Light"/>
+          <w:bCs/>
+          <w:sz w:val="19"/>
+          <w:szCs w:val="19"/>
+        </w:rPr>
+        <w:t>SipLy</w:t>
+      </w:r>
+      <w:proofErr w:type="spellEnd"/>
+      <w:r>
+        <w:rPr>
+          <w:rFonts w:ascii="Calibri Light" w:eastAsia="Cambria" w:hAnsi="Calibri Light" w:cs="Calibri Light"/>
+          <w:bCs/>
+          <w:sz w:val="19"/>
+          <w:szCs w:val="19"/>
+        </w:rPr>
+        <w:t xml:space="preserve">, I also learnt the fundamentals of security and implemented password hashing to protect user login data with Spring Security and </w:t>
+      </w:r>
+      <w:proofErr w:type="spellStart"/>
+      <w:r>
+        <w:rPr>
+          <w:rFonts w:ascii="Calibri Light" w:eastAsia="Cambria" w:hAnsi="Calibri Light" w:cs="Calibri Light"/>
+          <w:bCs/>
+          <w:sz w:val="19"/>
+          <w:szCs w:val="19"/>
+        </w:rPr>
+        <w:t>BCrypt</w:t>
+      </w:r>
+      <w:proofErr w:type="spellEnd"/>
+      <w:r>
+        <w:rPr>
+          <w:rFonts w:ascii="Calibri Light" w:eastAsia="Cambria" w:hAnsi="Calibri Light" w:cs="Calibri Light"/>
+          <w:bCs/>
+          <w:sz w:val="19"/>
+          <w:szCs w:val="19"/>
+        </w:rPr>
+        <w:t xml:space="preserve">. I also have plans of integrating Spring AI with </w:t>
+      </w:r>
+      <w:proofErr w:type="spellStart"/>
+      <w:r>
+        <w:rPr>
+          <w:rFonts w:ascii="Calibri Light" w:eastAsia="Cambria" w:hAnsi="Calibri Light" w:cs="Calibri Light"/>
+          <w:bCs/>
+          <w:sz w:val="19"/>
+          <w:szCs w:val="19"/>
+        </w:rPr>
+        <w:t>Groq</w:t>
+      </w:r>
+      <w:proofErr w:type="spellEnd"/>
+      <w:r>
+        <w:rPr>
+          <w:rFonts w:ascii="Calibri Light" w:eastAsia="Cambria" w:hAnsi="Calibri Light" w:cs="Calibri Light"/>
+          <w:bCs/>
+          <w:sz w:val="19"/>
+          <w:szCs w:val="19"/>
+        </w:rPr>
+        <w:t xml:space="preserve"> to deliver personalized recommendations. Furthermore, I have also built </w:t>
+      </w:r>
+      <w:proofErr w:type="spellStart"/>
+      <w:r>
+        <w:rPr>
+          <w:rFonts w:ascii="Calibri Light" w:eastAsia="Cambria" w:hAnsi="Calibri Light" w:cs="Calibri Light"/>
+          <w:bCs/>
+          <w:sz w:val="19"/>
+          <w:szCs w:val="19"/>
+        </w:rPr>
+        <w:t>AniMori</w:t>
+      </w:r>
+      <w:proofErr w:type="spellEnd"/>
+      <w:r>
+        <w:rPr>
+          <w:rFonts w:ascii="Calibri Light" w:eastAsia="Cambria" w:hAnsi="Calibri Light" w:cs="Calibri Light"/>
+          <w:bCs/>
+          <w:sz w:val="19"/>
+          <w:szCs w:val="19"/>
+        </w:rPr>
+        <w:t>, a desktop anime-tracking application, powered by Electron</w:t>
+      </w:r>
+      <w:r>
+        <w:rPr>
+          <w:rFonts w:ascii="Calibri Light" w:eastAsia="Cambria" w:hAnsi="Calibri Light" w:cs="Calibri Light"/>
+          <w:bCs/>
+          <w:sz w:val="19"/>
+          <w:szCs w:val="19"/>
+        </w:rPr>
+        <w:t>.js</w:t>
+      </w:r>
+      <w:r>
+        <w:rPr>
+          <w:rFonts w:ascii="Calibri Light" w:eastAsia="Cambria" w:hAnsi="Calibri Light" w:cs="Calibri Light"/>
+          <w:bCs/>
+          <w:sz w:val="19"/>
+          <w:szCs w:val="19"/>
+        </w:rPr>
+        <w:t xml:space="preserve"> and React for the frontend, and SQLite for the backend database. For </w:t>
+      </w:r>
+      <w:proofErr w:type="spellStart"/>
+      <w:r>
+        <w:rPr>
+          <w:rFonts w:ascii="Calibri Light" w:eastAsia="Cambria" w:hAnsi="Calibri Light" w:cs="Calibri Light"/>
+          <w:bCs/>
+          <w:sz w:val="19"/>
+          <w:szCs w:val="19"/>
+        </w:rPr>
+        <w:t>AniMoris</w:t>
+      </w:r>
+      <w:proofErr w:type="spellEnd"/>
+      <w:r>
+        <w:rPr>
+          <w:rFonts w:ascii="Calibri Light" w:eastAsia="Cambria" w:hAnsi="Calibri Light" w:cs="Calibri Light"/>
+          <w:bCs/>
+          <w:sz w:val="19"/>
+          <w:szCs w:val="19"/>
+        </w:rPr>
+        <w:t xml:space="preserve">’ backend, I implemented a lightweight relational database schema to manage anime entries and watch statuses, successfully integrating the Jikan API to automatically fetch metadata without manual entry, and wrote reusable SQL queries to handle common CRUD operations. Subsequently, I was able to successfully connect both components together, ensuring smooth data flow from UI to backend. These projects have enhanced my capabilities in assessing real-world problems, coordinating technical workflows and learnt how to iteratively build upon existing prototypes for continuous improvement. </w:t>
       </w:r>
     </w:p>
     <w:p>
@@ -544,7 +935,25 @@
           <w:sz w:val="19"/>
           <w:szCs w:val="19"/>
         </w:rPr>
-        <w:t xml:space="preserve"> {{ company_name }}</w:t>
+        <w:t xml:space="preserve"> {{ </w:t>
+      </w:r>
+      <w:proofErr w:type="spellStart"/>
+      <w:r>
+        <w:rPr>
+          <w:rFonts w:ascii="Calibri Light" w:hAnsi="Calibri Light" w:cs="Calibri Light"/>
+          <w:sz w:val="19"/>
+          <w:szCs w:val="19"/>
+        </w:rPr>
+        <w:t>company_name</w:t>
+      </w:r>
+      <w:proofErr w:type="spellEnd"/>
+      <w:r>
+        <w:rPr>
+          <w:rFonts w:ascii="Calibri Light" w:hAnsi="Calibri Light" w:cs="Calibri Light"/>
+          <w:sz w:val="19"/>
+          <w:szCs w:val="19"/>
+        </w:rPr>
+        <w:t xml:space="preserve"> }}</w:t>
       </w:r>
       <w:r>
         <w:rPr>
@@ -600,7 +1009,25 @@
           <w:sz w:val="19"/>
           <w:szCs w:val="19"/>
         </w:rPr>
-        <w:t>{{ mission_statement }}</w:t>
+        <w:t xml:space="preserve">{{ </w:t>
+      </w:r>
+      <w:proofErr w:type="spellStart"/>
+      <w:r>
+        <w:rPr>
+          <w:rFonts w:ascii="Calibri Light" w:hAnsi="Calibri Light" w:cs="Calibri Light"/>
+          <w:sz w:val="19"/>
+          <w:szCs w:val="19"/>
+        </w:rPr>
+        <w:t>mission_statement</w:t>
+      </w:r>
+      <w:proofErr w:type="spellEnd"/>
+      <w:r>
+        <w:rPr>
+          <w:rFonts w:ascii="Calibri Light" w:hAnsi="Calibri Light" w:cs="Calibri Light"/>
+          <w:sz w:val="19"/>
+          <w:szCs w:val="19"/>
+        </w:rPr>
+        <w:t xml:space="preserve"> }}</w:t>
       </w:r>
       <w:r>
         <w:rPr>
@@ -659,7 +1086,7 @@
           <w:sz w:val="19"/>
           <w:szCs w:val="19"/>
         </w:rPr>
-        <w:t xml:space="preserve">Thank you for your consideration of my application. If you have any further questions, please feel free to contact me via the UBC Science Co-op Office. </w:t>
+        <w:t xml:space="preserve">Thank you for your consideration of my application. If you have any further questions, please feel free to contact me. </w:t>
       </w:r>
       <w:r>
         <w:rPr>

</xml_diff>

<commit_message>
Updated all templates, added a .gitignore
</commit_message>
<xml_diff>
--- a/Bioinformatics_CoverLetterTemplate.docx
+++ b/Bioinformatics_CoverLetterTemplate.docx
@@ -6,15 +6,16 @@
       <w:pPr>
         <w:rPr>
           <w:rFonts w:ascii="Calibri Light" w:hAnsi="Calibri Light" w:cs="Calibri Light"/>
-          <w:sz w:val="19"/>
-          <w:szCs w:val="19"/>
+          <w:sz w:val="20"/>
+          <w:szCs w:val="20"/>
         </w:rPr>
       </w:pPr>
-      <w:r>
-        <w:rPr>
-          <w:rFonts w:ascii="Calibri Light" w:hAnsi="Calibri Light" w:cs="Calibri Light"/>
-          <w:sz w:val="19"/>
-          <w:szCs w:val="19"/>
+      <w:proofErr w:type="gramStart"/>
+      <w:r>
+        <w:rPr>
+          <w:rFonts w:ascii="Calibri Light" w:hAnsi="Calibri Light" w:cs="Calibri Light"/>
+          <w:sz w:val="20"/>
+          <w:szCs w:val="20"/>
         </w:rPr>
         <w:t xml:space="preserve">{{ </w:t>
       </w:r>
@@ -22,19 +23,46 @@
       <w:r>
         <w:rPr>
           <w:rFonts w:ascii="Calibri Light" w:hAnsi="Calibri Light" w:cs="Calibri Light"/>
-          <w:sz w:val="19"/>
-          <w:szCs w:val="19"/>
-        </w:rPr>
-        <w:t>todays_date</w:t>
+          <w:sz w:val="20"/>
+          <w:szCs w:val="20"/>
+        </w:rPr>
+        <w:t>todays</w:t>
+      </w:r>
+      <w:proofErr w:type="gramEnd"/>
+      <w:r>
+        <w:rPr>
+          <w:rFonts w:ascii="Calibri Light" w:hAnsi="Calibri Light" w:cs="Calibri Light"/>
+          <w:sz w:val="20"/>
+          <w:szCs w:val="20"/>
+        </w:rPr>
+        <w:t>_</w:t>
+      </w:r>
+      <w:proofErr w:type="gramStart"/>
+      <w:r>
+        <w:rPr>
+          <w:rFonts w:ascii="Calibri Light" w:hAnsi="Calibri Light" w:cs="Calibri Light"/>
+          <w:sz w:val="20"/>
+          <w:szCs w:val="20"/>
+        </w:rPr>
+        <w:t>date</w:t>
       </w:r>
       <w:proofErr w:type="spellEnd"/>
       <w:r>
         <w:rPr>
           <w:rFonts w:ascii="Calibri Light" w:hAnsi="Calibri Light" w:cs="Calibri Light"/>
-          <w:sz w:val="19"/>
-          <w:szCs w:val="19"/>
-        </w:rPr>
-        <w:t xml:space="preserve"> }}</w:t>
+          <w:sz w:val="20"/>
+          <w:szCs w:val="20"/>
+        </w:rPr>
+        <w:t xml:space="preserve"> }</w:t>
+      </w:r>
+      <w:proofErr w:type="gramEnd"/>
+      <w:r>
+        <w:rPr>
+          <w:rFonts w:ascii="Calibri Light" w:hAnsi="Calibri Light" w:cs="Calibri Light"/>
+          <w:sz w:val="20"/>
+          <w:szCs w:val="20"/>
+        </w:rPr>
+        <w:t>}</w:t>
       </w:r>
     </w:p>
     <w:p>
@@ -42,16 +70,17 @@
         <w:rPr>
           <w:rFonts w:ascii="Calibri Light" w:eastAsia="Cambria" w:hAnsi="Calibri Light" w:cs="Calibri Light"/>
           <w:bCs/>
-          <w:sz w:val="19"/>
-          <w:szCs w:val="19"/>
+          <w:sz w:val="20"/>
+          <w:szCs w:val="20"/>
         </w:rPr>
       </w:pPr>
-      <w:r>
-        <w:rPr>
-          <w:rFonts w:ascii="Calibri Light" w:eastAsia="Cambria" w:hAnsi="Calibri Light" w:cs="Calibri Light"/>
-          <w:bCs/>
-          <w:sz w:val="19"/>
-          <w:szCs w:val="19"/>
+      <w:proofErr w:type="gramStart"/>
+      <w:r>
+        <w:rPr>
+          <w:rFonts w:ascii="Calibri Light" w:eastAsia="Cambria" w:hAnsi="Calibri Light" w:cs="Calibri Light"/>
+          <w:bCs/>
+          <w:sz w:val="20"/>
+          <w:szCs w:val="20"/>
         </w:rPr>
         <w:t xml:space="preserve">{{ </w:t>
       </w:r>
@@ -60,18 +89,28 @@
         <w:rPr>
           <w:rFonts w:ascii="Calibri Light" w:eastAsia="Cambria" w:hAnsi="Calibri Light" w:cs="Calibri Light"/>
           <w:bCs/>
-          <w:sz w:val="19"/>
-          <w:szCs w:val="19"/>
-        </w:rPr>
-        <w:t>company_name</w:t>
+          <w:sz w:val="20"/>
+          <w:szCs w:val="20"/>
+        </w:rPr>
+        <w:t>company</w:t>
+      </w:r>
+      <w:proofErr w:type="gramEnd"/>
+      <w:r>
+        <w:rPr>
+          <w:rFonts w:ascii="Calibri Light" w:eastAsia="Cambria" w:hAnsi="Calibri Light" w:cs="Calibri Light"/>
+          <w:bCs/>
+          <w:sz w:val="20"/>
+          <w:szCs w:val="20"/>
+        </w:rPr>
+        <w:t>_name</w:t>
       </w:r>
       <w:proofErr w:type="spellEnd"/>
       <w:r>
         <w:rPr>
           <w:rFonts w:ascii="Calibri Light" w:eastAsia="Cambria" w:hAnsi="Calibri Light" w:cs="Calibri Light"/>
           <w:bCs/>
-          <w:sz w:val="19"/>
-          <w:szCs w:val="19"/>
+          <w:sz w:val="20"/>
+          <w:szCs w:val="20"/>
         </w:rPr>
         <w:t xml:space="preserve"> }}</w:t>
       </w:r>
@@ -79,10 +118,19 @@
         <w:rPr>
           <w:rFonts w:ascii="Calibri Light" w:eastAsia="Cambria" w:hAnsi="Calibri Light" w:cs="Calibri Light"/>
           <w:bCs/>
-          <w:sz w:val="19"/>
-          <w:szCs w:val="19"/>
+          <w:sz w:val="20"/>
+          <w:szCs w:val="20"/>
         </w:rPr>
         <w:br/>
+      </w:r>
+      <w:proofErr w:type="gramStart"/>
+      <w:r>
+        <w:rPr>
+          <w:rFonts w:ascii="Calibri Light" w:eastAsia="Cambria" w:hAnsi="Calibri Light" w:cs="Calibri Light"/>
+          <w:bCs/>
+          <w:sz w:val="20"/>
+          <w:szCs w:val="20"/>
+        </w:rPr>
         <w:t xml:space="preserve">{{ </w:t>
       </w:r>
       <w:proofErr w:type="spellStart"/>
@@ -90,29 +138,68 @@
         <w:rPr>
           <w:rFonts w:ascii="Calibri Light" w:eastAsia="Cambria" w:hAnsi="Calibri Light" w:cs="Calibri Light"/>
           <w:bCs/>
-          <w:sz w:val="19"/>
-          <w:szCs w:val="19"/>
-        </w:rPr>
-        <w:t>company_address</w:t>
+          <w:sz w:val="20"/>
+          <w:szCs w:val="20"/>
+        </w:rPr>
+        <w:t>company</w:t>
+      </w:r>
+      <w:proofErr w:type="gramEnd"/>
+      <w:r>
+        <w:rPr>
+          <w:rFonts w:ascii="Calibri Light" w:eastAsia="Cambria" w:hAnsi="Calibri Light" w:cs="Calibri Light"/>
+          <w:bCs/>
+          <w:sz w:val="20"/>
+          <w:szCs w:val="20"/>
+        </w:rPr>
+        <w:t>_</w:t>
+      </w:r>
+      <w:proofErr w:type="gramStart"/>
+      <w:r>
+        <w:rPr>
+          <w:rFonts w:ascii="Calibri Light" w:eastAsia="Cambria" w:hAnsi="Calibri Light" w:cs="Calibri Light"/>
+          <w:bCs/>
+          <w:sz w:val="20"/>
+          <w:szCs w:val="20"/>
+        </w:rPr>
+        <w:t>address</w:t>
       </w:r>
       <w:proofErr w:type="spellEnd"/>
       <w:r>
         <w:rPr>
           <w:rFonts w:ascii="Calibri Light" w:eastAsia="Cambria" w:hAnsi="Calibri Light" w:cs="Calibri Light"/>
           <w:bCs/>
-          <w:sz w:val="19"/>
-          <w:szCs w:val="19"/>
-        </w:rPr>
-        <w:t xml:space="preserve"> }} </w:t>
-      </w:r>
-      <w:r>
-        <w:rPr>
-          <w:rFonts w:ascii="Calibri Light" w:eastAsia="Cambria" w:hAnsi="Calibri Light" w:cs="Calibri Light"/>
-          <w:bCs/>
-          <w:sz w:val="19"/>
-          <w:szCs w:val="19"/>
+          <w:sz w:val="20"/>
+          <w:szCs w:val="20"/>
+        </w:rPr>
+        <w:t xml:space="preserve"> }</w:t>
+      </w:r>
+      <w:proofErr w:type="gramEnd"/>
+      <w:r>
+        <w:rPr>
+          <w:rFonts w:ascii="Calibri Light" w:eastAsia="Cambria" w:hAnsi="Calibri Light" w:cs="Calibri Light"/>
+          <w:bCs/>
+          <w:sz w:val="20"/>
+          <w:szCs w:val="20"/>
+        </w:rPr>
+        <w:t xml:space="preserve">} </w:t>
+      </w:r>
+      <w:r>
+        <w:rPr>
+          <w:rFonts w:ascii="Calibri Light" w:eastAsia="Cambria" w:hAnsi="Calibri Light" w:cs="Calibri Light"/>
+          <w:bCs/>
+          <w:sz w:val="20"/>
+          <w:szCs w:val="20"/>
         </w:rPr>
         <w:br/>
+      </w:r>
+      <w:proofErr w:type="gramStart"/>
+      <w:r>
+        <w:rPr>
+          <w:rFonts w:ascii="Calibri Light" w:eastAsia="Cambria" w:hAnsi="Calibri Light" w:cs="Calibri Light"/>
+          <w:bCs/>
+          <w:sz w:val="20"/>
+          <w:szCs w:val="20"/>
+        </w:rPr>
         <w:t xml:space="preserve">{{ </w:t>
       </w:r>
       <w:proofErr w:type="spellStart"/>
@@ -120,38 +207,88 @@
         <w:rPr>
           <w:rFonts w:ascii="Calibri Light" w:eastAsia="Cambria" w:hAnsi="Calibri Light" w:cs="Calibri Light"/>
           <w:bCs/>
-          <w:sz w:val="19"/>
-          <w:szCs w:val="19"/>
-        </w:rPr>
-        <w:t>company_city</w:t>
+          <w:sz w:val="20"/>
+          <w:szCs w:val="20"/>
+        </w:rPr>
+        <w:t>company</w:t>
+      </w:r>
+      <w:proofErr w:type="gramEnd"/>
+      <w:r>
+        <w:rPr>
+          <w:rFonts w:ascii="Calibri Light" w:eastAsia="Cambria" w:hAnsi="Calibri Light" w:cs="Calibri Light"/>
+          <w:bCs/>
+          <w:sz w:val="20"/>
+          <w:szCs w:val="20"/>
+        </w:rPr>
+        <w:t>_</w:t>
+      </w:r>
+      <w:proofErr w:type="gramStart"/>
+      <w:r>
+        <w:rPr>
+          <w:rFonts w:ascii="Calibri Light" w:eastAsia="Cambria" w:hAnsi="Calibri Light" w:cs="Calibri Light"/>
+          <w:bCs/>
+          <w:sz w:val="20"/>
+          <w:szCs w:val="20"/>
+        </w:rPr>
+        <w:t>city</w:t>
       </w:r>
       <w:proofErr w:type="spellEnd"/>
       <w:r>
         <w:rPr>
           <w:rFonts w:ascii="Calibri Light" w:eastAsia="Cambria" w:hAnsi="Calibri Light" w:cs="Calibri Light"/>
           <w:bCs/>
-          <w:sz w:val="19"/>
-          <w:szCs w:val="19"/>
-        </w:rPr>
-        <w:t xml:space="preserve"> }}, {{ </w:t>
+          <w:sz w:val="20"/>
+          <w:szCs w:val="20"/>
+        </w:rPr>
+        <w:t xml:space="preserve"> }</w:t>
+      </w:r>
+      <w:proofErr w:type="gramEnd"/>
+      <w:r>
+        <w:rPr>
+          <w:rFonts w:ascii="Calibri Light" w:eastAsia="Cambria" w:hAnsi="Calibri Light" w:cs="Calibri Light"/>
+          <w:bCs/>
+          <w:sz w:val="20"/>
+          <w:szCs w:val="20"/>
+        </w:rPr>
+        <w:t xml:space="preserve">}, </w:t>
+      </w:r>
+      <w:proofErr w:type="gramStart"/>
+      <w:r>
+        <w:rPr>
+          <w:rFonts w:ascii="Calibri Light" w:eastAsia="Cambria" w:hAnsi="Calibri Light" w:cs="Calibri Light"/>
+          <w:bCs/>
+          <w:sz w:val="20"/>
+          <w:szCs w:val="20"/>
+        </w:rPr>
+        <w:t xml:space="preserve">{{ </w:t>
       </w:r>
       <w:proofErr w:type="spellStart"/>
       <w:r>
         <w:rPr>
           <w:rFonts w:ascii="Calibri Light" w:eastAsia="Cambria" w:hAnsi="Calibri Light" w:cs="Calibri Light"/>
           <w:bCs/>
-          <w:sz w:val="19"/>
-          <w:szCs w:val="19"/>
-        </w:rPr>
-        <w:t>company_province</w:t>
+          <w:sz w:val="20"/>
+          <w:szCs w:val="20"/>
+        </w:rPr>
+        <w:t>company</w:t>
+      </w:r>
+      <w:proofErr w:type="gramEnd"/>
+      <w:r>
+        <w:rPr>
+          <w:rFonts w:ascii="Calibri Light" w:eastAsia="Cambria" w:hAnsi="Calibri Light" w:cs="Calibri Light"/>
+          <w:bCs/>
+          <w:sz w:val="20"/>
+          <w:szCs w:val="20"/>
+        </w:rPr>
+        <w:t>_province</w:t>
       </w:r>
       <w:proofErr w:type="spellEnd"/>
       <w:r>
         <w:rPr>
           <w:rFonts w:ascii="Calibri Light" w:eastAsia="Cambria" w:hAnsi="Calibri Light" w:cs="Calibri Light"/>
           <w:bCs/>
-          <w:sz w:val="19"/>
-          <w:szCs w:val="19"/>
+          <w:sz w:val="20"/>
+          <w:szCs w:val="20"/>
         </w:rPr>
         <w:t xml:space="preserve"> }}</w:t>
       </w:r>
@@ -159,10 +296,19 @@
         <w:rPr>
           <w:rFonts w:ascii="Calibri Light" w:eastAsia="Cambria" w:hAnsi="Calibri Light" w:cs="Calibri Light"/>
           <w:bCs/>
-          <w:sz w:val="19"/>
-          <w:szCs w:val="19"/>
+          <w:sz w:val="20"/>
+          <w:szCs w:val="20"/>
         </w:rPr>
         <w:br/>
+      </w:r>
+      <w:proofErr w:type="gramStart"/>
+      <w:r>
+        <w:rPr>
+          <w:rFonts w:ascii="Calibri Light" w:eastAsia="Cambria" w:hAnsi="Calibri Light" w:cs="Calibri Light"/>
+          <w:bCs/>
+          <w:sz w:val="20"/>
+          <w:szCs w:val="20"/>
+        </w:rPr>
         <w:t xml:space="preserve">{{ </w:t>
       </w:r>
       <w:proofErr w:type="spellStart"/>
@@ -170,43 +316,74 @@
         <w:rPr>
           <w:rFonts w:ascii="Calibri Light" w:eastAsia="Cambria" w:hAnsi="Calibri Light" w:cs="Calibri Light"/>
           <w:bCs/>
-          <w:sz w:val="19"/>
-          <w:szCs w:val="19"/>
-        </w:rPr>
-        <w:t>company_postal</w:t>
+          <w:sz w:val="20"/>
+          <w:szCs w:val="20"/>
+        </w:rPr>
+        <w:t>company</w:t>
+      </w:r>
+      <w:proofErr w:type="gramEnd"/>
+      <w:r>
+        <w:rPr>
+          <w:rFonts w:ascii="Calibri Light" w:eastAsia="Cambria" w:hAnsi="Calibri Light" w:cs="Calibri Light"/>
+          <w:bCs/>
+          <w:sz w:val="20"/>
+          <w:szCs w:val="20"/>
+        </w:rPr>
+        <w:t>_</w:t>
+      </w:r>
+      <w:proofErr w:type="gramStart"/>
+      <w:r>
+        <w:rPr>
+          <w:rFonts w:ascii="Calibri Light" w:eastAsia="Cambria" w:hAnsi="Calibri Light" w:cs="Calibri Light"/>
+          <w:bCs/>
+          <w:sz w:val="20"/>
+          <w:szCs w:val="20"/>
+        </w:rPr>
+        <w:t>postal</w:t>
       </w:r>
       <w:proofErr w:type="spellEnd"/>
       <w:r>
         <w:rPr>
           <w:rFonts w:ascii="Calibri Light" w:eastAsia="Cambria" w:hAnsi="Calibri Light" w:cs="Calibri Light"/>
           <w:bCs/>
-          <w:sz w:val="19"/>
-          <w:szCs w:val="19"/>
-        </w:rPr>
-        <w:t xml:space="preserve"> }}</w:t>
+          <w:sz w:val="20"/>
+          <w:szCs w:val="20"/>
+        </w:rPr>
+        <w:t xml:space="preserve"> }</w:t>
+      </w:r>
+      <w:proofErr w:type="gramEnd"/>
+      <w:r>
+        <w:rPr>
+          <w:rFonts w:ascii="Calibri Light" w:eastAsia="Cambria" w:hAnsi="Calibri Light" w:cs="Calibri Light"/>
+          <w:bCs/>
+          <w:sz w:val="20"/>
+          <w:szCs w:val="20"/>
+        </w:rPr>
+        <w:t>}</w:t>
       </w:r>
     </w:p>
     <w:p>
       <w:pPr>
         <w:rPr>
           <w:rFonts w:ascii="Calibri Light" w:hAnsi="Calibri Light" w:cs="Calibri Light"/>
-          <w:sz w:val="19"/>
-          <w:szCs w:val="19"/>
+          <w:sz w:val="20"/>
+          <w:szCs w:val="20"/>
         </w:rPr>
       </w:pPr>
       <w:r>
         <w:rPr>
           <w:rFonts w:ascii="Calibri Light" w:hAnsi="Calibri Light" w:cs="Calibri Light"/>
-          <w:sz w:val="19"/>
-          <w:szCs w:val="19"/>
+          <w:sz w:val="20"/>
+          <w:szCs w:val="20"/>
         </w:rPr>
         <w:t xml:space="preserve">Dear </w:t>
       </w:r>
-      <w:r>
-        <w:rPr>
-          <w:rFonts w:ascii="Calibri Light" w:hAnsi="Calibri Light" w:cs="Calibri Light"/>
-          <w:sz w:val="19"/>
-          <w:szCs w:val="19"/>
+      <w:proofErr w:type="gramStart"/>
+      <w:r>
+        <w:rPr>
+          <w:rFonts w:ascii="Calibri Light" w:hAnsi="Calibri Light" w:cs="Calibri Light"/>
+          <w:sz w:val="20"/>
+          <w:szCs w:val="20"/>
         </w:rPr>
         <w:t xml:space="preserve">{{ </w:t>
       </w:r>
@@ -214,25 +391,52 @@
       <w:r>
         <w:rPr>
           <w:rFonts w:ascii="Calibri Light" w:hAnsi="Calibri Light" w:cs="Calibri Light"/>
-          <w:sz w:val="19"/>
-          <w:szCs w:val="19"/>
-        </w:rPr>
-        <w:t>letter_addressee</w:t>
+          <w:sz w:val="20"/>
+          <w:szCs w:val="20"/>
+        </w:rPr>
+        <w:t>letter</w:t>
+      </w:r>
+      <w:proofErr w:type="gramEnd"/>
+      <w:r>
+        <w:rPr>
+          <w:rFonts w:ascii="Calibri Light" w:hAnsi="Calibri Light" w:cs="Calibri Light"/>
+          <w:sz w:val="20"/>
+          <w:szCs w:val="20"/>
+        </w:rPr>
+        <w:t>_</w:t>
+      </w:r>
+      <w:proofErr w:type="gramStart"/>
+      <w:r>
+        <w:rPr>
+          <w:rFonts w:ascii="Calibri Light" w:hAnsi="Calibri Light" w:cs="Calibri Light"/>
+          <w:sz w:val="20"/>
+          <w:szCs w:val="20"/>
+        </w:rPr>
+        <w:t>addressee</w:t>
       </w:r>
       <w:proofErr w:type="spellEnd"/>
       <w:r>
         <w:rPr>
           <w:rFonts w:ascii="Calibri Light" w:hAnsi="Calibri Light" w:cs="Calibri Light"/>
-          <w:sz w:val="19"/>
-          <w:szCs w:val="19"/>
-        </w:rPr>
-        <w:t xml:space="preserve"> }}</w:t>
-      </w:r>
-      <w:r>
-        <w:rPr>
-          <w:rFonts w:ascii="Calibri Light" w:hAnsi="Calibri Light" w:cs="Calibri Light"/>
-          <w:sz w:val="19"/>
-          <w:szCs w:val="19"/>
+          <w:sz w:val="20"/>
+          <w:szCs w:val="20"/>
+        </w:rPr>
+        <w:t xml:space="preserve"> }</w:t>
+      </w:r>
+      <w:proofErr w:type="gramEnd"/>
+      <w:r>
+        <w:rPr>
+          <w:rFonts w:ascii="Calibri Light" w:hAnsi="Calibri Light" w:cs="Calibri Light"/>
+          <w:sz w:val="20"/>
+          <w:szCs w:val="20"/>
+        </w:rPr>
+        <w:t>}</w:t>
+      </w:r>
+      <w:r>
+        <w:rPr>
+          <w:rFonts w:ascii="Calibri Light" w:hAnsi="Calibri Light" w:cs="Calibri Light"/>
+          <w:sz w:val="20"/>
+          <w:szCs w:val="20"/>
         </w:rPr>
         <w:t>,</w:t>
       </w:r>
@@ -242,31 +446,32 @@
         <w:jc w:val="both"/>
         <w:rPr>
           <w:rFonts w:ascii="Calibri Light" w:hAnsi="Calibri Light" w:cs="Calibri Light"/>
-          <w:sz w:val="19"/>
-          <w:szCs w:val="19"/>
+          <w:sz w:val="20"/>
+          <w:szCs w:val="20"/>
         </w:rPr>
       </w:pPr>
       <w:r>
         <w:rPr>
           <w:rFonts w:ascii="Calibri Light" w:hAnsi="Calibri Light" w:cs="Calibri Light"/>
-          <w:sz w:val="19"/>
-          <w:szCs w:val="19"/>
+          <w:sz w:val="20"/>
+          <w:szCs w:val="20"/>
         </w:rPr>
         <w:t xml:space="preserve">As a previous healthcare professional who hopes to leverage my current programming knowledge with bioinformatics to improve healthcare quality, I am writing to express my keen interest </w:t>
       </w:r>
       <w:r>
         <w:rPr>
           <w:rFonts w:ascii="Calibri Light" w:hAnsi="Calibri Light" w:cs="Calibri Light"/>
-          <w:sz w:val="19"/>
-          <w:szCs w:val="19"/>
+          <w:sz w:val="20"/>
+          <w:szCs w:val="20"/>
         </w:rPr>
         <w:t xml:space="preserve">for the </w:t>
       </w:r>
-      <w:r>
-        <w:rPr>
-          <w:rFonts w:ascii="Calibri Light" w:hAnsi="Calibri Light" w:cs="Calibri Light"/>
-          <w:sz w:val="19"/>
-          <w:szCs w:val="19"/>
+      <w:proofErr w:type="gramStart"/>
+      <w:r>
+        <w:rPr>
+          <w:rFonts w:ascii="Calibri Light" w:hAnsi="Calibri Light" w:cs="Calibri Light"/>
+          <w:sz w:val="20"/>
+          <w:szCs w:val="20"/>
         </w:rPr>
         <w:t xml:space="preserve">{{ </w:t>
       </w:r>
@@ -274,49 +479,77 @@
       <w:r>
         <w:rPr>
           <w:rFonts w:ascii="Calibri Light" w:hAnsi="Calibri Light" w:cs="Calibri Light"/>
-          <w:sz w:val="19"/>
-          <w:szCs w:val="19"/>
-        </w:rPr>
-        <w:t>position_name</w:t>
+          <w:sz w:val="20"/>
+          <w:szCs w:val="20"/>
+        </w:rPr>
+        <w:t>position</w:t>
+      </w:r>
+      <w:proofErr w:type="gramEnd"/>
+      <w:r>
+        <w:rPr>
+          <w:rFonts w:ascii="Calibri Light" w:hAnsi="Calibri Light" w:cs="Calibri Light"/>
+          <w:sz w:val="20"/>
+          <w:szCs w:val="20"/>
+        </w:rPr>
+        <w:t>_</w:t>
+      </w:r>
+      <w:proofErr w:type="gramStart"/>
+      <w:r>
+        <w:rPr>
+          <w:rFonts w:ascii="Calibri Light" w:hAnsi="Calibri Light" w:cs="Calibri Light"/>
+          <w:sz w:val="20"/>
+          <w:szCs w:val="20"/>
+        </w:rPr>
+        <w:t>name</w:t>
       </w:r>
       <w:proofErr w:type="spellEnd"/>
       <w:r>
         <w:rPr>
           <w:rFonts w:ascii="Calibri Light" w:hAnsi="Calibri Light" w:cs="Calibri Light"/>
-          <w:sz w:val="19"/>
-          <w:szCs w:val="19"/>
-        </w:rPr>
-        <w:t xml:space="preserve"> }}</w:t>
-      </w:r>
-      <w:r>
-        <w:rPr>
-          <w:rFonts w:ascii="Calibri Light" w:hAnsi="Calibri Light" w:cs="Calibri Light"/>
-          <w:sz w:val="19"/>
-          <w:szCs w:val="19"/>
+          <w:sz w:val="20"/>
+          <w:szCs w:val="20"/>
+        </w:rPr>
+        <w:t xml:space="preserve"> }</w:t>
+      </w:r>
+      <w:proofErr w:type="gramEnd"/>
+      <w:r>
+        <w:rPr>
+          <w:rFonts w:ascii="Calibri Light" w:hAnsi="Calibri Light" w:cs="Calibri Light"/>
+          <w:sz w:val="20"/>
+          <w:szCs w:val="20"/>
+        </w:rPr>
+        <w:t>}</w:t>
+      </w:r>
+      <w:r>
+        <w:rPr>
+          <w:rFonts w:ascii="Calibri Light" w:hAnsi="Calibri Light" w:cs="Calibri Light"/>
+          <w:sz w:val="20"/>
+          <w:szCs w:val="20"/>
         </w:rPr>
         <w:t xml:space="preserve"> </w:t>
       </w:r>
       <w:r>
         <w:rPr>
           <w:rFonts w:ascii="Calibri Light" w:hAnsi="Calibri Light" w:cs="Calibri Light"/>
-          <w:sz w:val="19"/>
-          <w:szCs w:val="19"/>
+          <w:sz w:val="20"/>
+          <w:szCs w:val="20"/>
         </w:rPr>
         <w:t xml:space="preserve">role </w:t>
       </w:r>
       <w:r>
         <w:rPr>
           <w:rFonts w:ascii="Calibri Light" w:hAnsi="Calibri Light" w:cs="Calibri Light"/>
-          <w:sz w:val="19"/>
-          <w:szCs w:val="19"/>
+          <w:sz w:val="20"/>
+          <w:szCs w:val="20"/>
         </w:rPr>
         <w:t xml:space="preserve">with </w:t>
       </w:r>
-      <w:r>
-        <w:rPr>
-          <w:rFonts w:ascii="Calibri Light" w:hAnsi="Calibri Light" w:cs="Calibri Light"/>
-          <w:sz w:val="19"/>
-          <w:szCs w:val="19"/>
+      <w:proofErr w:type="gramStart"/>
+      <w:r>
+        <w:rPr>
+          <w:rFonts w:ascii="Calibri Light" w:hAnsi="Calibri Light" w:cs="Calibri Light"/>
+          <w:sz w:val="20"/>
+          <w:szCs w:val="20"/>
         </w:rPr>
         <w:t xml:space="preserve">{{ </w:t>
       </w:r>
@@ -324,153 +557,204 @@
       <w:r>
         <w:rPr>
           <w:rFonts w:ascii="Calibri Light" w:hAnsi="Calibri Light" w:cs="Calibri Light"/>
-          <w:sz w:val="19"/>
-          <w:szCs w:val="19"/>
-        </w:rPr>
-        <w:t>company_name</w:t>
+          <w:sz w:val="20"/>
+          <w:szCs w:val="20"/>
+        </w:rPr>
+        <w:t>company</w:t>
+      </w:r>
+      <w:proofErr w:type="gramEnd"/>
+      <w:r>
+        <w:rPr>
+          <w:rFonts w:ascii="Calibri Light" w:hAnsi="Calibri Light" w:cs="Calibri Light"/>
+          <w:sz w:val="20"/>
+          <w:szCs w:val="20"/>
+        </w:rPr>
+        <w:t>_</w:t>
+      </w:r>
+      <w:proofErr w:type="gramStart"/>
+      <w:r>
+        <w:rPr>
+          <w:rFonts w:ascii="Calibri Light" w:hAnsi="Calibri Light" w:cs="Calibri Light"/>
+          <w:sz w:val="20"/>
+          <w:szCs w:val="20"/>
+        </w:rPr>
+        <w:t>name</w:t>
       </w:r>
       <w:proofErr w:type="spellEnd"/>
       <w:r>
         <w:rPr>
           <w:rFonts w:ascii="Calibri Light" w:hAnsi="Calibri Light" w:cs="Calibri Light"/>
-          <w:sz w:val="19"/>
-          <w:szCs w:val="19"/>
-        </w:rPr>
-        <w:t xml:space="preserve"> }}</w:t>
-      </w:r>
-      <w:r>
-        <w:rPr>
-          <w:rFonts w:ascii="Calibri Light" w:hAnsi="Calibri Light" w:cs="Calibri Light"/>
-          <w:sz w:val="19"/>
-          <w:szCs w:val="19"/>
+          <w:sz w:val="20"/>
+          <w:szCs w:val="20"/>
+        </w:rPr>
+        <w:t xml:space="preserve"> }</w:t>
+      </w:r>
+      <w:proofErr w:type="gramEnd"/>
+      <w:r>
+        <w:rPr>
+          <w:rFonts w:ascii="Calibri Light" w:hAnsi="Calibri Light" w:cs="Calibri Light"/>
+          <w:sz w:val="20"/>
+          <w:szCs w:val="20"/>
+        </w:rPr>
+        <w:t>}</w:t>
+      </w:r>
+      <w:r>
+        <w:rPr>
+          <w:rFonts w:ascii="Calibri Light" w:hAnsi="Calibri Light" w:cs="Calibri Light"/>
+          <w:sz w:val="20"/>
+          <w:szCs w:val="20"/>
         </w:rPr>
         <w:t xml:space="preserve">. </w:t>
       </w:r>
       <w:r>
         <w:rPr>
           <w:rFonts w:ascii="Calibri Light" w:hAnsi="Calibri Light" w:cs="Calibri Light"/>
-          <w:sz w:val="19"/>
-          <w:szCs w:val="19"/>
+          <w:sz w:val="20"/>
+          <w:szCs w:val="20"/>
         </w:rPr>
         <w:t>With a foundational background in genetics</w:t>
       </w:r>
       <w:r>
         <w:rPr>
           <w:rFonts w:ascii="Calibri Light" w:hAnsi="Calibri Light" w:cs="Calibri Light"/>
-          <w:sz w:val="19"/>
-          <w:szCs w:val="19"/>
-        </w:rPr>
-        <w:t>, I was left highly impressed by your laboratory’s work and have been yearning for an opportunity to improve patient care</w:t>
-      </w:r>
-      <w:r>
-        <w:rPr>
-          <w:rFonts w:ascii="Calibri Light" w:hAnsi="Calibri Light" w:cs="Calibri Light"/>
-          <w:sz w:val="19"/>
-          <w:szCs w:val="19"/>
+          <w:sz w:val="20"/>
+          <w:szCs w:val="20"/>
+        </w:rPr>
+        <w:t>, I was lef</w:t>
+      </w:r>
+      <w:r>
+        <w:rPr>
+          <w:rFonts w:ascii="Calibri Light" w:hAnsi="Calibri Light" w:cs="Calibri Light"/>
+          <w:sz w:val="20"/>
+          <w:szCs w:val="20"/>
+        </w:rPr>
+        <w:t>t</w:t>
+      </w:r>
+      <w:r>
+        <w:rPr>
+          <w:rFonts w:ascii="Calibri Light" w:hAnsi="Calibri Light" w:cs="Calibri Light"/>
+          <w:sz w:val="20"/>
+          <w:szCs w:val="20"/>
+        </w:rPr>
+        <w:t xml:space="preserve"> impressed by your </w:t>
+      </w:r>
+      <w:r>
+        <w:rPr>
+          <w:rFonts w:ascii="Calibri Light" w:hAnsi="Calibri Light" w:cs="Calibri Light"/>
+          <w:sz w:val="20"/>
+          <w:szCs w:val="20"/>
+        </w:rPr>
+        <w:t>organizations’</w:t>
+      </w:r>
+      <w:r>
+        <w:rPr>
+          <w:rFonts w:ascii="Calibri Light" w:hAnsi="Calibri Light" w:cs="Calibri Light"/>
+          <w:sz w:val="20"/>
+          <w:szCs w:val="20"/>
+        </w:rPr>
+        <w:t xml:space="preserve"> work and have been yearning for an opportunity to improve patient care</w:t>
+      </w:r>
+      <w:r>
+        <w:rPr>
+          <w:rFonts w:ascii="Calibri Light" w:hAnsi="Calibri Light" w:cs="Calibri Light"/>
+          <w:sz w:val="20"/>
+          <w:szCs w:val="20"/>
         </w:rPr>
         <w:t xml:space="preserve"> from a technological perspective</w:t>
       </w:r>
       <w:r>
         <w:rPr>
           <w:rFonts w:ascii="Calibri Light" w:hAnsi="Calibri Light" w:cs="Calibri Light"/>
-          <w:sz w:val="19"/>
-          <w:szCs w:val="19"/>
+          <w:sz w:val="20"/>
+          <w:szCs w:val="20"/>
         </w:rPr>
         <w:t xml:space="preserve">. </w:t>
       </w:r>
       <w:r>
         <w:rPr>
           <w:rFonts w:ascii="Calibri Light" w:hAnsi="Calibri Light" w:cs="Calibri Light"/>
-          <w:sz w:val="19"/>
-          <w:szCs w:val="19"/>
+          <w:sz w:val="20"/>
+          <w:szCs w:val="20"/>
         </w:rPr>
         <w:t>Combined w</w:t>
       </w:r>
       <w:r>
         <w:rPr>
           <w:rFonts w:ascii="Calibri Light" w:hAnsi="Calibri Light" w:cs="Calibri Light"/>
-          <w:sz w:val="19"/>
-          <w:szCs w:val="19"/>
-        </w:rPr>
-        <w:t xml:space="preserve">ith my current skillset </w:t>
-      </w:r>
-      <w:r>
-        <w:rPr>
-          <w:rFonts w:ascii="Calibri Light" w:hAnsi="Calibri Light" w:cs="Calibri Light"/>
-          <w:sz w:val="19"/>
-          <w:szCs w:val="19"/>
-        </w:rPr>
-        <w:t>in</w:t>
-      </w:r>
-      <w:r>
-        <w:rPr>
-          <w:rFonts w:ascii="Calibri Light" w:hAnsi="Calibri Light" w:cs="Calibri Light"/>
-          <w:sz w:val="19"/>
-          <w:szCs w:val="19"/>
-        </w:rPr>
-        <w:t xml:space="preserve"> object-oriented programming</w:t>
-      </w:r>
-      <w:r>
-        <w:rPr>
-          <w:rFonts w:ascii="Calibri Light" w:hAnsi="Calibri Light" w:cs="Calibri Light"/>
-          <w:sz w:val="19"/>
-          <w:szCs w:val="19"/>
+          <w:sz w:val="20"/>
+          <w:szCs w:val="20"/>
+        </w:rPr>
+        <w:t xml:space="preserve">ith my current </w:t>
+      </w:r>
+      <w:r>
+        <w:rPr>
+          <w:rFonts w:ascii="Calibri Light" w:hAnsi="Calibri Light" w:cs="Calibri Light"/>
+          <w:sz w:val="20"/>
+          <w:szCs w:val="20"/>
+        </w:rPr>
+        <w:t>technical skillset</w:t>
+      </w:r>
+      <w:r>
+        <w:rPr>
+          <w:rFonts w:ascii="Calibri Light" w:hAnsi="Calibri Light" w:cs="Calibri Light"/>
+          <w:sz w:val="20"/>
+          <w:szCs w:val="20"/>
         </w:rPr>
         <w:t xml:space="preserve"> and</w:t>
       </w:r>
       <w:r>
         <w:rPr>
           <w:rFonts w:ascii="Calibri Light" w:hAnsi="Calibri Light" w:cs="Calibri Light"/>
-          <w:sz w:val="19"/>
-          <w:szCs w:val="19"/>
+          <w:sz w:val="20"/>
+          <w:szCs w:val="20"/>
         </w:rPr>
         <w:t xml:space="preserve"> nearly </w:t>
       </w:r>
       <w:r>
         <w:rPr>
           <w:rFonts w:ascii="Calibri Light" w:hAnsi="Calibri Light" w:cs="Calibri Light"/>
-          <w:sz w:val="19"/>
-          <w:szCs w:val="19"/>
+          <w:sz w:val="20"/>
+          <w:szCs w:val="20"/>
         </w:rPr>
         <w:t>3</w:t>
       </w:r>
       <w:r>
         <w:rPr>
           <w:rFonts w:ascii="Calibri Light" w:hAnsi="Calibri Light" w:cs="Calibri Light"/>
-          <w:sz w:val="19"/>
-          <w:szCs w:val="19"/>
+          <w:sz w:val="20"/>
+          <w:szCs w:val="20"/>
         </w:rPr>
         <w:t xml:space="preserve"> years of laboratory-based operations</w:t>
       </w:r>
       <w:r>
         <w:rPr>
           <w:rFonts w:ascii="Calibri Light" w:hAnsi="Calibri Light" w:cs="Calibri Light"/>
-          <w:sz w:val="19"/>
-          <w:szCs w:val="19"/>
+          <w:sz w:val="20"/>
+          <w:szCs w:val="20"/>
         </w:rPr>
         <w:t xml:space="preserve">, </w:t>
       </w:r>
       <w:r>
         <w:rPr>
           <w:rFonts w:ascii="Calibri Light" w:hAnsi="Calibri Light" w:cs="Calibri Light"/>
-          <w:sz w:val="19"/>
-          <w:szCs w:val="19"/>
+          <w:sz w:val="20"/>
+          <w:szCs w:val="20"/>
         </w:rPr>
         <w:t xml:space="preserve">I believe I have the skills, expertise </w:t>
       </w:r>
       <w:r>
         <w:rPr>
           <w:rFonts w:ascii="Calibri Light" w:hAnsi="Calibri Light" w:cs="Calibri Light"/>
-          <w:sz w:val="19"/>
-          <w:szCs w:val="19"/>
+          <w:sz w:val="20"/>
+          <w:szCs w:val="20"/>
         </w:rPr>
         <w:t>an</w:t>
       </w:r>
       <w:r>
         <w:rPr>
           <w:rFonts w:ascii="Calibri Light" w:hAnsi="Calibri Light" w:cs="Calibri Light"/>
-          <w:sz w:val="19"/>
-          <w:szCs w:val="19"/>
+          <w:sz w:val="20"/>
+          <w:szCs w:val="20"/>
         </w:rPr>
         <w:t>d enthusiasm to contribute to your laboratory’s success.</w:t>
       </w:r>
@@ -480,183 +764,241 @@
         <w:jc w:val="both"/>
         <w:rPr>
           <w:rFonts w:ascii="Calibri Light" w:hAnsi="Calibri Light" w:cs="Calibri Light"/>
-          <w:sz w:val="19"/>
-          <w:szCs w:val="19"/>
+          <w:sz w:val="20"/>
+          <w:szCs w:val="20"/>
         </w:rPr>
       </w:pPr>
       <w:r>
         <w:rPr>
           <w:rFonts w:ascii="Calibri Light" w:hAnsi="Calibri Light" w:cs="Calibri Light"/>
-          <w:sz w:val="19"/>
-          <w:szCs w:val="19"/>
-        </w:rPr>
-        <w:t>In my previous role as a clinical genetics technologist, I gained incredibly valuable experience with the Genome Diagnostics team with the Provincial Health Services Authority.</w:t>
-      </w:r>
-      <w:r>
-        <w:rPr>
-          <w:rFonts w:ascii="Calibri Light" w:hAnsi="Calibri Light" w:cs="Calibri Light"/>
-          <w:sz w:val="19"/>
-          <w:szCs w:val="19"/>
-        </w:rPr>
-        <w:t xml:space="preserve"> I supported diagnostics workflows, including specimen accessioning to result reporting.</w:t>
-      </w:r>
-      <w:r>
-        <w:rPr>
-          <w:rFonts w:ascii="Calibri Light" w:hAnsi="Calibri Light" w:cs="Calibri Light"/>
-          <w:sz w:val="19"/>
-          <w:szCs w:val="19"/>
+          <w:sz w:val="20"/>
+          <w:szCs w:val="20"/>
+        </w:rPr>
+        <w:t xml:space="preserve">In my previous role as a clinical </w:t>
+      </w:r>
+      <w:proofErr w:type="gramStart"/>
+      <w:r>
+        <w:rPr>
+          <w:rFonts w:ascii="Calibri Light" w:hAnsi="Calibri Light" w:cs="Calibri Light"/>
+          <w:sz w:val="20"/>
+          <w:szCs w:val="20"/>
+        </w:rPr>
+        <w:t>genetics</w:t>
+      </w:r>
+      <w:proofErr w:type="gramEnd"/>
+      <w:r>
+        <w:rPr>
+          <w:rFonts w:ascii="Calibri Light" w:hAnsi="Calibri Light" w:cs="Calibri Light"/>
+          <w:sz w:val="20"/>
+          <w:szCs w:val="20"/>
+        </w:rPr>
+        <w:t xml:space="preserve"> technologist, I gained valuable experience with the Genome Diagnostics team with the Provincial Health Services Authority.</w:t>
+      </w:r>
+      <w:r>
+        <w:rPr>
+          <w:rFonts w:ascii="Calibri Light" w:hAnsi="Calibri Light" w:cs="Calibri Light"/>
+          <w:sz w:val="20"/>
+          <w:szCs w:val="20"/>
+        </w:rPr>
+        <w:t xml:space="preserve"> I supported diagnostics workflows</w:t>
+      </w:r>
+      <w:r>
+        <w:rPr>
+          <w:rFonts w:ascii="Calibri Light" w:hAnsi="Calibri Light" w:cs="Calibri Light"/>
+          <w:sz w:val="20"/>
+          <w:szCs w:val="20"/>
+        </w:rPr>
+        <w:t xml:space="preserve"> and</w:t>
+      </w:r>
+      <w:r>
+        <w:rPr>
+          <w:rFonts w:ascii="Calibri Light" w:hAnsi="Calibri Light" w:cs="Calibri Light"/>
+          <w:sz w:val="20"/>
+          <w:szCs w:val="20"/>
+        </w:rPr>
+        <w:t xml:space="preserve"> gained hands-on experience using specialized </w:t>
+      </w:r>
+      <w:r>
+        <w:rPr>
+          <w:rFonts w:ascii="Calibri Light" w:hAnsi="Calibri Light" w:cs="Calibri Light"/>
+          <w:sz w:val="20"/>
+          <w:szCs w:val="20"/>
+        </w:rPr>
+        <w:t xml:space="preserve">software, including </w:t>
+      </w:r>
+      <w:proofErr w:type="spellStart"/>
+      <w:r>
+        <w:rPr>
+          <w:rFonts w:ascii="Calibri Light" w:hAnsi="Calibri Light" w:cs="Calibri Light"/>
+          <w:sz w:val="20"/>
+          <w:szCs w:val="20"/>
+        </w:rPr>
+        <w:t>CytoVision</w:t>
+      </w:r>
+      <w:proofErr w:type="spellEnd"/>
+      <w:r>
+        <w:rPr>
+          <w:rFonts w:ascii="Calibri Light" w:hAnsi="Calibri Light" w:cs="Calibri Light"/>
+          <w:sz w:val="20"/>
+          <w:szCs w:val="20"/>
+        </w:rPr>
+        <w:t xml:space="preserve">, </w:t>
+      </w:r>
+      <w:proofErr w:type="spellStart"/>
+      <w:r>
+        <w:rPr>
+          <w:rFonts w:ascii="Calibri Light" w:hAnsi="Calibri Light" w:cs="Calibri Light"/>
+          <w:sz w:val="20"/>
+          <w:szCs w:val="20"/>
+        </w:rPr>
+        <w:t>SeqPilot</w:t>
+      </w:r>
+      <w:proofErr w:type="spellEnd"/>
+      <w:r>
+        <w:rPr>
+          <w:rFonts w:ascii="Calibri Light" w:hAnsi="Calibri Light" w:cs="Calibri Light"/>
+          <w:sz w:val="20"/>
+          <w:szCs w:val="20"/>
         </w:rPr>
         <w:t xml:space="preserve"> </w:t>
       </w:r>
       <w:r>
         <w:rPr>
           <w:rFonts w:ascii="Calibri Light" w:hAnsi="Calibri Light" w:cs="Calibri Light"/>
-          <w:sz w:val="19"/>
-          <w:szCs w:val="19"/>
-        </w:rPr>
-        <w:t xml:space="preserve"> I gained hands-on experience using specialized </w:t>
-      </w:r>
-      <w:r>
-        <w:rPr>
-          <w:rFonts w:ascii="Calibri Light" w:hAnsi="Calibri Light" w:cs="Calibri Light"/>
-          <w:sz w:val="19"/>
-          <w:szCs w:val="19"/>
-        </w:rPr>
-        <w:t xml:space="preserve">software, including </w:t>
+          <w:sz w:val="20"/>
+          <w:szCs w:val="20"/>
+        </w:rPr>
+        <w:t xml:space="preserve">and </w:t>
       </w:r>
       <w:proofErr w:type="spellStart"/>
       <w:r>
         <w:rPr>
           <w:rFonts w:ascii="Calibri Light" w:hAnsi="Calibri Light" w:cs="Calibri Light"/>
-          <w:sz w:val="19"/>
-          <w:szCs w:val="19"/>
-        </w:rPr>
-        <w:t>CytoVision</w:t>
+          <w:sz w:val="20"/>
+          <w:szCs w:val="20"/>
+        </w:rPr>
+        <w:t>GeneMapper</w:t>
       </w:r>
       <w:proofErr w:type="spellEnd"/>
       <w:r>
         <w:rPr>
           <w:rFonts w:ascii="Calibri Light" w:hAnsi="Calibri Light" w:cs="Calibri Light"/>
-          <w:sz w:val="19"/>
-          <w:szCs w:val="19"/>
-        </w:rPr>
-        <w:t xml:space="preserve">, </w:t>
-      </w:r>
-      <w:proofErr w:type="spellStart"/>
-      <w:r>
-        <w:rPr>
-          <w:rFonts w:ascii="Calibri Light" w:hAnsi="Calibri Light" w:cs="Calibri Light"/>
-          <w:sz w:val="19"/>
-          <w:szCs w:val="19"/>
-        </w:rPr>
-        <w:t>SeqPilot</w:t>
-      </w:r>
-      <w:proofErr w:type="spellEnd"/>
-      <w:r>
-        <w:rPr>
-          <w:rFonts w:ascii="Calibri Light" w:hAnsi="Calibri Light" w:cs="Calibri Light"/>
-          <w:sz w:val="19"/>
-          <w:szCs w:val="19"/>
-        </w:rPr>
-        <w:t xml:space="preserve"> for Sanger sequencing and </w:t>
-      </w:r>
-      <w:proofErr w:type="spellStart"/>
-      <w:r>
-        <w:rPr>
-          <w:rFonts w:ascii="Calibri Light" w:hAnsi="Calibri Light" w:cs="Calibri Light"/>
-          <w:sz w:val="19"/>
-          <w:szCs w:val="19"/>
-        </w:rPr>
-        <w:t>GeneMapper</w:t>
-      </w:r>
-      <w:proofErr w:type="spellEnd"/>
-      <w:r>
-        <w:rPr>
-          <w:rFonts w:ascii="Calibri Light" w:hAnsi="Calibri Light" w:cs="Calibri Light"/>
-          <w:sz w:val="19"/>
-          <w:szCs w:val="19"/>
-        </w:rPr>
-        <w:t xml:space="preserve"> for fragment analysis,</w:t>
-      </w:r>
-      <w:r>
-        <w:rPr>
-          <w:rFonts w:ascii="Calibri Light" w:hAnsi="Calibri Light" w:cs="Calibri Light"/>
-          <w:sz w:val="19"/>
-          <w:szCs w:val="19"/>
-        </w:rPr>
-        <w:t xml:space="preserve"> becoming familiar with the complex medical terminology associated with genetics and genomics in the process.</w:t>
-      </w:r>
-      <w:r>
-        <w:rPr>
-          <w:rFonts w:ascii="Calibri Light" w:hAnsi="Calibri Light" w:cs="Calibri Light"/>
-          <w:sz w:val="19"/>
-          <w:szCs w:val="19"/>
+          <w:sz w:val="20"/>
+          <w:szCs w:val="20"/>
+        </w:rPr>
+        <w:t>,</w:t>
+      </w:r>
+      <w:r>
+        <w:rPr>
+          <w:rFonts w:ascii="Calibri Light" w:hAnsi="Calibri Light" w:cs="Calibri Light"/>
+          <w:sz w:val="20"/>
+          <w:szCs w:val="20"/>
+        </w:rPr>
+        <w:t xml:space="preserve"> becoming familiar with the complex medical terminology associated with genetics and genomics.</w:t>
+      </w:r>
+      <w:r>
+        <w:rPr>
+          <w:rFonts w:ascii="Calibri Light" w:hAnsi="Calibri Light" w:cs="Calibri Light"/>
+          <w:sz w:val="20"/>
+          <w:szCs w:val="20"/>
         </w:rPr>
         <w:t xml:space="preserve"> I also </w:t>
       </w:r>
       <w:r>
         <w:rPr>
           <w:rFonts w:ascii="Calibri Light" w:hAnsi="Calibri Light" w:cs="Calibri Light"/>
-          <w:sz w:val="19"/>
-          <w:szCs w:val="19"/>
+          <w:sz w:val="20"/>
+          <w:szCs w:val="20"/>
         </w:rPr>
         <w:t>took on mentorship responsibilities, training</w:t>
       </w:r>
       <w:r>
         <w:rPr>
           <w:rFonts w:ascii="Calibri Light" w:hAnsi="Calibri Light" w:cs="Calibri Light"/>
-          <w:sz w:val="19"/>
-          <w:szCs w:val="19"/>
+          <w:sz w:val="20"/>
+          <w:szCs w:val="20"/>
         </w:rPr>
         <w:t xml:space="preserve"> </w:t>
       </w:r>
       <w:r>
         <w:rPr>
           <w:rFonts w:ascii="Calibri Light" w:hAnsi="Calibri Light" w:cs="Calibri Light"/>
-          <w:sz w:val="19"/>
-          <w:szCs w:val="19"/>
+          <w:sz w:val="20"/>
+          <w:szCs w:val="20"/>
         </w:rPr>
         <w:t>i</w:t>
       </w:r>
       <w:r>
         <w:rPr>
           <w:rFonts w:ascii="Calibri Light" w:hAnsi="Calibri Light" w:cs="Calibri Light"/>
-          <w:sz w:val="19"/>
-          <w:szCs w:val="19"/>
+          <w:sz w:val="20"/>
+          <w:szCs w:val="20"/>
         </w:rPr>
         <w:t xml:space="preserve">ncoming junior technologists and practicum students, helping to foster a </w:t>
       </w:r>
       <w:r>
         <w:rPr>
           <w:rFonts w:ascii="Calibri Light" w:hAnsi="Calibri Light" w:cs="Calibri Light"/>
-          <w:sz w:val="19"/>
-          <w:szCs w:val="19"/>
+          <w:sz w:val="20"/>
+          <w:szCs w:val="20"/>
         </w:rPr>
         <w:t>collaborative, harmonious</w:t>
       </w:r>
       <w:r>
         <w:rPr>
           <w:rFonts w:ascii="Calibri Light" w:hAnsi="Calibri Light" w:cs="Calibri Light"/>
-          <w:sz w:val="19"/>
-          <w:szCs w:val="19"/>
+          <w:sz w:val="20"/>
+          <w:szCs w:val="20"/>
         </w:rPr>
         <w:t xml:space="preserve"> learning environment. My role at PHSA highlights many </w:t>
       </w:r>
       <w:r>
         <w:rPr>
           <w:rFonts w:ascii="Calibri Light" w:hAnsi="Calibri Light" w:cs="Calibri Light"/>
-          <w:sz w:val="19"/>
-          <w:szCs w:val="19"/>
-        </w:rPr>
-        <w:t>strongly-developed</w:t>
-      </w:r>
-      <w:r>
-        <w:rPr>
-          <w:rFonts w:ascii="Calibri Light" w:hAnsi="Calibri Light" w:cs="Calibri Light"/>
-          <w:sz w:val="19"/>
-          <w:szCs w:val="19"/>
-        </w:rPr>
-        <w:t xml:space="preserve"> soft skills, including the ability to learn quickly, and adaptability to various responsibilities. The knowledge I gained here has been vital to furthering my understanding of the complexities of genetics, while further enhancing the necessary skills required to become a more efficient, collaborative and communicative team player. </w:t>
+          <w:sz w:val="20"/>
+          <w:szCs w:val="20"/>
+        </w:rPr>
+        <w:t>strongly</w:t>
+      </w:r>
+      <w:r>
+        <w:rPr>
+          <w:rFonts w:ascii="Calibri Light" w:hAnsi="Calibri Light" w:cs="Calibri Light"/>
+          <w:sz w:val="20"/>
+          <w:szCs w:val="20"/>
+        </w:rPr>
+        <w:t xml:space="preserve"> </w:t>
+      </w:r>
+      <w:r>
+        <w:rPr>
+          <w:rFonts w:ascii="Calibri Light" w:hAnsi="Calibri Light" w:cs="Calibri Light"/>
+          <w:sz w:val="20"/>
+          <w:szCs w:val="20"/>
+        </w:rPr>
+        <w:t>developed</w:t>
+      </w:r>
+      <w:r>
+        <w:rPr>
+          <w:rFonts w:ascii="Calibri Light" w:hAnsi="Calibri Light" w:cs="Calibri Light"/>
+          <w:sz w:val="20"/>
+          <w:szCs w:val="20"/>
+        </w:rPr>
+        <w:t xml:space="preserve"> soft skills, including the ability to learn quickly, and adaptability. The knowledge I gained ha</w:t>
+      </w:r>
+      <w:r>
+        <w:rPr>
+          <w:rFonts w:ascii="Calibri Light" w:hAnsi="Calibri Light" w:cs="Calibri Light"/>
+          <w:sz w:val="20"/>
+          <w:szCs w:val="20"/>
+        </w:rPr>
+        <w:t>d</w:t>
+      </w:r>
+      <w:r>
+        <w:rPr>
+          <w:rFonts w:ascii="Calibri Light" w:hAnsi="Calibri Light" w:cs="Calibri Light"/>
+          <w:sz w:val="20"/>
+          <w:szCs w:val="20"/>
+        </w:rPr>
+        <w:t xml:space="preserve"> been vital to furthering my understanding of the complexities of genetics, while further enhancing the necessary skills required to become a more efficient, collaborative and communicative team player. </w:t>
       </w:r>
     </w:p>
     <w:p>
@@ -664,103 +1006,490 @@
         <w:jc w:val="both"/>
         <w:rPr>
           <w:rFonts w:ascii="Calibri Light" w:hAnsi="Calibri Light" w:cs="Calibri Light"/>
-          <w:sz w:val="19"/>
-          <w:szCs w:val="19"/>
+          <w:sz w:val="20"/>
+          <w:szCs w:val="20"/>
         </w:rPr>
       </w:pPr>
-      <w:r>
-        <w:rPr>
-          <w:rFonts w:ascii="Calibri Light" w:hAnsi="Calibri Light" w:cs="Calibri Light"/>
-          <w:sz w:val="19"/>
-          <w:szCs w:val="19"/>
-        </w:rPr>
-        <w:t>Building upon my prior experience, I have been actively developing my technical expertise in software engineering through both co-op and personal projects.</w:t>
-      </w:r>
-      <w:r>
-        <w:rPr>
-          <w:rFonts w:ascii="Calibri Light" w:hAnsi="Calibri Light" w:cs="Calibri Light"/>
-          <w:sz w:val="19"/>
-          <w:szCs w:val="19"/>
+      <w:bookmarkStart w:id="0" w:name="_Hlk215403276"/>
+      <w:commentRangeStart w:id="1"/>
+      <w:r>
+        <w:rPr>
+          <w:rFonts w:ascii="Calibri Light" w:hAnsi="Calibri Light" w:cs="Calibri Light"/>
+          <w:sz w:val="20"/>
+          <w:szCs w:val="20"/>
+          <w:highlight w:val="yellow"/>
+        </w:rPr>
+        <w:t>Building upon my prior experience, I have</w:t>
+      </w:r>
+      <w:r>
+        <w:rPr>
+          <w:rFonts w:ascii="Calibri Light" w:hAnsi="Calibri Light" w:cs="Calibri Light"/>
+          <w:sz w:val="20"/>
+          <w:szCs w:val="20"/>
+          <w:highlight w:val="yellow"/>
+        </w:rPr>
+        <w:t xml:space="preserve"> also been</w:t>
+      </w:r>
+      <w:r>
+        <w:rPr>
+          <w:rFonts w:ascii="Calibri Light" w:hAnsi="Calibri Light" w:cs="Calibri Light"/>
+          <w:sz w:val="20"/>
+          <w:szCs w:val="20"/>
+          <w:highlight w:val="yellow"/>
+        </w:rPr>
+        <w:t xml:space="preserve"> actively developing my technical expertise through both co-op and personal projects.</w:t>
+      </w:r>
+      <w:r>
+        <w:rPr>
+          <w:rFonts w:ascii="Calibri Light" w:hAnsi="Calibri Light" w:cs="Calibri Light"/>
+          <w:sz w:val="20"/>
+          <w:szCs w:val="20"/>
+          <w:highlight w:val="yellow"/>
         </w:rPr>
         <w:t xml:space="preserve"> </w:t>
       </w:r>
       <w:r>
         <w:rPr>
           <w:rFonts w:ascii="Calibri Light" w:hAnsi="Calibri Light" w:cs="Calibri Light"/>
-          <w:sz w:val="19"/>
-          <w:szCs w:val="19"/>
-        </w:rPr>
-        <w:t xml:space="preserve">Currently, </w:t>
-      </w:r>
-      <w:r>
-        <w:rPr>
-          <w:rFonts w:ascii="Calibri Light" w:eastAsia="Cambria" w:hAnsi="Calibri Light" w:cs="Calibri Light"/>
-          <w:bCs/>
-          <w:sz w:val="19"/>
-          <w:szCs w:val="19"/>
-        </w:rPr>
-        <w:t>I am gaining practical experience as an Information Technology Analyst Co-op Student with Shared Service Canada, where I am supporting enterprise-level IT workflows in a federal government setting. This role is providing me with exposure to Linux-based operating systems, large-scale infrastructure, and</w:t>
-      </w:r>
-      <w:r>
-        <w:rPr>
-          <w:rFonts w:ascii="Calibri Light" w:eastAsia="Cambria" w:hAnsi="Calibri Light" w:cs="Calibri Light"/>
-          <w:bCs/>
-          <w:sz w:val="19"/>
-          <w:szCs w:val="19"/>
-        </w:rPr>
-        <w:t xml:space="preserve"> opportunities in automation scripting for workflow optimization</w:t>
-      </w:r>
-      <w:r>
-        <w:rPr>
-          <w:rFonts w:ascii="Calibri Light" w:eastAsia="Cambria" w:hAnsi="Calibri Light" w:cs="Calibri Light"/>
-          <w:bCs/>
-          <w:sz w:val="19"/>
-          <w:szCs w:val="19"/>
-        </w:rPr>
-        <w:t>, all while developing transferrable skills that are critical in a client-facing Agile-style team</w:t>
-      </w:r>
-      <w:r>
-        <w:rPr>
-          <w:rFonts w:ascii="Calibri Light" w:eastAsia="Cambria" w:hAnsi="Calibri Light" w:cs="Calibri Light"/>
-          <w:bCs/>
-          <w:sz w:val="19"/>
-          <w:szCs w:val="19"/>
+          <w:sz w:val="20"/>
+          <w:szCs w:val="20"/>
+          <w:highlight w:val="yellow"/>
+        </w:rPr>
+        <w:t xml:space="preserve">Previously, </w:t>
+      </w:r>
+      <w:r>
+        <w:rPr>
+          <w:rFonts w:ascii="Calibri Light" w:hAnsi="Calibri Light" w:cs="Calibri Light"/>
+          <w:sz w:val="20"/>
+          <w:szCs w:val="20"/>
+          <w:highlight w:val="yellow"/>
+        </w:rPr>
+        <w:t>I was associated with Shared Services Canada as an I.T. Analyst, where I supported enterprise-level I.T. workflows within the federal government.</w:t>
+      </w:r>
+      <w:r>
+        <w:rPr>
+          <w:rFonts w:ascii="Calibri Light" w:hAnsi="Calibri Light" w:cs="Calibri Light"/>
+          <w:sz w:val="20"/>
+          <w:szCs w:val="20"/>
+        </w:rPr>
+        <w:t xml:space="preserve"> </w:t>
+      </w:r>
+      <w:commentRangeEnd w:id="1"/>
+      <w:r>
+        <w:rPr>
+          <w:rStyle w:val="CommentReference"/>
+        </w:rPr>
+        <w:commentReference w:id="1"/>
+      </w:r>
+      <w:r>
+        <w:rPr>
+          <w:rFonts w:ascii="Calibri Light" w:hAnsi="Calibri Light" w:cs="Calibri Light"/>
+          <w:sz w:val="20"/>
+          <w:szCs w:val="20"/>
+        </w:rPr>
+        <w:t xml:space="preserve">I </w:t>
+      </w:r>
+      <w:r>
+        <w:rPr>
+          <w:rFonts w:ascii="Calibri Light" w:hAnsi="Calibri Light" w:cs="Calibri Light"/>
+          <w:sz w:val="20"/>
+          <w:szCs w:val="20"/>
+        </w:rPr>
+        <w:t>became exposed to</w:t>
+      </w:r>
+      <w:r>
+        <w:rPr>
+          <w:rFonts w:ascii="Calibri Light" w:hAnsi="Calibri Light" w:cs="Calibri Light"/>
+          <w:sz w:val="20"/>
+          <w:szCs w:val="20"/>
+        </w:rPr>
+        <w:t xml:space="preserve"> </w:t>
+      </w:r>
+      <w:r>
+        <w:rPr>
+          <w:rFonts w:ascii="Calibri Light" w:hAnsi="Calibri Light" w:cs="Calibri Light"/>
+          <w:sz w:val="20"/>
+          <w:szCs w:val="20"/>
+        </w:rPr>
+        <w:t>cloud-based</w:t>
+      </w:r>
+      <w:r>
+        <w:rPr>
+          <w:rFonts w:ascii="Calibri Light" w:hAnsi="Calibri Light" w:cs="Calibri Light"/>
+          <w:sz w:val="20"/>
+          <w:szCs w:val="20"/>
+        </w:rPr>
+        <w:t xml:space="preserve"> </w:t>
+      </w:r>
+      <w:r>
+        <w:rPr>
+          <w:rFonts w:ascii="Calibri Light" w:hAnsi="Calibri Light" w:cs="Calibri Light"/>
+          <w:sz w:val="20"/>
+          <w:szCs w:val="20"/>
+        </w:rPr>
+        <w:t xml:space="preserve">technologies </w:t>
+      </w:r>
+      <w:r>
+        <w:rPr>
+          <w:rFonts w:ascii="Calibri Light" w:hAnsi="Calibri Light" w:cs="Calibri Light"/>
+          <w:sz w:val="20"/>
+          <w:szCs w:val="20"/>
+        </w:rPr>
+        <w:t xml:space="preserve">and </w:t>
+      </w:r>
+      <w:r>
+        <w:rPr>
+          <w:rFonts w:ascii="Calibri Light" w:hAnsi="Calibri Light" w:cs="Calibri Light"/>
+          <w:sz w:val="20"/>
+          <w:szCs w:val="20"/>
+        </w:rPr>
+        <w:t xml:space="preserve">effectively leveraged PowerShell scripts to </w:t>
+      </w:r>
+      <w:r>
+        <w:rPr>
+          <w:rFonts w:ascii="Calibri Light" w:hAnsi="Calibri Light" w:cs="Calibri Light"/>
+          <w:sz w:val="20"/>
+          <w:szCs w:val="20"/>
+        </w:rPr>
+        <w:t>complete tasks relating to user state management</w:t>
+      </w:r>
+      <w:r>
+        <w:rPr>
+          <w:rFonts w:ascii="Calibri Light" w:hAnsi="Calibri Light" w:cs="Calibri Light"/>
+          <w:sz w:val="20"/>
+          <w:szCs w:val="20"/>
+        </w:rPr>
+        <w:t xml:space="preserve">. </w:t>
+      </w:r>
+      <w:r>
+        <w:rPr>
+          <w:rFonts w:ascii="Calibri Light" w:hAnsi="Calibri Light" w:cs="Calibri Light"/>
+          <w:sz w:val="20"/>
+          <w:szCs w:val="20"/>
+        </w:rPr>
+        <w:t xml:space="preserve">Furthermore, </w:t>
+      </w:r>
+      <w:r>
+        <w:rPr>
+          <w:rFonts w:ascii="Calibri Light" w:hAnsi="Calibri Light" w:cs="Calibri Light"/>
+          <w:sz w:val="20"/>
+          <w:szCs w:val="20"/>
+        </w:rPr>
+        <w:t xml:space="preserve">I also </w:t>
+      </w:r>
+      <w:r>
+        <w:rPr>
+          <w:rFonts w:ascii="Calibri Light" w:hAnsi="Calibri Light" w:cs="Calibri Light"/>
+          <w:sz w:val="20"/>
+          <w:szCs w:val="20"/>
+        </w:rPr>
+        <w:t xml:space="preserve">improved </w:t>
+      </w:r>
+      <w:r>
+        <w:rPr>
+          <w:rFonts w:ascii="Calibri Light" w:hAnsi="Calibri Light" w:cs="Calibri Light"/>
+          <w:sz w:val="20"/>
+          <w:szCs w:val="20"/>
+        </w:rPr>
+        <w:t xml:space="preserve">Tier-1 ticketing </w:t>
+      </w:r>
+      <w:r>
+        <w:rPr>
+          <w:rFonts w:ascii="Calibri Light" w:hAnsi="Calibri Light" w:cs="Calibri Light"/>
+          <w:sz w:val="20"/>
+          <w:szCs w:val="20"/>
+        </w:rPr>
+        <w:t>efficiency by developing a Python-</w:t>
+      </w:r>
+      <w:r>
+        <w:rPr>
+          <w:rFonts w:ascii="Calibri Light" w:hAnsi="Calibri Light" w:cs="Calibri Light"/>
+          <w:sz w:val="20"/>
+          <w:szCs w:val="20"/>
+        </w:rPr>
+        <w:t>based desktop application</w:t>
+      </w:r>
+      <w:r>
+        <w:rPr>
+          <w:rFonts w:ascii="Calibri Light" w:hAnsi="Calibri Light" w:cs="Calibri Light"/>
+          <w:sz w:val="20"/>
+          <w:szCs w:val="20"/>
+        </w:rPr>
+        <w:t xml:space="preserve">. </w:t>
+      </w:r>
+      <w:r>
+        <w:rPr>
+          <w:rFonts w:ascii="Calibri Light" w:hAnsi="Calibri Light" w:cs="Calibri Light"/>
+          <w:sz w:val="20"/>
+          <w:szCs w:val="20"/>
+        </w:rPr>
+        <w:t xml:space="preserve">With Python, I utilized </w:t>
+      </w:r>
+      <w:r>
+        <w:rPr>
+          <w:rFonts w:ascii="Calibri Light" w:hAnsi="Calibri Light" w:cs="Calibri Light"/>
+          <w:sz w:val="20"/>
+          <w:szCs w:val="20"/>
+        </w:rPr>
+        <w:t xml:space="preserve">libraries such as </w:t>
+      </w:r>
+      <w:proofErr w:type="spellStart"/>
+      <w:r>
+        <w:rPr>
+          <w:rFonts w:ascii="Calibri Light" w:hAnsi="Calibri Light" w:cs="Calibri Light"/>
+          <w:sz w:val="20"/>
+          <w:szCs w:val="20"/>
+        </w:rPr>
+        <w:t>Tkinter</w:t>
+      </w:r>
+      <w:proofErr w:type="spellEnd"/>
+      <w:r>
+        <w:rPr>
+          <w:rFonts w:ascii="Calibri Light" w:hAnsi="Calibri Light" w:cs="Calibri Light"/>
+          <w:sz w:val="20"/>
+          <w:szCs w:val="20"/>
+        </w:rPr>
+        <w:t xml:space="preserve"> to build</w:t>
+      </w:r>
+      <w:r>
+        <w:rPr>
+          <w:rFonts w:ascii="Calibri Light" w:hAnsi="Calibri Light" w:cs="Calibri Light"/>
+          <w:sz w:val="20"/>
+          <w:szCs w:val="20"/>
+        </w:rPr>
+        <w:t xml:space="preserve"> a responsive graphical user interface, </w:t>
+      </w:r>
+      <w:r>
+        <w:rPr>
+          <w:rFonts w:ascii="Calibri Light" w:hAnsi="Calibri Light" w:cs="Calibri Light"/>
+          <w:sz w:val="20"/>
+          <w:szCs w:val="20"/>
+        </w:rPr>
+        <w:t>automating</w:t>
+      </w:r>
+      <w:r>
+        <w:rPr>
+          <w:rFonts w:ascii="Calibri Light" w:hAnsi="Calibri Light" w:cs="Calibri Light"/>
+          <w:sz w:val="20"/>
+          <w:szCs w:val="20"/>
+        </w:rPr>
+        <w:t xml:space="preserve"> </w:t>
+      </w:r>
+      <w:r>
+        <w:rPr>
+          <w:rFonts w:ascii="Calibri Light" w:hAnsi="Calibri Light" w:cs="Calibri Light"/>
+          <w:sz w:val="20"/>
+          <w:szCs w:val="20"/>
+        </w:rPr>
+        <w:t xml:space="preserve">Excel </w:t>
+      </w:r>
+      <w:r>
+        <w:rPr>
+          <w:rFonts w:ascii="Calibri Light" w:hAnsi="Calibri Light" w:cs="Calibri Light"/>
+          <w:sz w:val="20"/>
+          <w:szCs w:val="20"/>
+        </w:rPr>
+        <w:t>template cell population,</w:t>
+      </w:r>
+      <w:r>
+        <w:rPr>
+          <w:rFonts w:ascii="Calibri Light" w:hAnsi="Calibri Light" w:cs="Calibri Light"/>
+          <w:sz w:val="20"/>
+          <w:szCs w:val="20"/>
+        </w:rPr>
+        <w:t xml:space="preserve"> and</w:t>
+      </w:r>
+      <w:r>
+        <w:rPr>
+          <w:rFonts w:ascii="Calibri Light" w:hAnsi="Calibri Light" w:cs="Calibri Light"/>
+          <w:sz w:val="20"/>
+          <w:szCs w:val="20"/>
+        </w:rPr>
+        <w:t xml:space="preserve"> </w:t>
+      </w:r>
+      <w:r>
+        <w:rPr>
+          <w:rFonts w:ascii="Calibri Light" w:hAnsi="Calibri Light" w:cs="Calibri Light"/>
+          <w:sz w:val="20"/>
+          <w:szCs w:val="20"/>
+        </w:rPr>
+        <w:t xml:space="preserve">automatic copy-paste </w:t>
+      </w:r>
+      <w:r>
+        <w:rPr>
+          <w:rFonts w:ascii="Calibri Light" w:hAnsi="Calibri Light" w:cs="Calibri Light"/>
+          <w:sz w:val="20"/>
+          <w:szCs w:val="20"/>
+        </w:rPr>
+        <w:t>functionalities.</w:t>
+      </w:r>
+      <w:r>
+        <w:rPr>
+          <w:rFonts w:ascii="Calibri Light" w:hAnsi="Calibri Light" w:cs="Calibri Light"/>
+          <w:sz w:val="20"/>
+          <w:szCs w:val="20"/>
+        </w:rPr>
+        <w:t xml:space="preserve"> </w:t>
+      </w:r>
+      <w:r>
+        <w:rPr>
+          <w:rFonts w:ascii="Calibri Light" w:hAnsi="Calibri Light" w:cs="Calibri Light"/>
+          <w:sz w:val="20"/>
+          <w:szCs w:val="20"/>
+        </w:rPr>
+        <w:t>This significantly reduced</w:t>
+      </w:r>
+      <w:r>
+        <w:rPr>
+          <w:rFonts w:ascii="Calibri Light" w:hAnsi="Calibri Light" w:cs="Calibri Light"/>
+          <w:sz w:val="20"/>
+          <w:szCs w:val="20"/>
+        </w:rPr>
+        <w:t xml:space="preserve"> </w:t>
+      </w:r>
+      <w:r>
+        <w:rPr>
+          <w:rFonts w:ascii="Calibri Light" w:hAnsi="Calibri Light" w:cs="Calibri Light"/>
+          <w:sz w:val="20"/>
+          <w:szCs w:val="20"/>
+        </w:rPr>
+        <w:t>manual data entry errors</w:t>
+      </w:r>
+      <w:r>
+        <w:rPr>
+          <w:rFonts w:ascii="Calibri Light" w:hAnsi="Calibri Light" w:cs="Calibri Light"/>
+          <w:sz w:val="20"/>
+          <w:szCs w:val="20"/>
+        </w:rPr>
+        <w:t xml:space="preserve"> </w:t>
+      </w:r>
+      <w:r>
+        <w:rPr>
+          <w:rFonts w:ascii="Calibri Light" w:hAnsi="Calibri Light" w:cs="Calibri Light"/>
+          <w:sz w:val="20"/>
+          <w:szCs w:val="20"/>
+        </w:rPr>
+        <w:t>and</w:t>
+      </w:r>
+      <w:r>
+        <w:rPr>
+          <w:rFonts w:ascii="Calibri Light" w:hAnsi="Calibri Light" w:cs="Calibri Light"/>
+          <w:sz w:val="20"/>
+          <w:szCs w:val="20"/>
+        </w:rPr>
+        <w:t xml:space="preserve"> had also</w:t>
+      </w:r>
+      <w:r>
+        <w:rPr>
+          <w:rFonts w:ascii="Calibri Light" w:hAnsi="Calibri Light" w:cs="Calibri Light"/>
+          <w:sz w:val="20"/>
+          <w:szCs w:val="20"/>
+        </w:rPr>
+        <w:t xml:space="preserve"> improved processing speed by </w:t>
+      </w:r>
+      <w:r>
+        <w:rPr>
+          <w:rFonts w:ascii="Calibri Light" w:hAnsi="Calibri Light" w:cs="Calibri Light"/>
+          <w:sz w:val="20"/>
+          <w:szCs w:val="20"/>
+        </w:rPr>
+        <w:t>75%</w:t>
+      </w:r>
+      <w:r>
+        <w:rPr>
+          <w:rFonts w:ascii="Calibri Light" w:hAnsi="Calibri Light" w:cs="Calibri Light"/>
+          <w:sz w:val="20"/>
+          <w:szCs w:val="20"/>
         </w:rPr>
         <w:t>.</w:t>
       </w:r>
       <w:r>
         <w:rPr>
-          <w:rFonts w:ascii="Calibri Light" w:eastAsia="Cambria" w:hAnsi="Calibri Light" w:cs="Calibri Light"/>
-          <w:bCs/>
-          <w:sz w:val="19"/>
-          <w:szCs w:val="19"/>
+          <w:rFonts w:ascii="Calibri Light" w:hAnsi="Calibri Light" w:cs="Calibri Light"/>
+          <w:sz w:val="20"/>
+          <w:szCs w:val="20"/>
         </w:rPr>
         <w:t xml:space="preserve"> </w:t>
       </w:r>
       <w:r>
         <w:rPr>
-          <w:rFonts w:ascii="Calibri Light" w:eastAsia="Cambria" w:hAnsi="Calibri Light" w:cs="Calibri Light"/>
-          <w:bCs/>
-          <w:sz w:val="19"/>
-          <w:szCs w:val="19"/>
-        </w:rPr>
-        <w:t>In this role, I aim to identify potential opportunities for automation to streamline recurring processes and improve efficiency through scripting with JavaScript, Python and PowerShell, building on my interest in workflow optimization</w:t>
-      </w:r>
-      <w:r>
-        <w:rPr>
-          <w:rFonts w:ascii="Calibri Light" w:eastAsia="Cambria" w:hAnsi="Calibri Light" w:cs="Calibri Light"/>
-          <w:bCs/>
-          <w:sz w:val="19"/>
-          <w:szCs w:val="19"/>
-        </w:rPr>
-        <w:t xml:space="preserve"> Alongside this, </w:t>
-      </w:r>
-      <w:r>
-        <w:rPr>
-          <w:rFonts w:ascii="Calibri Light" w:eastAsia="Cambria" w:hAnsi="Calibri Light" w:cs="Calibri Light"/>
-          <w:bCs/>
-          <w:sz w:val="19"/>
-          <w:szCs w:val="19"/>
+          <w:rFonts w:ascii="Calibri Light" w:hAnsi="Calibri Light" w:cs="Calibri Light"/>
+          <w:sz w:val="20"/>
+          <w:szCs w:val="20"/>
+        </w:rPr>
+        <w:t xml:space="preserve">This </w:t>
+      </w:r>
+      <w:r>
+        <w:rPr>
+          <w:rFonts w:ascii="Calibri Light" w:hAnsi="Calibri Light" w:cs="Calibri Light"/>
+          <w:sz w:val="20"/>
+          <w:szCs w:val="20"/>
+        </w:rPr>
+        <w:t>not only showcases</w:t>
+      </w:r>
+      <w:r>
+        <w:rPr>
+          <w:rFonts w:ascii="Calibri Light" w:hAnsi="Calibri Light" w:cs="Calibri Light"/>
+          <w:sz w:val="20"/>
+          <w:szCs w:val="20"/>
+        </w:rPr>
+        <w:t xml:space="preserve"> </w:t>
+      </w:r>
+      <w:r>
+        <w:rPr>
+          <w:rFonts w:ascii="Calibri Light" w:hAnsi="Calibri Light" w:cs="Calibri Light"/>
+          <w:sz w:val="20"/>
+          <w:szCs w:val="20"/>
+        </w:rPr>
+        <w:t>my capability to take on self-initiated projects</w:t>
+      </w:r>
+      <w:r>
+        <w:rPr>
+          <w:rFonts w:ascii="Calibri Light" w:hAnsi="Calibri Light" w:cs="Calibri Light"/>
+          <w:sz w:val="20"/>
+          <w:szCs w:val="20"/>
+        </w:rPr>
+        <w:t xml:space="preserve"> to improve workplace procedures</w:t>
+      </w:r>
+      <w:r>
+        <w:rPr>
+          <w:rFonts w:ascii="Calibri Light" w:hAnsi="Calibri Light" w:cs="Calibri Light"/>
+          <w:sz w:val="20"/>
+          <w:szCs w:val="20"/>
+        </w:rPr>
+        <w:t xml:space="preserve">, but it also built upon my </w:t>
+      </w:r>
+      <w:r>
+        <w:rPr>
+          <w:rFonts w:ascii="Calibri Light" w:hAnsi="Calibri Light" w:cs="Calibri Light"/>
+          <w:sz w:val="20"/>
+          <w:szCs w:val="20"/>
+        </w:rPr>
+        <w:t>interest in workflow optimization.</w:t>
+      </w:r>
+      <w:r>
+        <w:rPr>
+          <w:rFonts w:ascii="Calibri Light" w:hAnsi="Calibri Light" w:cs="Calibri Light"/>
+          <w:sz w:val="20"/>
+          <w:szCs w:val="20"/>
+        </w:rPr>
+        <w:t xml:space="preserve"> </w:t>
+      </w:r>
+      <w:r>
+        <w:rPr>
+          <w:rFonts w:ascii="Calibri Light" w:eastAsia="Cambria" w:hAnsi="Calibri Light" w:cs="Calibri Light"/>
+          <w:bCs/>
+          <w:sz w:val="20"/>
+          <w:szCs w:val="20"/>
+        </w:rPr>
+        <w:t xml:space="preserve">Alongside this, </w:t>
+      </w:r>
+      <w:r>
+        <w:rPr>
+          <w:rFonts w:ascii="Calibri Light" w:eastAsia="Cambria" w:hAnsi="Calibri Light" w:cs="Calibri Light"/>
+          <w:bCs/>
+          <w:sz w:val="20"/>
+          <w:szCs w:val="20"/>
         </w:rPr>
         <w:t>I have built</w:t>
       </w:r>
@@ -768,148 +1497,347 @@
         <w:rPr>
           <w:rFonts w:ascii="Calibri Light" w:eastAsia="Cambria" w:hAnsi="Calibri Light" w:cs="Calibri Light"/>
           <w:bCs/>
-          <w:sz w:val="19"/>
-          <w:szCs w:val="19"/>
-        </w:rPr>
-        <w:t xml:space="preserve"> full-stack applications, which not only strongly showcases my continued passion in software construction, but also displays my dedication and initiative to grow in a fast-paced industry. For example, I scaled </w:t>
+          <w:sz w:val="20"/>
+          <w:szCs w:val="20"/>
+        </w:rPr>
+        <w:t xml:space="preserve"> full-stack applications, which showcases my continued passion in software construction, </w:t>
+      </w:r>
+      <w:proofErr w:type="gramStart"/>
+      <w:r>
+        <w:rPr>
+          <w:rFonts w:ascii="Calibri Light" w:eastAsia="Cambria" w:hAnsi="Calibri Light" w:cs="Calibri Light"/>
+          <w:bCs/>
+          <w:sz w:val="20"/>
+          <w:szCs w:val="20"/>
+        </w:rPr>
+        <w:t>and also</w:t>
+      </w:r>
+      <w:proofErr w:type="gramEnd"/>
+      <w:r>
+        <w:rPr>
+          <w:rFonts w:ascii="Calibri Light" w:eastAsia="Cambria" w:hAnsi="Calibri Light" w:cs="Calibri Light"/>
+          <w:bCs/>
+          <w:sz w:val="20"/>
+          <w:szCs w:val="20"/>
+        </w:rPr>
+        <w:t xml:space="preserve"> displays my dedication to grow in a fast-paced industry. For example, </w:t>
+      </w:r>
+      <w:r>
+        <w:rPr>
+          <w:rFonts w:ascii="Calibri Light" w:eastAsia="Cambria" w:hAnsi="Calibri Light" w:cs="Calibri Light"/>
+          <w:bCs/>
+          <w:sz w:val="20"/>
+          <w:szCs w:val="20"/>
+        </w:rPr>
+        <w:t xml:space="preserve">I </w:t>
+      </w:r>
+      <w:r>
+        <w:rPr>
+          <w:rFonts w:ascii="Calibri Light" w:eastAsia="Cambria" w:hAnsi="Calibri Light" w:cs="Calibri Light"/>
+          <w:bCs/>
+          <w:sz w:val="20"/>
+          <w:szCs w:val="20"/>
+        </w:rPr>
+        <w:t xml:space="preserve">built </w:t>
       </w:r>
       <w:proofErr w:type="spellStart"/>
       <w:r>
         <w:rPr>
           <w:rFonts w:ascii="Calibri Light" w:eastAsia="Cambria" w:hAnsi="Calibri Light" w:cs="Calibri Light"/>
           <w:bCs/>
-          <w:sz w:val="19"/>
-          <w:szCs w:val="19"/>
-        </w:rPr>
-        <w:t>SipLy</w:t>
+          <w:sz w:val="20"/>
+          <w:szCs w:val="20"/>
+        </w:rPr>
+        <w:t>AniMori</w:t>
       </w:r>
       <w:proofErr w:type="spellEnd"/>
       <w:r>
         <w:rPr>
           <w:rFonts w:ascii="Calibri Light" w:eastAsia="Cambria" w:hAnsi="Calibri Light" w:cs="Calibri Light"/>
           <w:bCs/>
-          <w:sz w:val="19"/>
-          <w:szCs w:val="19"/>
-        </w:rPr>
-        <w:t xml:space="preserve"> from an academic Java-based CLI and Swing project into a full-stack React and Spring Boot web application that helps users track their daily sugar, caffeine and caloric intake from consumed beverages. On the backend, I learnt how to design RESTful APIs, and utilized the embedded H2 Database Engine to persist user data. Through </w:t>
+          <w:sz w:val="20"/>
+          <w:szCs w:val="20"/>
+        </w:rPr>
+        <w:t>, a desktop anime-tracking application, powered by Electron</w:t>
+      </w:r>
+      <w:r>
+        <w:rPr>
+          <w:rFonts w:ascii="Calibri Light" w:eastAsia="Cambria" w:hAnsi="Calibri Light" w:cs="Calibri Light"/>
+          <w:bCs/>
+          <w:sz w:val="20"/>
+          <w:szCs w:val="20"/>
+        </w:rPr>
+        <w:t>.js</w:t>
+      </w:r>
+      <w:r>
+        <w:rPr>
+          <w:rFonts w:ascii="Calibri Light" w:eastAsia="Cambria" w:hAnsi="Calibri Light" w:cs="Calibri Light"/>
+          <w:bCs/>
+          <w:sz w:val="20"/>
+          <w:szCs w:val="20"/>
+        </w:rPr>
+        <w:t xml:space="preserve"> and React for the frontend, and SQLite for the backend database. For </w:t>
       </w:r>
       <w:proofErr w:type="spellStart"/>
       <w:r>
         <w:rPr>
           <w:rFonts w:ascii="Calibri Light" w:eastAsia="Cambria" w:hAnsi="Calibri Light" w:cs="Calibri Light"/>
           <w:bCs/>
-          <w:sz w:val="19"/>
-          <w:szCs w:val="19"/>
-        </w:rPr>
-        <w:t>SipLy</w:t>
+          <w:sz w:val="20"/>
+          <w:szCs w:val="20"/>
+        </w:rPr>
+        <w:t>AniMoris</w:t>
       </w:r>
       <w:proofErr w:type="spellEnd"/>
       <w:r>
         <w:rPr>
           <w:rFonts w:ascii="Calibri Light" w:eastAsia="Cambria" w:hAnsi="Calibri Light" w:cs="Calibri Light"/>
           <w:bCs/>
-          <w:sz w:val="19"/>
-          <w:szCs w:val="19"/>
-        </w:rPr>
-        <w:t xml:space="preserve">, I also learnt the fundamentals of security and implemented password hashing to protect user login data with Spring Security and </w:t>
+          <w:sz w:val="20"/>
+          <w:szCs w:val="20"/>
+        </w:rPr>
+        <w:t>’ backend, I implemented a lightweight relational database schema to manage anime entries and watch statuses, successfully integrating the Jikan API to automatically fetch metadata without manual entry, and wrote reusable SQL queries to handle common CRUD operations. Subsequently, I was able to successfully connect both components together, ensuring smooth data flow from UI to backend. Th</w:t>
+      </w:r>
+      <w:r>
+        <w:rPr>
+          <w:rFonts w:ascii="Calibri Light" w:eastAsia="Cambria" w:hAnsi="Calibri Light" w:cs="Calibri Light"/>
+          <w:bCs/>
+          <w:sz w:val="20"/>
+          <w:szCs w:val="20"/>
+        </w:rPr>
+        <w:t>is project</w:t>
+      </w:r>
+      <w:r>
+        <w:rPr>
+          <w:rFonts w:ascii="Calibri Light" w:eastAsia="Cambria" w:hAnsi="Calibri Light" w:cs="Calibri Light"/>
+          <w:bCs/>
+          <w:sz w:val="20"/>
+          <w:szCs w:val="20"/>
+        </w:rPr>
+        <w:t xml:space="preserve"> enhanced my capabilities in assessing real-world problems, coordinating technical workflows and learnt how to iteratively build upon existing prototypes for continuous improvement. </w:t>
+      </w:r>
+    </w:p>
+    <w:bookmarkEnd w:id="0"/>
+    <w:p>
+      <w:pPr>
+        <w:jc w:val="both"/>
+        <w:rPr>
+          <w:rFonts w:ascii="Calibri Light" w:hAnsi="Calibri Light" w:cs="Calibri Light"/>
+          <w:sz w:val="20"/>
+          <w:szCs w:val="20"/>
+        </w:rPr>
+      </w:pPr>
+      <w:r>
+        <w:rPr>
+          <w:rFonts w:ascii="Calibri Light" w:hAnsi="Calibri Light" w:cs="Calibri Light"/>
+          <w:sz w:val="20"/>
+          <w:szCs w:val="20"/>
+        </w:rPr>
+        <w:t>I am highly impressed by the</w:t>
+      </w:r>
+      <w:r>
+        <w:rPr>
+          <w:rFonts w:ascii="Calibri Light" w:hAnsi="Calibri Light" w:cs="Calibri Light"/>
+          <w:sz w:val="20"/>
+          <w:szCs w:val="20"/>
+        </w:rPr>
+        <w:t xml:space="preserve"> </w:t>
+      </w:r>
+      <w:proofErr w:type="gramStart"/>
+      <w:r>
+        <w:rPr>
+          <w:rFonts w:ascii="Calibri Light" w:hAnsi="Calibri Light" w:cs="Calibri Light"/>
+          <w:sz w:val="20"/>
+          <w:szCs w:val="20"/>
+        </w:rPr>
+        <w:t xml:space="preserve">{{ </w:t>
       </w:r>
       <w:proofErr w:type="spellStart"/>
       <w:r>
         <w:rPr>
-          <w:rFonts w:ascii="Calibri Light" w:eastAsia="Cambria" w:hAnsi="Calibri Light" w:cs="Calibri Light"/>
-          <w:bCs/>
-          <w:sz w:val="19"/>
-          <w:szCs w:val="19"/>
-        </w:rPr>
-        <w:t>BCrypt</w:t>
+          <w:rFonts w:ascii="Calibri Light" w:hAnsi="Calibri Light" w:cs="Calibri Light"/>
+          <w:sz w:val="20"/>
+          <w:szCs w:val="20"/>
+        </w:rPr>
+        <w:t>company</w:t>
+      </w:r>
+      <w:proofErr w:type="gramEnd"/>
+      <w:r>
+        <w:rPr>
+          <w:rFonts w:ascii="Calibri Light" w:hAnsi="Calibri Light" w:cs="Calibri Light"/>
+          <w:sz w:val="20"/>
+          <w:szCs w:val="20"/>
+        </w:rPr>
+        <w:t>_</w:t>
+      </w:r>
+      <w:proofErr w:type="gramStart"/>
+      <w:r>
+        <w:rPr>
+          <w:rFonts w:ascii="Calibri Light" w:hAnsi="Calibri Light" w:cs="Calibri Light"/>
+          <w:sz w:val="20"/>
+          <w:szCs w:val="20"/>
+        </w:rPr>
+        <w:t>name</w:t>
       </w:r>
       <w:proofErr w:type="spellEnd"/>
       <w:r>
         <w:rPr>
-          <w:rFonts w:ascii="Calibri Light" w:eastAsia="Cambria" w:hAnsi="Calibri Light" w:cs="Calibri Light"/>
-          <w:bCs/>
-          <w:sz w:val="19"/>
-          <w:szCs w:val="19"/>
-        </w:rPr>
-        <w:t xml:space="preserve">. I also have plans of integrating Spring AI with </w:t>
+          <w:rFonts w:ascii="Calibri Light" w:hAnsi="Calibri Light" w:cs="Calibri Light"/>
+          <w:sz w:val="20"/>
+          <w:szCs w:val="20"/>
+        </w:rPr>
+        <w:t xml:space="preserve"> }}</w:t>
+      </w:r>
+      <w:r>
+        <w:rPr>
+          <w:rFonts w:ascii="Calibri Light" w:hAnsi="Calibri Light" w:cs="Calibri Light"/>
+          <w:sz w:val="20"/>
+          <w:szCs w:val="20"/>
+        </w:rPr>
+        <w:t>’</w:t>
+      </w:r>
+      <w:proofErr w:type="gramEnd"/>
+      <w:r>
+        <w:rPr>
+          <w:rFonts w:ascii="Calibri Light" w:hAnsi="Calibri Light" w:cs="Calibri Light"/>
+          <w:sz w:val="20"/>
+          <w:szCs w:val="20"/>
+        </w:rPr>
+        <w:t xml:space="preserve">s contributions </w:t>
+      </w:r>
+      <w:r>
+        <w:rPr>
+          <w:rFonts w:ascii="Calibri Light" w:hAnsi="Calibri Light" w:cs="Calibri Light"/>
+          <w:sz w:val="20"/>
+          <w:szCs w:val="20"/>
+        </w:rPr>
+        <w:t>in the field of bioinformatics</w:t>
+      </w:r>
+      <w:r>
+        <w:rPr>
+          <w:rFonts w:ascii="Calibri Light" w:hAnsi="Calibri Light" w:cs="Calibri Light"/>
+          <w:sz w:val="20"/>
+          <w:szCs w:val="20"/>
+        </w:rPr>
+        <w:t xml:space="preserve">, </w:t>
+      </w:r>
+      <w:r>
+        <w:rPr>
+          <w:rFonts w:ascii="Calibri Light" w:hAnsi="Calibri Light" w:cs="Calibri Light"/>
+          <w:sz w:val="20"/>
+          <w:szCs w:val="20"/>
+        </w:rPr>
+        <w:t xml:space="preserve">especially in your innovative approaches taken </w:t>
+      </w:r>
+      <w:r>
+        <w:rPr>
+          <w:rFonts w:ascii="Calibri Light" w:hAnsi="Calibri Light" w:cs="Calibri Light"/>
+          <w:sz w:val="20"/>
+          <w:szCs w:val="20"/>
+        </w:rPr>
+        <w:t>to</w:t>
+      </w:r>
+      <w:r>
+        <w:rPr>
+          <w:rFonts w:ascii="Calibri Light" w:hAnsi="Calibri Light" w:cs="Calibri Light"/>
+          <w:sz w:val="20"/>
+          <w:szCs w:val="20"/>
+        </w:rPr>
+        <w:t xml:space="preserve"> </w:t>
+      </w:r>
+      <w:proofErr w:type="gramStart"/>
+      <w:r>
+        <w:rPr>
+          <w:rFonts w:ascii="Calibri Light" w:hAnsi="Calibri Light" w:cs="Calibri Light"/>
+          <w:sz w:val="20"/>
+          <w:szCs w:val="20"/>
+        </w:rPr>
+        <w:t xml:space="preserve">{{ </w:t>
       </w:r>
       <w:proofErr w:type="spellStart"/>
       <w:r>
         <w:rPr>
-          <w:rFonts w:ascii="Calibri Light" w:eastAsia="Cambria" w:hAnsi="Calibri Light" w:cs="Calibri Light"/>
-          <w:bCs/>
-          <w:sz w:val="19"/>
-          <w:szCs w:val="19"/>
-        </w:rPr>
-        <w:t>Groq</w:t>
+          <w:rFonts w:ascii="Calibri Light" w:hAnsi="Calibri Light" w:cs="Calibri Light"/>
+          <w:sz w:val="20"/>
+          <w:szCs w:val="20"/>
+        </w:rPr>
+        <w:t>mission</w:t>
+      </w:r>
+      <w:proofErr w:type="gramEnd"/>
+      <w:r>
+        <w:rPr>
+          <w:rFonts w:ascii="Calibri Light" w:hAnsi="Calibri Light" w:cs="Calibri Light"/>
+          <w:sz w:val="20"/>
+          <w:szCs w:val="20"/>
+        </w:rPr>
+        <w:t>_</w:t>
+      </w:r>
+      <w:proofErr w:type="gramStart"/>
+      <w:r>
+        <w:rPr>
+          <w:rFonts w:ascii="Calibri Light" w:hAnsi="Calibri Light" w:cs="Calibri Light"/>
+          <w:sz w:val="20"/>
+          <w:szCs w:val="20"/>
+        </w:rPr>
+        <w:t>statement</w:t>
       </w:r>
       <w:proofErr w:type="spellEnd"/>
       <w:r>
         <w:rPr>
-          <w:rFonts w:ascii="Calibri Light" w:eastAsia="Cambria" w:hAnsi="Calibri Light" w:cs="Calibri Light"/>
-          <w:bCs/>
-          <w:sz w:val="19"/>
-          <w:szCs w:val="19"/>
-        </w:rPr>
-        <w:t xml:space="preserve"> to deliver personalized recommendations. Furthermore, I have also built </w:t>
-      </w:r>
-      <w:proofErr w:type="spellStart"/>
-      <w:r>
-        <w:rPr>
-          <w:rFonts w:ascii="Calibri Light" w:eastAsia="Cambria" w:hAnsi="Calibri Light" w:cs="Calibri Light"/>
-          <w:bCs/>
-          <w:sz w:val="19"/>
-          <w:szCs w:val="19"/>
-        </w:rPr>
-        <w:t>AniMori</w:t>
-      </w:r>
-      <w:proofErr w:type="spellEnd"/>
-      <w:r>
-        <w:rPr>
-          <w:rFonts w:ascii="Calibri Light" w:eastAsia="Cambria" w:hAnsi="Calibri Light" w:cs="Calibri Light"/>
-          <w:bCs/>
-          <w:sz w:val="19"/>
-          <w:szCs w:val="19"/>
-        </w:rPr>
-        <w:t>, a desktop anime-tracking application, powered by Electron</w:t>
-      </w:r>
-      <w:r>
-        <w:rPr>
-          <w:rFonts w:ascii="Calibri Light" w:eastAsia="Cambria" w:hAnsi="Calibri Light" w:cs="Calibri Light"/>
-          <w:bCs/>
-          <w:sz w:val="19"/>
-          <w:szCs w:val="19"/>
-        </w:rPr>
-        <w:t>.js</w:t>
-      </w:r>
-      <w:r>
-        <w:rPr>
-          <w:rFonts w:ascii="Calibri Light" w:eastAsia="Cambria" w:hAnsi="Calibri Light" w:cs="Calibri Light"/>
-          <w:bCs/>
-          <w:sz w:val="19"/>
-          <w:szCs w:val="19"/>
-        </w:rPr>
-        <w:t xml:space="preserve"> and React for the frontend, and SQLite for the backend database. For </w:t>
-      </w:r>
-      <w:proofErr w:type="spellStart"/>
-      <w:r>
-        <w:rPr>
-          <w:rFonts w:ascii="Calibri Light" w:eastAsia="Cambria" w:hAnsi="Calibri Light" w:cs="Calibri Light"/>
-          <w:bCs/>
-          <w:sz w:val="19"/>
-          <w:szCs w:val="19"/>
-        </w:rPr>
-        <w:t>AniMoris</w:t>
-      </w:r>
-      <w:proofErr w:type="spellEnd"/>
-      <w:r>
-        <w:rPr>
-          <w:rFonts w:ascii="Calibri Light" w:eastAsia="Cambria" w:hAnsi="Calibri Light" w:cs="Calibri Light"/>
-          <w:bCs/>
-          <w:sz w:val="19"/>
-          <w:szCs w:val="19"/>
-        </w:rPr>
-        <w:t xml:space="preserve">’ backend, I implemented a lightweight relational database schema to manage anime entries and watch statuses, successfully integrating the Jikan API to automatically fetch metadata without manual entry, and wrote reusable SQL queries to handle common CRUD operations. Subsequently, I was able to successfully connect both components together, ensuring smooth data flow from UI to backend. These projects have enhanced my capabilities in assessing real-world problems, coordinating technical workflows and learnt how to iteratively build upon existing prototypes for continuous improvement. </w:t>
+          <w:rFonts w:ascii="Calibri Light" w:hAnsi="Calibri Light" w:cs="Calibri Light"/>
+          <w:sz w:val="20"/>
+          <w:szCs w:val="20"/>
+        </w:rPr>
+        <w:t xml:space="preserve"> }</w:t>
+      </w:r>
+      <w:proofErr w:type="gramEnd"/>
+      <w:r>
+        <w:rPr>
+          <w:rFonts w:ascii="Calibri Light" w:hAnsi="Calibri Light" w:cs="Calibri Light"/>
+          <w:sz w:val="20"/>
+          <w:szCs w:val="20"/>
+        </w:rPr>
+        <w:t>}</w:t>
+      </w:r>
+      <w:r>
+        <w:rPr>
+          <w:rFonts w:ascii="Calibri Light" w:hAnsi="Calibri Light" w:cs="Calibri Light"/>
+          <w:sz w:val="20"/>
+          <w:szCs w:val="20"/>
+        </w:rPr>
+        <w:t xml:space="preserve"> I see this as a</w:t>
+      </w:r>
+      <w:r>
+        <w:rPr>
+          <w:rFonts w:ascii="Calibri Light" w:hAnsi="Calibri Light" w:cs="Calibri Light"/>
+          <w:sz w:val="20"/>
+          <w:szCs w:val="20"/>
+        </w:rPr>
+        <w:t xml:space="preserve"> wonderful</w:t>
+      </w:r>
+      <w:r>
+        <w:rPr>
+          <w:rFonts w:ascii="Calibri Light" w:hAnsi="Calibri Light" w:cs="Calibri Light"/>
+          <w:sz w:val="20"/>
+          <w:szCs w:val="20"/>
+        </w:rPr>
+        <w:t xml:space="preserve"> learning opportunity where I can bridge the gaps in my laboratory science</w:t>
+      </w:r>
+      <w:r>
+        <w:rPr>
+          <w:rFonts w:ascii="Calibri Light" w:hAnsi="Calibri Light" w:cs="Calibri Light"/>
+          <w:sz w:val="20"/>
+          <w:szCs w:val="20"/>
+        </w:rPr>
+        <w:t xml:space="preserve"> </w:t>
+      </w:r>
+      <w:r>
+        <w:rPr>
+          <w:rFonts w:ascii="Calibri Light" w:hAnsi="Calibri Light" w:cs="Calibri Light"/>
+          <w:sz w:val="20"/>
+          <w:szCs w:val="20"/>
+        </w:rPr>
+        <w:t>background with my software development skills. As a dedicated, hard-working individual who thrives on challenges, I am confident that my problems-solving mindset and commitment to learning will be an asset to your team.</w:t>
       </w:r>
     </w:p>
     <w:p>
@@ -917,192 +1845,52 @@
         <w:jc w:val="both"/>
         <w:rPr>
           <w:rFonts w:ascii="Calibri Light" w:hAnsi="Calibri Light" w:cs="Calibri Light"/>
-          <w:sz w:val="19"/>
-          <w:szCs w:val="19"/>
+          <w:color w:val="111111"/>
+          <w:sz w:val="20"/>
+          <w:szCs w:val="20"/>
         </w:rPr>
       </w:pPr>
       <w:r>
         <w:rPr>
           <w:rFonts w:ascii="Calibri Light" w:hAnsi="Calibri Light" w:cs="Calibri Light"/>
-          <w:sz w:val="19"/>
-          <w:szCs w:val="19"/>
-        </w:rPr>
-        <w:t>Conclusively, I am highly impressed by the</w:t>
-      </w:r>
-      <w:r>
-        <w:rPr>
-          <w:rFonts w:ascii="Calibri Light" w:hAnsi="Calibri Light" w:cs="Calibri Light"/>
-          <w:sz w:val="19"/>
-          <w:szCs w:val="19"/>
-        </w:rPr>
-        <w:t xml:space="preserve"> {{ </w:t>
-      </w:r>
-      <w:proofErr w:type="spellStart"/>
-      <w:r>
-        <w:rPr>
-          <w:rFonts w:ascii="Calibri Light" w:hAnsi="Calibri Light" w:cs="Calibri Light"/>
-          <w:sz w:val="19"/>
-          <w:szCs w:val="19"/>
-        </w:rPr>
-        <w:t>company_name</w:t>
-      </w:r>
-      <w:proofErr w:type="spellEnd"/>
-      <w:r>
-        <w:rPr>
-          <w:rFonts w:ascii="Calibri Light" w:hAnsi="Calibri Light" w:cs="Calibri Light"/>
-          <w:sz w:val="19"/>
-          <w:szCs w:val="19"/>
-        </w:rPr>
-        <w:t xml:space="preserve"> }}</w:t>
-      </w:r>
-      <w:r>
-        <w:rPr>
-          <w:rFonts w:ascii="Calibri Light" w:hAnsi="Calibri Light" w:cs="Calibri Light"/>
-          <w:sz w:val="19"/>
-          <w:szCs w:val="19"/>
-        </w:rPr>
-        <w:t xml:space="preserve">’s contributions </w:t>
-      </w:r>
-      <w:r>
-        <w:rPr>
-          <w:rFonts w:ascii="Calibri Light" w:hAnsi="Calibri Light" w:cs="Calibri Light"/>
-          <w:sz w:val="19"/>
-          <w:szCs w:val="19"/>
-        </w:rPr>
-        <w:t>in the field of bioinformatics</w:t>
-      </w:r>
-      <w:r>
-        <w:rPr>
-          <w:rFonts w:ascii="Calibri Light" w:hAnsi="Calibri Light" w:cs="Calibri Light"/>
-          <w:sz w:val="19"/>
-          <w:szCs w:val="19"/>
-        </w:rPr>
-        <w:t xml:space="preserve">, </w:t>
-      </w:r>
-      <w:r>
-        <w:rPr>
-          <w:rFonts w:ascii="Calibri Light" w:hAnsi="Calibri Light" w:cs="Calibri Light"/>
-          <w:sz w:val="19"/>
-          <w:szCs w:val="19"/>
-        </w:rPr>
-        <w:t xml:space="preserve">especially in your innovative approaches taken </w:t>
-      </w:r>
-      <w:r>
-        <w:rPr>
-          <w:rFonts w:ascii="Calibri Light" w:hAnsi="Calibri Light" w:cs="Calibri Light"/>
-          <w:sz w:val="19"/>
-          <w:szCs w:val="19"/>
-        </w:rPr>
-        <w:t>to</w:t>
-      </w:r>
-      <w:r>
-        <w:rPr>
-          <w:rFonts w:ascii="Calibri Light" w:hAnsi="Calibri Light" w:cs="Calibri Light"/>
-          <w:sz w:val="19"/>
-          <w:szCs w:val="19"/>
-        </w:rPr>
-        <w:t xml:space="preserve"> </w:t>
-      </w:r>
-      <w:r>
-        <w:rPr>
-          <w:rFonts w:ascii="Calibri Light" w:hAnsi="Calibri Light" w:cs="Calibri Light"/>
-          <w:sz w:val="19"/>
-          <w:szCs w:val="19"/>
-        </w:rPr>
-        <w:t xml:space="preserve">{{ </w:t>
-      </w:r>
-      <w:proofErr w:type="spellStart"/>
-      <w:r>
-        <w:rPr>
-          <w:rFonts w:ascii="Calibri Light" w:hAnsi="Calibri Light" w:cs="Calibri Light"/>
-          <w:sz w:val="19"/>
-          <w:szCs w:val="19"/>
-        </w:rPr>
-        <w:t>mission_statement</w:t>
-      </w:r>
-      <w:proofErr w:type="spellEnd"/>
-      <w:r>
-        <w:rPr>
-          <w:rFonts w:ascii="Calibri Light" w:hAnsi="Calibri Light" w:cs="Calibri Light"/>
-          <w:sz w:val="19"/>
-          <w:szCs w:val="19"/>
-        </w:rPr>
-        <w:t xml:space="preserve"> }}</w:t>
-      </w:r>
-      <w:r>
-        <w:rPr>
-          <w:rFonts w:ascii="Calibri Light" w:hAnsi="Calibri Light" w:cs="Calibri Light"/>
-          <w:sz w:val="19"/>
-          <w:szCs w:val="19"/>
-        </w:rPr>
-        <w:t xml:space="preserve"> I see this as a</w:t>
-      </w:r>
-      <w:r>
-        <w:rPr>
-          <w:rFonts w:ascii="Calibri Light" w:hAnsi="Calibri Light" w:cs="Calibri Light"/>
-          <w:sz w:val="19"/>
-          <w:szCs w:val="19"/>
-        </w:rPr>
-        <w:t xml:space="preserve"> wonderful</w:t>
-      </w:r>
-      <w:r>
-        <w:rPr>
-          <w:rFonts w:ascii="Calibri Light" w:hAnsi="Calibri Light" w:cs="Calibri Light"/>
-          <w:sz w:val="19"/>
-          <w:szCs w:val="19"/>
-        </w:rPr>
-        <w:t xml:space="preserve"> learning opportunity where I can bridge the gaps in my laboratory science</w:t>
-      </w:r>
-      <w:r>
-        <w:rPr>
-          <w:rFonts w:ascii="Calibri Light" w:hAnsi="Calibri Light" w:cs="Calibri Light"/>
-          <w:sz w:val="19"/>
-          <w:szCs w:val="19"/>
-        </w:rPr>
-        <w:t xml:space="preserve"> </w:t>
-      </w:r>
-      <w:r>
-        <w:rPr>
-          <w:rFonts w:ascii="Calibri Light" w:hAnsi="Calibri Light" w:cs="Calibri Light"/>
-          <w:sz w:val="19"/>
-          <w:szCs w:val="19"/>
-        </w:rPr>
-        <w:t>background with my software development skills. As a dedicated, hard-working individual who thrives on challenges, I am confident that my problems-solving mindset and commitment to learning will be an asset to your team.</w:t>
-      </w:r>
-    </w:p>
-    <w:p>
-      <w:pPr>
-        <w:jc w:val="both"/>
+          <w:sz w:val="20"/>
+          <w:szCs w:val="20"/>
+        </w:rPr>
+        <w:t xml:space="preserve">Thank you for your consideration of my application. If you have any further questions, please feel free to contact me. </w:t>
+      </w:r>
+      <w:r>
         <w:rPr>
           <w:rFonts w:ascii="Calibri Light" w:hAnsi="Calibri Light" w:cs="Calibri Light"/>
           <w:color w:val="111111"/>
-          <w:sz w:val="19"/>
-          <w:szCs w:val="19"/>
-        </w:rPr>
-      </w:pPr>
-      <w:r>
-        <w:rPr>
-          <w:rFonts w:ascii="Calibri Light" w:hAnsi="Calibri Light" w:cs="Calibri Light"/>
-          <w:sz w:val="19"/>
-          <w:szCs w:val="19"/>
-        </w:rPr>
-        <w:t xml:space="preserve">Thank you for your consideration of my application. If you have any further questions, please feel free to contact me. </w:t>
+          <w:sz w:val="20"/>
+          <w:szCs w:val="20"/>
+        </w:rPr>
+        <w:t xml:space="preserve">I look forward to the possibility of discussing on how </w:t>
       </w:r>
       <w:r>
         <w:rPr>
           <w:rFonts w:ascii="Calibri Light" w:hAnsi="Calibri Light" w:cs="Calibri Light"/>
           <w:color w:val="111111"/>
-          <w:sz w:val="19"/>
-          <w:szCs w:val="19"/>
-        </w:rPr>
-        <w:t>I look forward to the possibility of discussing on how my experiences and skillset can support</w:t>
+          <w:sz w:val="20"/>
+          <w:szCs w:val="20"/>
+        </w:rPr>
+        <w:t>I</w:t>
       </w:r>
       <w:r>
         <w:rPr>
           <w:rFonts w:ascii="Calibri Light" w:hAnsi="Calibri Light" w:cs="Calibri Light"/>
           <w:color w:val="111111"/>
-          <w:sz w:val="19"/>
-          <w:szCs w:val="19"/>
+          <w:sz w:val="20"/>
+          <w:szCs w:val="20"/>
+        </w:rPr>
+        <w:t xml:space="preserve"> can support</w:t>
+      </w:r>
+      <w:r>
+        <w:rPr>
+          <w:rFonts w:ascii="Calibri Light" w:hAnsi="Calibri Light" w:cs="Calibri Light"/>
+          <w:color w:val="111111"/>
+          <w:sz w:val="20"/>
+          <w:szCs w:val="20"/>
         </w:rPr>
         <w:t xml:space="preserve"> your objectives</w:t>
       </w:r>
@@ -1110,8 +1898,8 @@
         <w:rPr>
           <w:rFonts w:ascii="Calibri Light" w:hAnsi="Calibri Light" w:cs="Calibri Light"/>
           <w:color w:val="111111"/>
-          <w:sz w:val="19"/>
-          <w:szCs w:val="19"/>
+          <w:sz w:val="20"/>
+          <w:szCs w:val="20"/>
         </w:rPr>
         <w:t>. I look forward to hearing back from you.</w:t>
       </w:r>
@@ -1130,16 +1918,16 @@
         <w:rPr>
           <w:rFonts w:ascii="Calibri Light" w:hAnsi="Calibri Light" w:cs="Calibri Light"/>
           <w:color w:val="111111"/>
-          <w:sz w:val="19"/>
-          <w:szCs w:val="19"/>
+          <w:sz w:val="20"/>
+          <w:szCs w:val="20"/>
         </w:rPr>
       </w:pPr>
       <w:r>
         <w:rPr>
           <w:rFonts w:ascii="Calibri Light" w:hAnsi="Calibri Light" w:cs="Calibri Light"/>
           <w:color w:val="111111"/>
-          <w:sz w:val="19"/>
-          <w:szCs w:val="19"/>
+          <w:sz w:val="20"/>
+          <w:szCs w:val="20"/>
         </w:rPr>
         <w:t>Best regards,</w:t>
       </w:r>
@@ -1158,16 +1946,16 @@
         <w:rPr>
           <w:rFonts w:asciiTheme="majorHAnsi" w:hAnsiTheme="majorHAnsi" w:cstheme="majorHAnsi"/>
           <w:color w:val="111111"/>
-          <w:sz w:val="19"/>
-          <w:szCs w:val="19"/>
+          <w:sz w:val="20"/>
+          <w:szCs w:val="20"/>
         </w:rPr>
       </w:pPr>
       <w:r>
         <w:rPr>
           <w:rFonts w:ascii="Calibri Light" w:hAnsi="Calibri Light" w:cs="Calibri Light"/>
           <w:color w:val="111111"/>
-          <w:sz w:val="19"/>
-          <w:szCs w:val="19"/>
+          <w:sz w:val="20"/>
+          <w:szCs w:val="20"/>
         </w:rPr>
         <w:t>Sam Lui</w:t>
       </w:r>
@@ -1175,14 +1963,14 @@
         <w:rPr>
           <w:rFonts w:asciiTheme="majorHAnsi" w:hAnsiTheme="majorHAnsi" w:cstheme="majorHAnsi"/>
           <w:color w:val="111111"/>
-          <w:sz w:val="19"/>
-          <w:szCs w:val="19"/>
+          <w:sz w:val="20"/>
+          <w:szCs w:val="20"/>
         </w:rPr>
         <w:t xml:space="preserve">  </w:t>
       </w:r>
     </w:p>
     <w:sectPr>
-      <w:headerReference w:type="default" r:id="rId7"/>
+      <w:headerReference w:type="default" r:id="rId11"/>
       <w:pgSz w:w="12240" w:h="15840"/>
       <w:pgMar w:top="720" w:right="720" w:bottom="720" w:left="720" w:header="708" w:footer="708" w:gutter="0"/>
       <w:cols w:space="708"/>
@@ -1190,6 +1978,45 @@
     </w:sectPr>
   </w:body>
 </w:document>
+</file>
+
+<file path=word/comments.xml><?xml version="1.0" encoding="utf-8"?>
+<w:comments xmlns:wpc="http://schemas.microsoft.com/office/word/2010/wordprocessingCanvas" xmlns:cx="http://schemas.microsoft.com/office/drawing/2014/chartex" xmlns:cx1="http://schemas.microsoft.com/office/drawing/2015/9/8/chartex" xmlns:cx2="http://schemas.microsoft.com/office/drawing/2015/10/21/chartex" xmlns:cx3="http://schemas.microsoft.com/office/drawing/2016/5/9/chartex" xmlns:cx4="http://schemas.microsoft.com/office/drawing/2016/5/10/chartex" xmlns:cx5="http://schemas.microsoft.com/office/drawing/2016/5/11/chartex" xmlns:cx6="http://schemas.microsoft.com/office/drawing/2016/5/12/chartex" xmlns:cx7="http://schemas.microsoft.com/office/drawing/2016/5/13/chartex" xmlns:cx8="http://schemas.microsoft.com/office/drawing/2016/5/14/chartex" xmlns:mc="http://schemas.openxmlformats.org/markup-compatibility/2006" xmlns:aink="http://schemas.microsoft.com/office/drawing/2016/ink" xmlns:am3d="http://schemas.microsoft.com/office/drawing/2017/model3d" xmlns:o="urn:schemas-microsoft-com:office:office" xmlns:oel="http://schemas.microsoft.com/office/2019/extlst" xmlns:r="http://schemas.openxmlformats.org/officeDocument/2006/relationships" xmlns:m="http://schemas.openxmlformats.org/officeDocument/2006/math" xmlns:v="urn:schemas-microsoft-com:vml" xmlns:wp14="http://schemas.microsoft.com/office/word/2010/wordprocessingDrawing" xmlns:wp="http://schemas.openxmlformats.org/drawingml/2006/wordprocessingDrawing" xmlns:w10="urn:schemas-microsoft-com:office:word" xmlns:w="http://schemas.openxmlformats.org/wordprocessingml/2006/main" xmlns:w14="http://schemas.microsoft.com/office/word/2010/wordml" xmlns:w15="http://schemas.microsoft.com/office/word/2012/wordml" xmlns:w16cex="http://schemas.microsoft.com/office/word/2018/wordml/cex" xmlns:w16cid="http://schemas.microsoft.com/office/word/2016/wordml/cid" xmlns:w16="http://schemas.microsoft.com/office/word/2018/wordml" xmlns:w16du="http://schemas.microsoft.com/office/word/2023/wordml/word16du" xmlns:w16sdtdh="http://schemas.microsoft.com/office/word/2020/wordml/sdtdatahash" xmlns:w16sdtfl="http://schemas.microsoft.com/office/word/2024/wordml/sdtformatlock" xmlns:w16se="http://schemas.microsoft.com/office/word/2015/wordml/symex" xmlns:wpg="http://schemas.microsoft.com/office/word/2010/wordprocessingGroup" xmlns:wpi="http://schemas.microsoft.com/office/word/2010/wordprocessingInk" xmlns:wne="http://schemas.microsoft.com/office/word/2006/wordml" xmlns:wps="http://schemas.microsoft.com/office/word/2010/wordprocessingShape" mc:Ignorable="w14 w15 w16se w16cid w16 w16cex w16sdtdh w16sdtfl w16du wp14">
+  <w:comment w:id="1" w:author="Sam Lui" w:date="2025-11-30T13:53:00Z" w:initials="SL">
+    <w:p>
+      <w:pPr>
+        <w:pStyle w:val="CommentText"/>
+      </w:pPr>
+      <w:r>
+        <w:rPr>
+          <w:rStyle w:val="CommentReference"/>
+        </w:rPr>
+        <w:annotationRef/>
+      </w:r>
+      <w:r>
+        <w:t>Adjust this once CIHI co-op starts.</w:t>
+      </w:r>
+    </w:p>
+  </w:comment>
+</w:comments>
+</file>
+
+<file path=word/commentsExtended.xml><?xml version="1.0" encoding="utf-8"?>
+<w15:commentsEx xmlns:wpc="http://schemas.microsoft.com/office/word/2010/wordprocessingCanvas" xmlns:cx="http://schemas.microsoft.com/office/drawing/2014/chartex" xmlns:cx1="http://schemas.microsoft.com/office/drawing/2015/9/8/chartex" xmlns:cx2="http://schemas.microsoft.com/office/drawing/2015/10/21/chartex" xmlns:cx3="http://schemas.microsoft.com/office/drawing/2016/5/9/chartex" xmlns:cx4="http://schemas.microsoft.com/office/drawing/2016/5/10/chartex" xmlns:cx5="http://schemas.microsoft.com/office/drawing/2016/5/11/chartex" xmlns:cx6="http://schemas.microsoft.com/office/drawing/2016/5/12/chartex" xmlns:cx7="http://schemas.microsoft.com/office/drawing/2016/5/13/chartex" xmlns:cx8="http://schemas.microsoft.com/office/drawing/2016/5/14/chartex" xmlns:mc="http://schemas.openxmlformats.org/markup-compatibility/2006" xmlns:aink="http://schemas.microsoft.com/office/drawing/2016/ink" xmlns:am3d="http://schemas.microsoft.com/office/drawing/2017/model3d" xmlns:o="urn:schemas-microsoft-com:office:office" xmlns:oel="http://schemas.microsoft.com/office/2019/extlst" xmlns:r="http://schemas.openxmlformats.org/officeDocument/2006/relationships" xmlns:m="http://schemas.openxmlformats.org/officeDocument/2006/math" xmlns:v="urn:schemas-microsoft-com:vml" xmlns:wp14="http://schemas.microsoft.com/office/word/2010/wordprocessingDrawing" xmlns:wp="http://schemas.openxmlformats.org/drawingml/2006/wordprocessingDrawing" xmlns:w10="urn:schemas-microsoft-com:office:word" xmlns:w="http://schemas.openxmlformats.org/wordprocessingml/2006/main" xmlns:w14="http://schemas.microsoft.com/office/word/2010/wordml" xmlns:w15="http://schemas.microsoft.com/office/word/2012/wordml" xmlns:w16cex="http://schemas.microsoft.com/office/word/2018/wordml/cex" xmlns:w16cid="http://schemas.microsoft.com/office/word/2016/wordml/cid" xmlns:w16="http://schemas.microsoft.com/office/word/2018/wordml" xmlns:w16du="http://schemas.microsoft.com/office/word/2023/wordml/word16du" xmlns:w16sdtdh="http://schemas.microsoft.com/office/word/2020/wordml/sdtdatahash" xmlns:w16sdtfl="http://schemas.microsoft.com/office/word/2024/wordml/sdtformatlock" xmlns:w16se="http://schemas.microsoft.com/office/word/2015/wordml/symex" xmlns:wpg="http://schemas.microsoft.com/office/word/2010/wordprocessingGroup" xmlns:wpi="http://schemas.microsoft.com/office/word/2010/wordprocessingInk" xmlns:wne="http://schemas.microsoft.com/office/word/2006/wordml" xmlns:wps="http://schemas.microsoft.com/office/word/2010/wordprocessingShape" mc:Ignorable="w14 w15 w16se w16cid w16 w16cex w16sdtdh w16sdtfl w16du wp14">
+  <w15:commentEx w15:paraId="7B3D3F58" w15:done="0"/>
+</w15:commentsEx>
+</file>
+
+<file path=word/commentsExtensible.xml><?xml version="1.0" encoding="utf-8"?>
+<w16cex:commentsExtensible xmlns:wpc="http://schemas.microsoft.com/office/word/2010/wordprocessingCanvas" xmlns:cx="http://schemas.microsoft.com/office/drawing/2014/chartex" xmlns:cx1="http://schemas.microsoft.com/office/drawing/2015/9/8/chartex" xmlns:cx2="http://schemas.microsoft.com/office/drawing/2015/10/21/chartex" xmlns:cx3="http://schemas.microsoft.com/office/drawing/2016/5/9/chartex" xmlns:cx4="http://schemas.microsoft.com/office/drawing/2016/5/10/chartex" xmlns:cx5="http://schemas.microsoft.com/office/drawing/2016/5/11/chartex" xmlns:cx6="http://schemas.microsoft.com/office/drawing/2016/5/12/chartex" xmlns:cx7="http://schemas.microsoft.com/office/drawing/2016/5/13/chartex" xmlns:cx8="http://schemas.microsoft.com/office/drawing/2016/5/14/chartex" xmlns:cr="http://schemas.microsoft.com/office/comments/2020/reactions" xmlns:mc="http://schemas.openxmlformats.org/markup-compatibility/2006" xmlns:aink="http://schemas.microsoft.com/office/drawing/2016/ink" xmlns:am3d="http://schemas.microsoft.com/office/drawing/2017/model3d" xmlns:o="urn:schemas-microsoft-com:office:office" xmlns:oel="http://schemas.microsoft.com/office/2019/extlst" xmlns:r="http://schemas.openxmlformats.org/officeDocument/2006/relationships" xmlns:m="http://schemas.openxmlformats.org/officeDocument/2006/math" xmlns:v="urn:schemas-microsoft-com:vml" xmlns:wp14="http://schemas.microsoft.com/office/word/2010/wordprocessingDrawing" xmlns:wp="http://schemas.openxmlformats.org/drawingml/2006/wordprocessingDrawing" xmlns:w10="urn:schemas-microsoft-com:office:word" xmlns:w="http://schemas.openxmlformats.org/wordprocessingml/2006/main" xmlns:w14="http://schemas.microsoft.com/office/word/2010/wordml" xmlns:w15="http://schemas.microsoft.com/office/word/2012/wordml" xmlns:w16cex="http://schemas.microsoft.com/office/word/2018/wordml/cex" xmlns:w16cid="http://schemas.microsoft.com/office/word/2016/wordml/cid" xmlns:w16="http://schemas.microsoft.com/office/word/2018/wordml" xmlns:w16du="http://schemas.microsoft.com/office/word/2023/wordml/word16du" xmlns:w16sdtdh="http://schemas.microsoft.com/office/word/2020/wordml/sdtdatahash" xmlns:w16sdtfl="http://schemas.microsoft.com/office/word/2024/wordml/sdtformatlock" xmlns:w16se="http://schemas.microsoft.com/office/word/2015/wordml/symex" xmlns:wpg="http://schemas.microsoft.com/office/word/2010/wordprocessingGroup" xmlns:wpi="http://schemas.microsoft.com/office/word/2010/wordprocessingInk" xmlns:wne="http://schemas.microsoft.com/office/word/2006/wordml" xmlns:wps="http://schemas.microsoft.com/office/word/2010/wordprocessingShape" mc:Ignorable="w14 w15 w16se w16cid w16 w16cex w16sdtdh w16sdtfl cr w16du wp14">
+  <w16cex:commentExtensible w16cex:durableId="511356A5" w16cex:dateUtc="2025-11-30T21:53:00Z"/>
+</w16cex:commentsExtensible>
+</file>
+
+<file path=word/commentsIds.xml><?xml version="1.0" encoding="utf-8"?>
+<w16cid:commentsIds xmlns:wpc="http://schemas.microsoft.com/office/word/2010/wordprocessingCanvas" xmlns:cx="http://schemas.microsoft.com/office/drawing/2014/chartex" xmlns:cx1="http://schemas.microsoft.com/office/drawing/2015/9/8/chartex" xmlns:cx2="http://schemas.microsoft.com/office/drawing/2015/10/21/chartex" xmlns:cx3="http://schemas.microsoft.com/office/drawing/2016/5/9/chartex" xmlns:cx4="http://schemas.microsoft.com/office/drawing/2016/5/10/chartex" xmlns:cx5="http://schemas.microsoft.com/office/drawing/2016/5/11/chartex" xmlns:cx6="http://schemas.microsoft.com/office/drawing/2016/5/12/chartex" xmlns:cx7="http://schemas.microsoft.com/office/drawing/2016/5/13/chartex" xmlns:cx8="http://schemas.microsoft.com/office/drawing/2016/5/14/chartex" xmlns:mc="http://schemas.openxmlformats.org/markup-compatibility/2006" xmlns:aink="http://schemas.microsoft.com/office/drawing/2016/ink" xmlns:am3d="http://schemas.microsoft.com/office/drawing/2017/model3d" xmlns:o="urn:schemas-microsoft-com:office:office" xmlns:oel="http://schemas.microsoft.com/office/2019/extlst" xmlns:r="http://schemas.openxmlformats.org/officeDocument/2006/relationships" xmlns:m="http://schemas.openxmlformats.org/officeDocument/2006/math" xmlns:v="urn:schemas-microsoft-com:vml" xmlns:wp14="http://schemas.microsoft.com/office/word/2010/wordprocessingDrawing" xmlns:wp="http://schemas.openxmlformats.org/drawingml/2006/wordprocessingDrawing" xmlns:w10="urn:schemas-microsoft-com:office:word" xmlns:w="http://schemas.openxmlformats.org/wordprocessingml/2006/main" xmlns:w14="http://schemas.microsoft.com/office/word/2010/wordml" xmlns:w15="http://schemas.microsoft.com/office/word/2012/wordml" xmlns:w16cex="http://schemas.microsoft.com/office/word/2018/wordml/cex" xmlns:w16cid="http://schemas.microsoft.com/office/word/2016/wordml/cid" xmlns:w16="http://schemas.microsoft.com/office/word/2018/wordml" xmlns:w16du="http://schemas.microsoft.com/office/word/2023/wordml/word16du" xmlns:w16sdtdh="http://schemas.microsoft.com/office/word/2020/wordml/sdtdatahash" xmlns:w16sdtfl="http://schemas.microsoft.com/office/word/2024/wordml/sdtformatlock" xmlns:w16se="http://schemas.microsoft.com/office/word/2015/wordml/symex" xmlns:wpg="http://schemas.microsoft.com/office/word/2010/wordprocessingGroup" xmlns:wpi="http://schemas.microsoft.com/office/word/2010/wordprocessingInk" xmlns:wne="http://schemas.microsoft.com/office/word/2006/wordml" xmlns:wps="http://schemas.microsoft.com/office/word/2010/wordprocessingShape" mc:Ignorable="w14 w15 w16se w16cid w16 w16cex w16sdtdh w16sdtfl w16du wp14">
+  <w16cid:commentId w16cid:paraId="7B3D3F58" w16cid:durableId="511356A5"/>
+</w16cid:commentsIds>
 </file>
 
 <file path=word/endnotes.xml><?xml version="1.0" encoding="utf-8"?>
@@ -1294,6 +2121,10 @@
         <w14:ligatures w14:val="none"/>
       </w:rPr>
     </w:pPr>
+    <w:bookmarkStart w:id="2" w:name="_Hlk215400839"/>
+    <w:bookmarkStart w:id="3" w:name="_Hlk215400840"/>
+    <w:bookmarkStart w:id="4" w:name="_Hlk215403241"/>
+    <w:bookmarkStart w:id="5" w:name="_Hlk215403242"/>
     <w:r>
       <w:rPr>
         <w:rFonts w:ascii="Calibri Light" w:eastAsia="Calibri" w:hAnsi="Calibri Light" w:cs="Calibri Light"/>
@@ -1305,22 +2136,21 @@
         <w:lang w:val="en-AU" w:eastAsia="en-US"/>
         <w14:ligatures w14:val="none"/>
       </w:rPr>
-      <w:t xml:space="preserve">(604)-729-8023 | </w:t>
+      <w:t xml:space="preserve">sam_lui@hotmail.ca | https://www.linkedin.com/in/saml1009/ | </w:t>
     </w:r>
     <w:hyperlink r:id="rId1" w:history="1">
       <w:r>
         <w:rPr>
+          <w:rStyle w:val="Hyperlink"/>
           <w:rFonts w:ascii="Calibri Light" w:eastAsia="Calibri" w:hAnsi="Calibri Light" w:cs="Calibri Light"/>
-          <w:color w:val="0563C1"/>
           <w:spacing w:val="4"/>
           <w:kern w:val="0"/>
           <w:sz w:val="20"/>
           <w:szCs w:val="20"/>
-          <w:u w:val="single"/>
           <w:lang w:val="en-AU" w:eastAsia="en-US"/>
           <w14:ligatures w14:val="none"/>
         </w:rPr>
-        <w:t>sam_lui@hotmail.ca</w:t>
+        <w:t>https://github.com/samlui1009</w:t>
       </w:r>
     </w:hyperlink>
     <w:r>
@@ -1334,39 +2164,22 @@
         <w:lang w:val="en-AU" w:eastAsia="en-US"/>
         <w14:ligatures w14:val="none"/>
       </w:rPr>
-      <w:t xml:space="preserve"> | </w:t>
+      <w:t xml:space="preserve"> | https://samlui.netlify.app/</w:t>
     </w:r>
-    <w:hyperlink r:id="rId2" w:history="1">
-      <w:r>
-        <w:rPr>
-          <w:rFonts w:ascii="Calibri Light" w:eastAsia="Calibri" w:hAnsi="Calibri Light" w:cs="Calibri Light"/>
-          <w:color w:val="0563C1"/>
-          <w:spacing w:val="4"/>
-          <w:kern w:val="0"/>
-          <w:sz w:val="20"/>
-          <w:szCs w:val="20"/>
-          <w:u w:val="single"/>
-          <w:lang w:val="en-AU" w:eastAsia="en-US"/>
-          <w14:ligatures w14:val="none"/>
-        </w:rPr>
-        <w:t>https://www.linkedin.com/in/sam-lui-6250a787/</w:t>
-      </w:r>
-    </w:hyperlink>
-    <w:r>
-      <w:rPr>
-        <w:rFonts w:ascii="Calibri Light" w:eastAsia="Calibri" w:hAnsi="Calibri Light" w:cs="Calibri Light"/>
-        <w:color w:val="323E4F"/>
-        <w:spacing w:val="4"/>
-        <w:kern w:val="0"/>
-        <w:sz w:val="20"/>
-        <w:szCs w:val="20"/>
-        <w:lang w:val="en-AU" w:eastAsia="en-US"/>
-        <w14:ligatures w14:val="none"/>
-      </w:rPr>
-      <w:t xml:space="preserve"> | https://github.com/samlui1009</w:t>
-    </w:r>
+    <w:bookmarkEnd w:id="2"/>
+    <w:bookmarkEnd w:id="3"/>
+    <w:bookmarkEnd w:id="4"/>
+    <w:bookmarkEnd w:id="5"/>
   </w:p>
 </w:hdr>
+</file>
+
+<file path=word/people.xml><?xml version="1.0" encoding="utf-8"?>
+<w15:people xmlns:wpc="http://schemas.microsoft.com/office/word/2010/wordprocessingCanvas" xmlns:cx="http://schemas.microsoft.com/office/drawing/2014/chartex" xmlns:cx1="http://schemas.microsoft.com/office/drawing/2015/9/8/chartex" xmlns:cx2="http://schemas.microsoft.com/office/drawing/2015/10/21/chartex" xmlns:cx3="http://schemas.microsoft.com/office/drawing/2016/5/9/chartex" xmlns:cx4="http://schemas.microsoft.com/office/drawing/2016/5/10/chartex" xmlns:cx5="http://schemas.microsoft.com/office/drawing/2016/5/11/chartex" xmlns:cx6="http://schemas.microsoft.com/office/drawing/2016/5/12/chartex" xmlns:cx7="http://schemas.microsoft.com/office/drawing/2016/5/13/chartex" xmlns:cx8="http://schemas.microsoft.com/office/drawing/2016/5/14/chartex" xmlns:mc="http://schemas.openxmlformats.org/markup-compatibility/2006" xmlns:aink="http://schemas.microsoft.com/office/drawing/2016/ink" xmlns:am3d="http://schemas.microsoft.com/office/drawing/2017/model3d" xmlns:o="urn:schemas-microsoft-com:office:office" xmlns:oel="http://schemas.microsoft.com/office/2019/extlst" xmlns:r="http://schemas.openxmlformats.org/officeDocument/2006/relationships" xmlns:m="http://schemas.openxmlformats.org/officeDocument/2006/math" xmlns:v="urn:schemas-microsoft-com:vml" xmlns:wp14="http://schemas.microsoft.com/office/word/2010/wordprocessingDrawing" xmlns:wp="http://schemas.openxmlformats.org/drawingml/2006/wordprocessingDrawing" xmlns:w10="urn:schemas-microsoft-com:office:word" xmlns:w="http://schemas.openxmlformats.org/wordprocessingml/2006/main" xmlns:w14="http://schemas.microsoft.com/office/word/2010/wordml" xmlns:w15="http://schemas.microsoft.com/office/word/2012/wordml" xmlns:w16cex="http://schemas.microsoft.com/office/word/2018/wordml/cex" xmlns:w16cid="http://schemas.microsoft.com/office/word/2016/wordml/cid" xmlns:w16="http://schemas.microsoft.com/office/word/2018/wordml" xmlns:w16du="http://schemas.microsoft.com/office/word/2023/wordml/word16du" xmlns:w16sdtdh="http://schemas.microsoft.com/office/word/2020/wordml/sdtdatahash" xmlns:w16sdtfl="http://schemas.microsoft.com/office/word/2024/wordml/sdtformatlock" xmlns:w16se="http://schemas.microsoft.com/office/word/2015/wordml/symex" xmlns:wpg="http://schemas.microsoft.com/office/word/2010/wordprocessingGroup" xmlns:wpi="http://schemas.microsoft.com/office/word/2010/wordprocessingInk" xmlns:wne="http://schemas.microsoft.com/office/word/2006/wordml" xmlns:wps="http://schemas.microsoft.com/office/word/2010/wordprocessingShape" mc:Ignorable="w14 w15 w16se w16cid w16 w16cex w16sdtdh w16sdtfl w16du wp14">
+  <w15:person w15:author="Sam Lui">
+    <w15:presenceInfo w15:providerId="Windows Live" w15:userId="8f887ab463d8bf2b"/>
+  </w15:person>
+</w15:people>
 </file>
 
 <file path=word/styles.xml><?xml version="1.0" encoding="utf-8"?>
@@ -1972,7 +2785,6 @@
   <w:style w:type="character" w:default="1" w:styleId="DefaultParagraphFont">
     <w:name w:val="Default Paragraph Font"/>
     <w:uiPriority w:val="1"/>
-    <w:semiHidden/>
     <w:unhideWhenUsed/>
   </w:style>
   <w:style w:type="table" w:default="1" w:styleId="TableNormal">
@@ -2329,6 +3141,95 @@
     <w:link w:val="Footer"/>
     <w:uiPriority w:val="99"/>
     <w:rsid w:val="002B21EC"/>
+  </w:style>
+  <w:style w:type="character" w:styleId="Hyperlink">
+    <w:name w:val="Hyperlink"/>
+    <w:basedOn w:val="DefaultParagraphFont"/>
+    <w:uiPriority w:val="99"/>
+    <w:unhideWhenUsed/>
+    <w:rsid w:val="003512F9"/>
+    <w:rPr>
+      <w:color w:val="467886" w:themeColor="hyperlink"/>
+      <w:u w:val="single"/>
+    </w:rPr>
+  </w:style>
+  <w:style w:type="character" w:styleId="UnresolvedMention">
+    <w:name w:val="Unresolved Mention"/>
+    <w:basedOn w:val="DefaultParagraphFont"/>
+    <w:uiPriority w:val="99"/>
+    <w:semiHidden/>
+    <w:unhideWhenUsed/>
+    <w:rsid w:val="003512F9"/>
+    <w:rPr>
+      <w:color w:val="605E5C"/>
+      <w:shd w:val="clear" w:color="auto" w:fill="E1DFDD"/>
+    </w:rPr>
+  </w:style>
+  <w:style w:type="character" w:styleId="CommentReference">
+    <w:name w:val="annotation reference"/>
+    <w:basedOn w:val="DefaultParagraphFont"/>
+    <w:uiPriority w:val="99"/>
+    <w:semiHidden/>
+    <w:unhideWhenUsed/>
+    <w:rsid w:val="006642DB"/>
+    <w:rPr>
+      <w:sz w:val="16"/>
+      <w:szCs w:val="16"/>
+    </w:rPr>
+  </w:style>
+  <w:style w:type="paragraph" w:styleId="CommentText">
+    <w:name w:val="annotation text"/>
+    <w:basedOn w:val="Normal"/>
+    <w:link w:val="CommentTextChar"/>
+    <w:uiPriority w:val="99"/>
+    <w:unhideWhenUsed/>
+    <w:rsid w:val="006642DB"/>
+    <w:pPr>
+      <w:spacing w:line="240" w:lineRule="auto"/>
+    </w:pPr>
+    <w:rPr>
+      <w:sz w:val="20"/>
+      <w:szCs w:val="20"/>
+    </w:rPr>
+  </w:style>
+  <w:style w:type="character" w:customStyle="1" w:styleId="CommentTextChar">
+    <w:name w:val="Comment Text Char"/>
+    <w:basedOn w:val="DefaultParagraphFont"/>
+    <w:link w:val="CommentText"/>
+    <w:uiPriority w:val="99"/>
+    <w:rsid w:val="006642DB"/>
+    <w:rPr>
+      <w:sz w:val="20"/>
+      <w:szCs w:val="20"/>
+    </w:rPr>
+  </w:style>
+  <w:style w:type="paragraph" w:styleId="CommentSubject">
+    <w:name w:val="annotation subject"/>
+    <w:basedOn w:val="CommentText"/>
+    <w:next w:val="CommentText"/>
+    <w:link w:val="CommentSubjectChar"/>
+    <w:uiPriority w:val="99"/>
+    <w:semiHidden/>
+    <w:unhideWhenUsed/>
+    <w:rsid w:val="006642DB"/>
+    <w:rPr>
+      <w:b/>
+      <w:bCs/>
+    </w:rPr>
+  </w:style>
+  <w:style w:type="character" w:customStyle="1" w:styleId="CommentSubjectChar">
+    <w:name w:val="Comment Subject Char"/>
+    <w:basedOn w:val="CommentTextChar"/>
+    <w:link w:val="CommentSubject"/>
+    <w:uiPriority w:val="99"/>
+    <w:semiHidden/>
+    <w:rsid w:val="006642DB"/>
+    <w:rPr>
+      <w:b/>
+      <w:bCs/>
+      <w:sz w:val="20"/>
+      <w:szCs w:val="20"/>
+    </w:rPr>
   </w:style>
 </w:styles>
 </file>

</xml_diff>